<commit_message>
Polish chart labels and inline repo-path styling
</commit_message>
<xml_diff>
--- a/final/report.docx
+++ b/final/report.docx
@@ -1187,10 +1187,10 @@
       </w:r>
       <w:r>
         <w:rPr>
-          <w:rStyle w:val="FootnoteReference"/>
-          <w:rFonts w:cs="Inter" w:ascii="Inter" w:hAnsi="Inter"/>
+          <w:rFonts w:ascii="Inter" w:hAnsi="Inter" w:cs="Inter"/>
           <w:b/>
           <w:color w:val="3092B1"/>
+          <w:position w:val="8"/>
           <w:sz w:val="18"/>
           <w:szCs w:val="18"/>
           <w:vertAlign w:val="superscript"/>
@@ -1219,10 +1219,10 @@
       </w:r>
       <w:r>
         <w:rPr>
-          <w:rStyle w:val="FootnoteReference"/>
-          <w:rFonts w:cs="Inter" w:ascii="Inter" w:hAnsi="Inter"/>
+          <w:rFonts w:ascii="Inter" w:hAnsi="Inter" w:cs="Inter"/>
           <w:b/>
           <w:color w:val="3092B1"/>
+          <w:position w:val="8"/>
           <w:sz w:val="18"/>
           <w:szCs w:val="18"/>
           <w:vertAlign w:val="superscript"/>
@@ -1235,10 +1235,10 @@
       </w:r>
       <w:r>
         <w:rPr>
-          <w:rStyle w:val="FootnoteReference"/>
-          <w:rFonts w:cs="Inter" w:ascii="Inter" w:hAnsi="Inter"/>
+          <w:rFonts w:ascii="Inter" w:hAnsi="Inter" w:cs="Inter"/>
           <w:b/>
           <w:color w:val="3092B1"/>
+          <w:position w:val="8"/>
           <w:sz w:val="18"/>
           <w:szCs w:val="18"/>
           <w:vertAlign w:val="superscript"/>
@@ -1268,10 +1268,10 @@
       </w:r>
       <w:r>
         <w:rPr>
-          <w:rStyle w:val="FootnoteReference"/>
-          <w:rFonts w:cs="Inter" w:ascii="Inter" w:hAnsi="Inter"/>
+          <w:rFonts w:ascii="Inter" w:hAnsi="Inter" w:cs="Inter"/>
           <w:b/>
           <w:color w:val="3092B1"/>
+          <w:position w:val="8"/>
           <w:sz w:val="18"/>
           <w:szCs w:val="18"/>
           <w:vertAlign w:val="superscript"/>
@@ -1284,10 +1284,10 @@
       </w:r>
       <w:r>
         <w:rPr>
-          <w:rStyle w:val="FootnoteReference"/>
-          <w:rFonts w:cs="Inter" w:ascii="Inter" w:hAnsi="Inter"/>
+          <w:rFonts w:ascii="Inter" w:hAnsi="Inter" w:cs="Inter"/>
           <w:b/>
           <w:color w:val="3092B1"/>
+          <w:position w:val="8"/>
           <w:sz w:val="18"/>
           <w:szCs w:val="18"/>
           <w:vertAlign w:val="superscript"/>
@@ -1295,36 +1295,28 @@
         <w:footnoteReference w:id="6"/>
       </w:r>
       <w:r>
-        <w:rPr/>
-        <w:t xml:space="preserve">, </w:t>
-      </w:r>
-      <w:r>
-        <w:rPr>
-          <w:rStyle w:val="FootnoteReference"/>
-          <w:rFonts w:cs="Inter" w:ascii="Inter" w:hAnsi="Inter"/>
+        <w:rPr>
+          <w:rFonts w:ascii="Inter" w:hAnsi="Inter" w:cs="Inter"/>
           <w:b/>
           <w:color w:val="3092B1"/>
+          <w:position w:val="8"/>
           <w:sz w:val="18"/>
           <w:szCs w:val="18"/>
           <w:vertAlign w:val="superscript"/>
         </w:rPr>
-        <w:footnoteReference w:id="7"/>
-      </w:r>
-      <w:r>
-        <w:rPr/>
         <w:t xml:space="preserve">, </w:t>
       </w:r>
       <w:r>
         <w:rPr>
-          <w:rStyle w:val="FootnoteReference"/>
-          <w:rFonts w:cs="Inter" w:ascii="Inter" w:hAnsi="Inter"/>
+          <w:rFonts w:ascii="Inter" w:hAnsi="Inter" w:cs="Inter"/>
           <w:b/>
           <w:color w:val="3092B1"/>
+          <w:position w:val="8"/>
           <w:sz w:val="18"/>
           <w:szCs w:val="18"/>
           <w:vertAlign w:val="superscript"/>
         </w:rPr>
-        <w:footnoteReference w:id="8"/>
+        <w:footnoteReference w:id="7"/>
       </w:r>
       <w:r>
         <w:rPr/>
@@ -1332,10 +1324,34 @@
       </w:r>
       <w:r>
         <w:rPr>
-          <w:rStyle w:val="FootnoteReference"/>
-          <w:rFonts w:cs="Inter" w:ascii="Inter" w:hAnsi="Inter"/>
+          <w:rFonts w:ascii="Inter" w:hAnsi="Inter" w:cs="Inter"/>
           <w:b/>
           <w:color w:val="3092B1"/>
+          <w:position w:val="8"/>
+          <w:sz w:val="18"/>
+          <w:szCs w:val="18"/>
+          <w:vertAlign w:val="superscript"/>
+        </w:rPr>
+        <w:footnoteReference w:id="8"/>
+      </w:r>
+      <w:r>
+        <w:rPr>
+          <w:rFonts w:ascii="Inter" w:hAnsi="Inter" w:cs="Inter"/>
+          <w:b/>
+          <w:color w:val="3092B1"/>
+          <w:position w:val="8"/>
+          <w:sz w:val="18"/>
+          <w:szCs w:val="18"/>
+          <w:vertAlign w:val="superscript"/>
+        </w:rPr>
+        <w:t xml:space="preserve">, </w:t>
+      </w:r>
+      <w:r>
+        <w:rPr>
+          <w:rFonts w:ascii="Inter" w:hAnsi="Inter" w:cs="Inter"/>
+          <w:b/>
+          <w:color w:val="3092B1"/>
+          <w:position w:val="8"/>
           <w:sz w:val="18"/>
           <w:szCs w:val="18"/>
           <w:vertAlign w:val="superscript"/>
@@ -1404,10 +1420,10 @@
       </w:r>
       <w:r>
         <w:rPr>
-          <w:rStyle w:val="FootnoteReference"/>
-          <w:rFonts w:cs="Inter" w:ascii="Inter" w:hAnsi="Inter"/>
+          <w:rFonts w:ascii="Inter" w:hAnsi="Inter" w:cs="Inter"/>
           <w:b/>
           <w:color w:val="3092B1"/>
+          <w:position w:val="8"/>
           <w:sz w:val="18"/>
           <w:szCs w:val="18"/>
           <w:vertAlign w:val="superscript"/>
@@ -1498,10 +1514,10 @@
       </w:r>
       <w:r>
         <w:rPr>
-          <w:rStyle w:val="FootnoteReference"/>
-          <w:rFonts w:cs="Inter" w:ascii="Inter" w:hAnsi="Inter"/>
+          <w:rFonts w:ascii="Inter" w:hAnsi="Inter" w:cs="Inter"/>
           <w:b/>
           <w:color w:val="3092B1"/>
+          <w:position w:val="8"/>
           <w:sz w:val="18"/>
           <w:szCs w:val="18"/>
           <w:vertAlign w:val="superscript"/>
@@ -1509,15 +1525,23 @@
         <w:footnoteReference w:id="11"/>
       </w:r>
       <w:r>
-        <w:rPr/>
-        <w:t xml:space="preserve">, </w:t>
-      </w:r>
-      <w:r>
-        <w:rPr>
-          <w:rStyle w:val="FootnoteReference"/>
-          <w:rFonts w:cs="Inter" w:ascii="Inter" w:hAnsi="Inter"/>
+        <w:rPr>
+          <w:rFonts w:ascii="Inter" w:hAnsi="Inter" w:cs="Inter"/>
           <w:b/>
           <w:color w:val="3092B1"/>
+          <w:position w:val="8"/>
+          <w:sz w:val="18"/>
+          <w:szCs w:val="18"/>
+          <w:vertAlign w:val="superscript"/>
+        </w:rPr>
+        <w:t xml:space="preserve">, </w:t>
+      </w:r>
+      <w:r>
+        <w:rPr>
+          <w:rFonts w:ascii="Inter" w:hAnsi="Inter" w:cs="Inter"/>
+          <w:b/>
+          <w:color w:val="3092B1"/>
+          <w:position w:val="8"/>
           <w:sz w:val="18"/>
           <w:szCs w:val="18"/>
           <w:vertAlign w:val="superscript"/>
@@ -1576,10 +1600,10 @@
       </w:r>
       <w:r>
         <w:rPr>
-          <w:rStyle w:val="FootnoteReference"/>
-          <w:rFonts w:cs="Inter" w:ascii="Inter" w:hAnsi="Inter"/>
+          <w:rFonts w:ascii="Inter" w:hAnsi="Inter" w:cs="Inter"/>
           <w:b/>
           <w:color w:val="3092B1"/>
+          <w:position w:val="8"/>
           <w:sz w:val="18"/>
           <w:szCs w:val="18"/>
           <w:vertAlign w:val="superscript"/>
@@ -1587,15 +1611,23 @@
         <w:footnoteReference w:id="13"/>
       </w:r>
       <w:r>
-        <w:rPr/>
-        <w:t xml:space="preserve">, </w:t>
-      </w:r>
-      <w:r>
-        <w:rPr>
-          <w:rStyle w:val="FootnoteReference"/>
-          <w:rFonts w:cs="Inter" w:ascii="Inter" w:hAnsi="Inter"/>
+        <w:rPr>
+          <w:rFonts w:ascii="Inter" w:hAnsi="Inter" w:cs="Inter"/>
           <w:b/>
           <w:color w:val="3092B1"/>
+          <w:position w:val="8"/>
+          <w:sz w:val="18"/>
+          <w:szCs w:val="18"/>
+          <w:vertAlign w:val="superscript"/>
+        </w:rPr>
+        <w:t xml:space="preserve">, </w:t>
+      </w:r>
+      <w:r>
+        <w:rPr>
+          <w:rFonts w:ascii="Inter" w:hAnsi="Inter" w:cs="Inter"/>
+          <w:b/>
+          <w:color w:val="3092B1"/>
+          <w:position w:val="8"/>
           <w:sz w:val="18"/>
           <w:szCs w:val="18"/>
           <w:vertAlign w:val="superscript"/>
@@ -1702,10 +1734,10 @@
       </w:r>
       <w:r>
         <w:rPr>
-          <w:rStyle w:val="FootnoteReference"/>
-          <w:rFonts w:cs="Inter" w:ascii="Inter" w:hAnsi="Inter"/>
+          <w:rFonts w:ascii="Inter" w:hAnsi="Inter" w:cs="Inter"/>
           <w:b/>
           <w:color w:val="3092B1"/>
+          <w:position w:val="8"/>
           <w:sz w:val="18"/>
           <w:szCs w:val="18"/>
           <w:vertAlign w:val="superscript"/>
@@ -1743,10 +1775,10 @@
       </w:r>
       <w:r>
         <w:rPr>
-          <w:rStyle w:val="FootnoteReference"/>
-          <w:rFonts w:cs="Inter" w:ascii="Inter" w:hAnsi="Inter"/>
+          <w:rFonts w:ascii="Inter" w:hAnsi="Inter" w:cs="Inter"/>
           <w:b/>
           <w:color w:val="3092B1"/>
+          <w:position w:val="8"/>
           <w:sz w:val="18"/>
           <w:szCs w:val="18"/>
           <w:vertAlign w:val="superscript"/>
@@ -1754,15 +1786,23 @@
         <w:footnoteReference w:id="16"/>
       </w:r>
       <w:r>
-        <w:rPr/>
-        <w:t xml:space="preserve">, </w:t>
-      </w:r>
-      <w:r>
-        <w:rPr>
-          <w:rStyle w:val="FootnoteReference"/>
-          <w:rFonts w:cs="Inter" w:ascii="Inter" w:hAnsi="Inter"/>
+        <w:rPr>
+          <w:rFonts w:ascii="Inter" w:hAnsi="Inter" w:cs="Inter"/>
           <w:b/>
           <w:color w:val="3092B1"/>
+          <w:position w:val="8"/>
+          <w:sz w:val="18"/>
+          <w:szCs w:val="18"/>
+          <w:vertAlign w:val="superscript"/>
+        </w:rPr>
+        <w:t xml:space="preserve">, </w:t>
+      </w:r>
+      <w:r>
+        <w:rPr>
+          <w:rFonts w:ascii="Inter" w:hAnsi="Inter" w:cs="Inter"/>
+          <w:b/>
+          <w:color w:val="3092B1"/>
+          <w:position w:val="8"/>
           <w:sz w:val="18"/>
           <w:szCs w:val="18"/>
           <w:vertAlign w:val="superscript"/>
@@ -1907,10 +1947,10 @@
       </w:r>
       <w:r>
         <w:rPr>
-          <w:rStyle w:val="FootnoteReference"/>
-          <w:rFonts w:cs="Inter" w:ascii="Inter" w:hAnsi="Inter"/>
+          <w:rFonts w:ascii="Inter" w:hAnsi="Inter" w:cs="Inter"/>
           <w:b/>
           <w:color w:val="3092B1"/>
+          <w:position w:val="8"/>
           <w:sz w:val="18"/>
           <w:szCs w:val="18"/>
           <w:vertAlign w:val="superscript"/>
@@ -1951,10 +1991,10 @@
       </w:r>
       <w:r>
         <w:rPr>
-          <w:rStyle w:val="FootnoteReference"/>
-          <w:rFonts w:cs="Inter" w:ascii="Inter" w:hAnsi="Inter"/>
+          <w:rFonts w:ascii="Inter" w:hAnsi="Inter" w:cs="Inter"/>
           <w:b/>
           <w:color w:val="3092B1"/>
+          <w:position w:val="8"/>
           <w:sz w:val="18"/>
           <w:szCs w:val="18"/>
           <w:vertAlign w:val="superscript"/>
@@ -1962,15 +2002,23 @@
         <w:footnoteReference w:id="19"/>
       </w:r>
       <w:r>
-        <w:rPr/>
-        <w:t xml:space="preserve">, </w:t>
-      </w:r>
-      <w:r>
-        <w:rPr>
-          <w:rStyle w:val="FootnoteReference"/>
-          <w:rFonts w:cs="Inter" w:ascii="Inter" w:hAnsi="Inter"/>
+        <w:rPr>
+          <w:rFonts w:ascii="Inter" w:hAnsi="Inter" w:cs="Inter"/>
           <w:b/>
           <w:color w:val="3092B1"/>
+          <w:position w:val="8"/>
+          <w:sz w:val="18"/>
+          <w:szCs w:val="18"/>
+          <w:vertAlign w:val="superscript"/>
+        </w:rPr>
+        <w:t xml:space="preserve">, </w:t>
+      </w:r>
+      <w:r>
+        <w:rPr>
+          <w:rFonts w:ascii="Inter" w:hAnsi="Inter" w:cs="Inter"/>
+          <w:b/>
+          <w:color w:val="3092B1"/>
+          <w:position w:val="8"/>
           <w:sz w:val="18"/>
           <w:szCs w:val="18"/>
           <w:vertAlign w:val="superscript"/>
@@ -2018,10 +2066,10 @@
       </w:r>
       <w:r>
         <w:rPr>
-          <w:rStyle w:val="FootnoteReference"/>
-          <w:rFonts w:cs="Inter" w:ascii="Inter" w:hAnsi="Inter"/>
+          <w:rFonts w:ascii="Inter" w:hAnsi="Inter" w:cs="Inter"/>
           <w:b/>
           <w:color w:val="3092B1"/>
+          <w:position w:val="8"/>
           <w:sz w:val="18"/>
           <w:szCs w:val="18"/>
           <w:vertAlign w:val="superscript"/>
@@ -2073,10 +2121,10 @@
       </w:r>
       <w:r>
         <w:rPr>
-          <w:rStyle w:val="FootnoteReference"/>
-          <w:rFonts w:cs="Inter" w:ascii="Inter" w:hAnsi="Inter"/>
+          <w:rFonts w:ascii="Inter" w:hAnsi="Inter" w:cs="Inter"/>
           <w:b/>
           <w:color w:val="3092B1"/>
+          <w:position w:val="8"/>
           <w:sz w:val="18"/>
           <w:szCs w:val="18"/>
           <w:vertAlign w:val="superscript"/>
@@ -2139,10 +2187,10 @@
       </w:r>
       <w:r>
         <w:rPr>
-          <w:rStyle w:val="FootnoteReference"/>
-          <w:rFonts w:cs="Inter" w:ascii="Inter" w:hAnsi="Inter"/>
+          <w:rFonts w:ascii="Inter" w:hAnsi="Inter" w:cs="Inter"/>
           <w:b/>
           <w:color w:val="3092B1"/>
+          <w:position w:val="8"/>
           <w:sz w:val="18"/>
           <w:szCs w:val="18"/>
           <w:vertAlign w:val="superscript"/>
@@ -2261,10 +2309,10 @@
       </w:r>
       <w:r>
         <w:rPr>
-          <w:rStyle w:val="FootnoteReference"/>
-          <w:rFonts w:cs="Inter" w:ascii="Inter" w:hAnsi="Inter"/>
+          <w:rFonts w:ascii="Inter" w:hAnsi="Inter" w:cs="Inter"/>
           <w:b/>
           <w:color w:val="3092B1"/>
+          <w:position w:val="8"/>
           <w:sz w:val="18"/>
           <w:szCs w:val="18"/>
           <w:vertAlign w:val="superscript"/>
@@ -2358,10 +2406,10 @@
       </w:r>
       <w:r>
         <w:rPr>
-          <w:rStyle w:val="FootnoteReference"/>
-          <w:rFonts w:cs="Inter" w:ascii="Inter" w:hAnsi="Inter"/>
+          <w:rFonts w:ascii="Inter" w:hAnsi="Inter" w:cs="Inter"/>
           <w:b/>
           <w:color w:val="3092B1"/>
+          <w:position w:val="8"/>
           <w:sz w:val="18"/>
           <w:szCs w:val="18"/>
           <w:vertAlign w:val="superscript"/>
@@ -2398,10 +2446,10 @@
       </w:r>
       <w:r>
         <w:rPr>
-          <w:rStyle w:val="FootnoteReference"/>
-          <w:rFonts w:cs="Inter" w:ascii="Inter" w:hAnsi="Inter"/>
+          <w:rFonts w:ascii="Inter" w:hAnsi="Inter" w:cs="Inter"/>
           <w:b/>
           <w:color w:val="3092B1"/>
+          <w:position w:val="8"/>
           <w:sz w:val="18"/>
           <w:szCs w:val="18"/>
           <w:vertAlign w:val="superscript"/>
@@ -2703,15 +2751,13 @@
             </w:r>
             <w:r>
               <w:rPr>
-                <w:rStyle w:val="FootnoteReference"/>
-                <w:rFonts w:eastAsia="ＭＳ 明朝" w:cs="Inter" w:ascii="Inter" w:hAnsi="Inter"/>
+                <w:rFonts w:ascii="Inter" w:hAnsi="Inter" w:cs="Inter"/>
                 <w:b/>
                 <w:color w:val="3092B1"/>
-                <w:kern w:val="0"/>
+                <w:position w:val="8"/>
                 <w:sz w:val="18"/>
                 <w:szCs w:val="18"/>
                 <w:vertAlign w:val="superscript"/>
-                <w:lang w:val="en-US" w:eastAsia="en-US" w:bidi="ar-SA"/>
               </w:rPr>
               <w:footnoteReference w:id="27"/>
             </w:r>
@@ -2849,15 +2895,13 @@
             </w:r>
             <w:r>
               <w:rPr>
-                <w:rStyle w:val="FootnoteReference"/>
-                <w:rFonts w:eastAsia="ＭＳ 明朝" w:cs="Inter" w:ascii="Inter" w:hAnsi="Inter"/>
+                <w:rFonts w:ascii="Inter" w:hAnsi="Inter" w:cs="Inter"/>
                 <w:b/>
                 <w:color w:val="3092B1"/>
-                <w:kern w:val="0"/>
+                <w:position w:val="8"/>
                 <w:sz w:val="18"/>
                 <w:szCs w:val="18"/>
                 <w:vertAlign w:val="superscript"/>
-                <w:lang w:val="en-US" w:eastAsia="en-US" w:bidi="ar-SA"/>
               </w:rPr>
               <w:footnoteReference w:id="28"/>
             </w:r>
@@ -2995,15 +3039,13 @@
             </w:r>
             <w:r>
               <w:rPr>
-                <w:rStyle w:val="FootnoteReference"/>
-                <w:rFonts w:eastAsia="ＭＳ 明朝" w:cs="Inter" w:ascii="Inter" w:hAnsi="Inter"/>
+                <w:rFonts w:ascii="Inter" w:hAnsi="Inter" w:cs="Inter"/>
                 <w:b/>
                 <w:color w:val="3092B1"/>
-                <w:kern w:val="0"/>
+                <w:position w:val="8"/>
                 <w:sz w:val="18"/>
                 <w:szCs w:val="18"/>
                 <w:vertAlign w:val="superscript"/>
-                <w:lang w:val="en-US" w:eastAsia="en-US" w:bidi="ar-SA"/>
               </w:rPr>
               <w:footnoteReference w:id="29"/>
             </w:r>
@@ -3130,15 +3172,13 @@
             </w:r>
             <w:r>
               <w:rPr>
-                <w:rStyle w:val="FootnoteReference"/>
-                <w:rFonts w:eastAsia="ＭＳ 明朝" w:cs="Inter" w:ascii="Inter" w:hAnsi="Inter"/>
+                <w:rFonts w:ascii="Inter" w:hAnsi="Inter" w:cs="Inter"/>
                 <w:b/>
                 <w:color w:val="3092B1"/>
-                <w:kern w:val="0"/>
+                <w:position w:val="8"/>
                 <w:sz w:val="18"/>
                 <w:szCs w:val="18"/>
                 <w:vertAlign w:val="superscript"/>
-                <w:lang w:val="en-US" w:eastAsia="en-US" w:bidi="ar-SA"/>
               </w:rPr>
               <w:footnoteReference w:id="30"/>
             </w:r>
@@ -3179,10 +3219,10 @@
       </w:r>
       <w:r>
         <w:rPr>
-          <w:rStyle w:val="FootnoteReference"/>
-          <w:rFonts w:cs="Inter" w:ascii="Inter" w:hAnsi="Inter"/>
+          <w:rFonts w:ascii="Inter" w:hAnsi="Inter" w:cs="Inter"/>
           <w:b/>
           <w:color w:val="3092B1"/>
+          <w:position w:val="8"/>
           <w:sz w:val="18"/>
           <w:szCs w:val="18"/>
           <w:vertAlign w:val="superscript"/>
@@ -3224,10 +3264,10 @@
       </w:r>
       <w:r>
         <w:rPr>
-          <w:rStyle w:val="FootnoteReference"/>
-          <w:rFonts w:cs="Inter" w:ascii="Inter" w:hAnsi="Inter"/>
+          <w:rFonts w:ascii="Inter" w:hAnsi="Inter" w:cs="Inter"/>
           <w:b/>
           <w:color w:val="3092B1"/>
+          <w:position w:val="8"/>
           <w:sz w:val="18"/>
           <w:szCs w:val="18"/>
           <w:vertAlign w:val="superscript"/>
@@ -3268,10 +3308,10 @@
       </w:r>
       <w:r>
         <w:rPr>
-          <w:rStyle w:val="FootnoteReference"/>
-          <w:rFonts w:cs="Inter" w:ascii="Inter" w:hAnsi="Inter"/>
+          <w:rFonts w:ascii="Inter" w:hAnsi="Inter" w:cs="Inter"/>
           <w:b/>
           <w:color w:val="3092B1"/>
+          <w:position w:val="8"/>
           <w:sz w:val="18"/>
           <w:szCs w:val="18"/>
           <w:vertAlign w:val="superscript"/>
@@ -3290,10 +3330,10 @@
       </w:r>
       <w:r>
         <w:rPr>
-          <w:rStyle w:val="FootnoteReference"/>
-          <w:rFonts w:cs="Inter" w:ascii="Inter" w:hAnsi="Inter"/>
+          <w:rFonts w:ascii="Inter" w:hAnsi="Inter" w:cs="Inter"/>
           <w:b/>
           <w:color w:val="3092B1"/>
+          <w:position w:val="8"/>
           <w:sz w:val="18"/>
           <w:szCs w:val="18"/>
           <w:vertAlign w:val="superscript"/>
@@ -3323,10 +3363,10 @@
       </w:r>
       <w:r>
         <w:rPr>
-          <w:rStyle w:val="FootnoteReference"/>
-          <w:rFonts w:cs="Inter" w:ascii="Inter" w:hAnsi="Inter"/>
+          <w:rFonts w:ascii="Inter" w:hAnsi="Inter" w:cs="Inter"/>
           <w:b/>
           <w:color w:val="3092B1"/>
+          <w:position w:val="8"/>
           <w:sz w:val="18"/>
           <w:szCs w:val="18"/>
           <w:vertAlign w:val="superscript"/>
@@ -3334,15 +3374,23 @@
         <w:footnoteReference w:id="35"/>
       </w:r>
       <w:r>
-        <w:rPr/>
-        <w:t xml:space="preserve">, </w:t>
-      </w:r>
-      <w:r>
-        <w:rPr>
-          <w:rStyle w:val="FootnoteReference"/>
-          <w:rFonts w:cs="Inter" w:ascii="Inter" w:hAnsi="Inter"/>
+        <w:rPr>
+          <w:rFonts w:ascii="Inter" w:hAnsi="Inter" w:cs="Inter"/>
           <w:b/>
           <w:color w:val="3092B1"/>
+          <w:position w:val="8"/>
+          <w:sz w:val="18"/>
+          <w:szCs w:val="18"/>
+          <w:vertAlign w:val="superscript"/>
+        </w:rPr>
+        <w:t xml:space="preserve">, </w:t>
+      </w:r>
+      <w:r>
+        <w:rPr>
+          <w:rFonts w:ascii="Inter" w:hAnsi="Inter" w:cs="Inter"/>
+          <w:b/>
+          <w:color w:val="3092B1"/>
+          <w:position w:val="8"/>
           <w:sz w:val="18"/>
           <w:szCs w:val="18"/>
           <w:vertAlign w:val="superscript"/>
@@ -3444,10 +3492,10 @@
       </w:r>
       <w:r>
         <w:rPr>
-          <w:rStyle w:val="FootnoteReference"/>
-          <w:rFonts w:cs="Inter" w:ascii="Inter" w:hAnsi="Inter"/>
+          <w:rFonts w:ascii="Inter" w:hAnsi="Inter" w:cs="Inter"/>
           <w:b/>
           <w:color w:val="3092B1"/>
+          <w:position w:val="8"/>
           <w:sz w:val="18"/>
           <w:szCs w:val="18"/>
           <w:vertAlign w:val="superscript"/>
@@ -4366,10 +4414,10 @@
       </w:r>
       <w:r>
         <w:rPr>
-          <w:rStyle w:val="FootnoteReference"/>
-          <w:rFonts w:cs="Inter" w:ascii="Inter" w:hAnsi="Inter"/>
+          <w:rFonts w:ascii="Inter" w:hAnsi="Inter" w:cs="Inter"/>
           <w:b/>
           <w:color w:val="3092B1"/>
+          <w:position w:val="8"/>
           <w:sz w:val="18"/>
           <w:szCs w:val="18"/>
           <w:vertAlign w:val="superscript"/>
@@ -4475,10 +4523,10 @@
       </w:r>
       <w:r>
         <w:rPr>
-          <w:rStyle w:val="FootnoteReference"/>
-          <w:rFonts w:cs="Inter" w:ascii="Inter" w:hAnsi="Inter"/>
+          <w:rFonts w:ascii="Inter" w:hAnsi="Inter" w:cs="Inter"/>
           <w:b/>
           <w:color w:val="3092B1"/>
+          <w:position w:val="8"/>
           <w:sz w:val="18"/>
           <w:szCs w:val="18"/>
           <w:vertAlign w:val="superscript"/>
@@ -4486,69 +4534,85 @@
         <w:footnoteReference w:id="39"/>
       </w:r>
       <w:r>
-        <w:rPr/>
-        <w:t xml:space="preserve">, </w:t>
-      </w:r>
-      <w:r>
-        <w:rPr>
-          <w:rStyle w:val="FootnoteReference"/>
-          <w:rFonts w:cs="Inter" w:ascii="Inter" w:hAnsi="Inter"/>
+        <w:rPr>
+          <w:rFonts w:ascii="Inter" w:hAnsi="Inter" w:cs="Inter"/>
           <w:b/>
           <w:color w:val="3092B1"/>
+          <w:position w:val="8"/>
           <w:sz w:val="18"/>
           <w:szCs w:val="18"/>
           <w:vertAlign w:val="superscript"/>
         </w:rPr>
-        <w:footnoteReference w:id="40"/>
-      </w:r>
-    </w:p>
-    <w:p>
-      <w:pPr>
-        <w:pStyle w:val="BodyText"/>
-        <w:rPr/>
-      </w:pPr>
-      <w:r>
-        <w:rPr/>
-        <w:t>The Australia Institute’s accumulated framing — five APPEA members with A$138 billion of combined Australian revenue and zero income tax over seven years — is correct and directly verifiable from the ATO data.</w:t>
-      </w:r>
-      <w:r>
-        <w:rPr>
-          <w:rStyle w:val="FootnoteReference"/>
-          <w:rFonts w:cs="Inter" w:ascii="Inter" w:hAnsi="Inter"/>
+        <w:t xml:space="preserve">, </w:t>
+      </w:r>
+      <w:r>
+        <w:rPr>
+          <w:rFonts w:ascii="Inter" w:hAnsi="Inter" w:cs="Inter"/>
           <w:b/>
           <w:color w:val="3092B1"/>
+          <w:position w:val="8"/>
           <w:sz w:val="18"/>
           <w:szCs w:val="18"/>
           <w:vertAlign w:val="superscript"/>
         </w:rPr>
-        <w:footnoteReference w:id="41"/>
-      </w:r>
-      <w:r>
-        <w:rPr/>
-        <w:t xml:space="preserve"> Post-2022 the headline reversed. 2024 calendar-year corporate income tax payments are now substantial: Chevron A$5 bn, Woodside A$4 bn.</w:t>
-      </w:r>
-      <w:r>
-        <w:rPr>
-          <w:rStyle w:val="FootnoteReference"/>
-          <w:rFonts w:cs="Inter" w:ascii="Inter" w:hAnsi="Inter"/>
+        <w:footnoteReference w:id="40"/>
+      </w:r>
+    </w:p>
+    <w:p>
+      <w:pPr>
+        <w:pStyle w:val="BodyText"/>
+        <w:rPr/>
+      </w:pPr>
+      <w:r>
+        <w:rPr/>
+        <w:t>The Australia Institute’s accumulated framing — five APPEA members with A$138 billion of combined Australian revenue and zero income tax over seven years — is correct and directly verifiable from the ATO data.</w:t>
+      </w:r>
+      <w:r>
+        <w:rPr>
+          <w:rFonts w:ascii="Inter" w:hAnsi="Inter" w:cs="Inter"/>
           <w:b/>
           <w:color w:val="3092B1"/>
+          <w:position w:val="8"/>
           <w:sz w:val="18"/>
           <w:szCs w:val="18"/>
           <w:vertAlign w:val="superscript"/>
         </w:rPr>
-        <w:footnoteReference w:id="42"/>
-      </w:r>
-      <w:r>
-        <w:rPr/>
-        <w:t xml:space="preserve">, </w:t>
-      </w:r>
-      <w:r>
-        <w:rPr>
-          <w:rStyle w:val="FootnoteReference"/>
-          <w:rFonts w:cs="Inter" w:ascii="Inter" w:hAnsi="Inter"/>
+        <w:footnoteReference w:id="41"/>
+      </w:r>
+      <w:r>
+        <w:rPr/>
+        <w:t xml:space="preserve"> Post-2022 the headline reversed. 2024 calendar-year corporate income tax payments are now substantial: Chevron A$5 bn, Woodside A$4 bn.</w:t>
+      </w:r>
+      <w:r>
+        <w:rPr>
+          <w:rFonts w:ascii="Inter" w:hAnsi="Inter" w:cs="Inter"/>
           <w:b/>
           <w:color w:val="3092B1"/>
+          <w:position w:val="8"/>
+          <w:sz w:val="18"/>
+          <w:szCs w:val="18"/>
+          <w:vertAlign w:val="superscript"/>
+        </w:rPr>
+        <w:footnoteReference w:id="42"/>
+      </w:r>
+      <w:r>
+        <w:rPr>
+          <w:rFonts w:ascii="Inter" w:hAnsi="Inter" w:cs="Inter"/>
+          <w:b/>
+          <w:color w:val="3092B1"/>
+          <w:position w:val="8"/>
+          <w:sz w:val="18"/>
+          <w:szCs w:val="18"/>
+          <w:vertAlign w:val="superscript"/>
+        </w:rPr>
+        <w:t xml:space="preserve">, </w:t>
+      </w:r>
+      <w:r>
+        <w:rPr>
+          <w:rFonts w:ascii="Inter" w:hAnsi="Inter" w:cs="Inter"/>
+          <w:b/>
+          <w:color w:val="3092B1"/>
+          <w:position w:val="8"/>
           <w:sz w:val="18"/>
           <w:szCs w:val="18"/>
           <w:vertAlign w:val="superscript"/>
@@ -5077,10 +5141,10 @@
       </w:r>
       <w:r>
         <w:rPr>
-          <w:rStyle w:val="FootnoteReference"/>
-          <w:rFonts w:cs="Inter" w:ascii="Inter" w:hAnsi="Inter"/>
+          <w:rFonts w:ascii="Inter" w:hAnsi="Inter" w:cs="Inter"/>
           <w:b/>
           <w:color w:val="3092B1"/>
+          <w:position w:val="8"/>
           <w:sz w:val="18"/>
           <w:szCs w:val="18"/>
           <w:vertAlign w:val="superscript"/>
@@ -5127,10 +5191,10 @@
       </w:r>
       <w:r>
         <w:rPr>
-          <w:rStyle w:val="FootnoteReference"/>
-          <w:rFonts w:cs="Inter" w:ascii="Inter" w:hAnsi="Inter"/>
+          <w:rFonts w:ascii="Inter" w:hAnsi="Inter" w:cs="Inter"/>
           <w:b/>
           <w:color w:val="3092B1"/>
+          <w:position w:val="8"/>
           <w:sz w:val="18"/>
           <w:szCs w:val="18"/>
           <w:vertAlign w:val="superscript"/>
@@ -5352,10 +5416,10 @@
       </w:r>
       <w:r>
         <w:rPr>
-          <w:rStyle w:val="FootnoteReference"/>
-          <w:rFonts w:cs="Inter" w:ascii="Inter" w:hAnsi="Inter"/>
+          <w:rFonts w:ascii="Inter" w:hAnsi="Inter" w:cs="Inter"/>
           <w:b/>
           <w:color w:val="3092B1"/>
+          <w:position w:val="8"/>
           <w:sz w:val="18"/>
           <w:szCs w:val="18"/>
           <w:vertAlign w:val="superscript"/>
@@ -5385,10 +5449,10 @@
       </w:r>
       <w:r>
         <w:rPr>
-          <w:rStyle w:val="FootnoteReference"/>
-          <w:rFonts w:cs="Inter" w:ascii="Inter" w:hAnsi="Inter"/>
+          <w:rFonts w:ascii="Inter" w:hAnsi="Inter" w:cs="Inter"/>
           <w:b/>
           <w:color w:val="3092B1"/>
+          <w:position w:val="8"/>
           <w:sz w:val="18"/>
           <w:szCs w:val="18"/>
           <w:vertAlign w:val="superscript"/>
@@ -5588,10 +5652,10 @@
       </w:r>
       <w:r>
         <w:rPr>
-          <w:rStyle w:val="FootnoteReference"/>
-          <w:rFonts w:cs="Inter" w:ascii="Inter" w:hAnsi="Inter"/>
+          <w:rFonts w:ascii="Inter" w:hAnsi="Inter" w:cs="Inter"/>
           <w:b/>
           <w:color w:val="3092B1"/>
+          <w:position w:val="8"/>
           <w:sz w:val="18"/>
           <w:szCs w:val="18"/>
           <w:vertAlign w:val="superscript"/>
@@ -5714,10 +5778,10 @@
       </w:r>
       <w:r>
         <w:rPr>
-          <w:rStyle w:val="FootnoteReference"/>
-          <w:rFonts w:cs="Inter" w:ascii="Inter" w:hAnsi="Inter"/>
+          <w:rFonts w:ascii="Inter" w:hAnsi="Inter" w:cs="Inter"/>
           <w:b/>
           <w:color w:val="3092B1"/>
+          <w:position w:val="8"/>
           <w:sz w:val="18"/>
           <w:szCs w:val="18"/>
           <w:vertAlign w:val="superscript"/>
@@ -5775,10 +5839,10 @@
       </w:r>
       <w:r>
         <w:rPr>
-          <w:rStyle w:val="FootnoteReference"/>
-          <w:rFonts w:cs="Inter" w:ascii="Inter" w:hAnsi="Inter"/>
+          <w:rFonts w:ascii="Inter" w:hAnsi="Inter" w:cs="Inter"/>
           <w:b/>
           <w:color w:val="3092B1"/>
+          <w:position w:val="8"/>
           <w:sz w:val="18"/>
           <w:szCs w:val="18"/>
           <w:vertAlign w:val="superscript"/>
@@ -6084,10 +6148,10 @@
       </w:r>
       <w:r>
         <w:rPr>
-          <w:rStyle w:val="FootnoteReference"/>
-          <w:rFonts w:cs="Inter" w:ascii="Inter" w:hAnsi="Inter"/>
+          <w:rFonts w:ascii="Inter" w:hAnsi="Inter" w:cs="Inter"/>
           <w:b/>
           <w:color w:val="3092B1"/>
+          <w:position w:val="8"/>
           <w:sz w:val="18"/>
           <w:szCs w:val="18"/>
           <w:vertAlign w:val="superscript"/>
@@ -6254,10 +6318,10 @@
       </w:r>
       <w:r>
         <w:rPr>
-          <w:rStyle w:val="FootnoteReference"/>
-          <w:rFonts w:cs="Inter" w:ascii="Inter" w:hAnsi="Inter"/>
+          <w:rFonts w:ascii="Inter" w:hAnsi="Inter" w:cs="Inter"/>
           <w:b/>
           <w:color w:val="3092B1"/>
+          <w:position w:val="8"/>
           <w:sz w:val="18"/>
           <w:szCs w:val="18"/>
           <w:vertAlign w:val="superscript"/>
@@ -6866,10 +6930,10 @@
       </w:r>
       <w:r>
         <w:rPr>
-          <w:rStyle w:val="FootnoteReference"/>
-          <w:rFonts w:cs="Inter" w:ascii="Inter" w:hAnsi="Inter"/>
+          <w:rFonts w:ascii="Inter" w:hAnsi="Inter" w:cs="Inter"/>
           <w:b/>
           <w:color w:val="3092B1"/>
+          <w:position w:val="8"/>
           <w:sz w:val="18"/>
           <w:szCs w:val="18"/>
           <w:vertAlign w:val="superscript"/>
@@ -7015,10 +7079,10 @@
       </w:r>
       <w:r>
         <w:rPr>
-          <w:rStyle w:val="FootnoteReference"/>
-          <w:rFonts w:cs="Inter" w:ascii="Inter" w:hAnsi="Inter"/>
+          <w:rFonts w:ascii="Inter" w:hAnsi="Inter" w:cs="Inter"/>
           <w:b/>
           <w:color w:val="3092B1"/>
+          <w:position w:val="8"/>
           <w:sz w:val="18"/>
           <w:szCs w:val="18"/>
           <w:vertAlign w:val="superscript"/>
@@ -7052,10 +7116,10 @@
       </w:r>
       <w:r>
         <w:rPr>
-          <w:rStyle w:val="FootnoteReference"/>
-          <w:rFonts w:cs="Inter" w:ascii="Inter" w:hAnsi="Inter"/>
+          <w:rFonts w:ascii="Inter" w:hAnsi="Inter" w:cs="Inter"/>
           <w:b/>
           <w:color w:val="3092B1"/>
+          <w:position w:val="8"/>
           <w:sz w:val="18"/>
           <w:szCs w:val="18"/>
           <w:vertAlign w:val="superscript"/>
@@ -7173,10 +7237,10 @@
       </w:r>
       <w:r>
         <w:rPr>
-          <w:rStyle w:val="FootnoteReference"/>
-          <w:rFonts w:cs="Inter" w:ascii="Inter" w:hAnsi="Inter"/>
+          <w:rFonts w:ascii="Inter" w:hAnsi="Inter" w:cs="Inter"/>
           <w:b/>
           <w:color w:val="3092B1"/>
+          <w:position w:val="8"/>
           <w:sz w:val="18"/>
           <w:szCs w:val="18"/>
           <w:vertAlign w:val="superscript"/>
@@ -7261,10 +7325,10 @@
       </w:r>
       <w:r>
         <w:rPr>
-          <w:rStyle w:val="FootnoteReference"/>
-          <w:rFonts w:cs="Inter" w:ascii="Inter" w:hAnsi="Inter"/>
+          <w:rFonts w:ascii="Inter" w:hAnsi="Inter" w:cs="Inter"/>
           <w:b/>
           <w:color w:val="3092B1"/>
+          <w:position w:val="8"/>
           <w:sz w:val="18"/>
           <w:szCs w:val="18"/>
           <w:vertAlign w:val="superscript"/>
@@ -7381,10 +7445,10 @@
       </w:r>
       <w:r>
         <w:rPr>
-          <w:rStyle w:val="FootnoteReference"/>
-          <w:rFonts w:cs="Inter" w:ascii="Inter" w:hAnsi="Inter"/>
+          <w:rFonts w:ascii="Inter" w:hAnsi="Inter" w:cs="Inter"/>
           <w:b/>
           <w:color w:val="3092B1"/>
+          <w:position w:val="8"/>
           <w:sz w:val="18"/>
           <w:szCs w:val="18"/>
           <w:vertAlign w:val="superscript"/>
@@ -7458,10 +7522,10 @@
       </w:r>
       <w:r>
         <w:rPr>
-          <w:rStyle w:val="FootnoteReference"/>
-          <w:rFonts w:cs="Inter" w:ascii="Inter" w:hAnsi="Inter"/>
+          <w:rFonts w:ascii="Inter" w:hAnsi="Inter" w:cs="Inter"/>
           <w:b/>
           <w:color w:val="3092B1"/>
+          <w:position w:val="8"/>
           <w:sz w:val="18"/>
           <w:szCs w:val="18"/>
           <w:vertAlign w:val="superscript"/>
@@ -8086,10 +8150,10 @@
       </w:r>
       <w:r>
         <w:rPr>
-          <w:rStyle w:val="FootnoteReference"/>
-          <w:rFonts w:cs="Inter" w:ascii="Inter" w:hAnsi="Inter"/>
+          <w:rFonts w:ascii="Inter" w:hAnsi="Inter" w:cs="Inter"/>
           <w:b/>
           <w:color w:val="3092B1"/>
+          <w:position w:val="8"/>
           <w:sz w:val="18"/>
           <w:szCs w:val="18"/>
           <w:vertAlign w:val="superscript"/>
@@ -8120,10 +8184,10 @@
       </w:r>
       <w:r>
         <w:rPr>
-          <w:rStyle w:val="FootnoteReference"/>
-          <w:rFonts w:cs="Inter" w:ascii="Inter" w:hAnsi="Inter"/>
+          <w:rFonts w:ascii="Inter" w:hAnsi="Inter" w:cs="Inter"/>
           <w:b/>
           <w:color w:val="3092B1"/>
+          <w:position w:val="8"/>
           <w:sz w:val="18"/>
           <w:szCs w:val="18"/>
           <w:vertAlign w:val="superscript"/>
@@ -8754,10 +8818,10 @@
       </w:r>
       <w:r>
         <w:rPr>
-          <w:rStyle w:val="FootnoteReference"/>
-          <w:rFonts w:cs="Inter" w:ascii="Inter" w:hAnsi="Inter"/>
+          <w:rFonts w:ascii="Inter" w:hAnsi="Inter" w:cs="Inter"/>
           <w:b/>
           <w:color w:val="3092B1"/>
+          <w:position w:val="8"/>
           <w:sz w:val="18"/>
           <w:szCs w:val="18"/>
           <w:vertAlign w:val="superscript"/>
@@ -8798,10 +8862,10 @@
       </w:r>
       <w:r>
         <w:rPr>
-          <w:rStyle w:val="FootnoteReference"/>
-          <w:rFonts w:cs="Inter" w:ascii="Inter" w:hAnsi="Inter"/>
+          <w:rFonts w:ascii="Inter" w:hAnsi="Inter" w:cs="Inter"/>
           <w:b/>
           <w:color w:val="3092B1"/>
+          <w:position w:val="8"/>
           <w:sz w:val="18"/>
           <w:szCs w:val="18"/>
           <w:vertAlign w:val="superscript"/>
@@ -8825,10 +8889,10 @@
       </w:r>
       <w:r>
         <w:rPr>
-          <w:rStyle w:val="FootnoteReference"/>
-          <w:rFonts w:cs="Inter" w:ascii="Inter" w:hAnsi="Inter"/>
+          <w:rFonts w:ascii="Inter" w:hAnsi="Inter" w:cs="Inter"/>
           <w:b/>
           <w:color w:val="3092B1"/>
+          <w:position w:val="8"/>
           <w:sz w:val="18"/>
           <w:szCs w:val="18"/>
           <w:vertAlign w:val="superscript"/>
@@ -9038,10 +9102,10 @@
       </w:r>
       <w:r>
         <w:rPr>
-          <w:rStyle w:val="FootnoteReference"/>
-          <w:rFonts w:cs="Inter" w:ascii="Inter" w:hAnsi="Inter"/>
+          <w:rFonts w:ascii="Inter" w:hAnsi="Inter" w:cs="Inter"/>
           <w:b/>
           <w:color w:val="3092B1"/>
+          <w:position w:val="8"/>
           <w:sz w:val="18"/>
           <w:szCs w:val="18"/>
           <w:vertAlign w:val="superscript"/>
@@ -9054,10 +9118,10 @@
       </w:r>
       <w:r>
         <w:rPr>
-          <w:rStyle w:val="FootnoteReference"/>
-          <w:rFonts w:cs="Inter" w:ascii="Inter" w:hAnsi="Inter"/>
+          <w:rFonts w:ascii="Inter" w:hAnsi="Inter" w:cs="Inter"/>
           <w:b/>
           <w:color w:val="3092B1"/>
+          <w:position w:val="8"/>
           <w:sz w:val="18"/>
           <w:szCs w:val="18"/>
           <w:vertAlign w:val="superscript"/>
@@ -9095,10 +9159,10 @@
       </w:r>
       <w:r>
         <w:rPr>
-          <w:rStyle w:val="FootnoteReference"/>
-          <w:rFonts w:cs="Inter" w:ascii="Inter" w:hAnsi="Inter"/>
+          <w:rFonts w:ascii="Inter" w:hAnsi="Inter" w:cs="Inter"/>
           <w:b/>
           <w:color w:val="3092B1"/>
+          <w:position w:val="8"/>
           <w:sz w:val="18"/>
           <w:szCs w:val="18"/>
           <w:vertAlign w:val="superscript"/>
@@ -9154,10 +9218,10 @@
       </w:r>
       <w:r>
         <w:rPr>
-          <w:rStyle w:val="FootnoteReference"/>
-          <w:rFonts w:cs="Inter" w:ascii="Inter" w:hAnsi="Inter"/>
+          <w:rFonts w:ascii="Inter" w:hAnsi="Inter" w:cs="Inter"/>
           <w:b/>
           <w:color w:val="3092B1"/>
+          <w:position w:val="8"/>
           <w:sz w:val="18"/>
           <w:szCs w:val="18"/>
           <w:vertAlign w:val="superscript"/>
@@ -9373,10 +9437,10 @@
       </w:r>
       <w:r>
         <w:rPr>
-          <w:rStyle w:val="FootnoteReference"/>
-          <w:rFonts w:cs="Inter" w:ascii="Inter" w:hAnsi="Inter"/>
+          <w:rFonts w:ascii="Inter" w:hAnsi="Inter" w:cs="Inter"/>
           <w:b/>
           <w:color w:val="3092B1"/>
+          <w:position w:val="8"/>
           <w:sz w:val="18"/>
           <w:szCs w:val="18"/>
           <w:vertAlign w:val="superscript"/>
@@ -9436,10 +9500,10 @@
       </w:r>
       <w:r>
         <w:rPr>
-          <w:rStyle w:val="FootnoteReference"/>
-          <w:rFonts w:cs="Inter" w:ascii="Inter" w:hAnsi="Inter"/>
+          <w:rFonts w:ascii="Inter" w:hAnsi="Inter" w:cs="Inter"/>
           <w:b/>
           <w:color w:val="3092B1"/>
+          <w:position w:val="8"/>
           <w:sz w:val="18"/>
           <w:szCs w:val="18"/>
           <w:vertAlign w:val="superscript"/>
@@ -9469,10 +9533,10 @@
       </w:r>
       <w:r>
         <w:rPr>
-          <w:rStyle w:val="FootnoteReference"/>
-          <w:rFonts w:cs="Inter" w:ascii="Inter" w:hAnsi="Inter"/>
+          <w:rFonts w:ascii="Inter" w:hAnsi="Inter" w:cs="Inter"/>
           <w:b/>
           <w:color w:val="3092B1"/>
+          <w:position w:val="8"/>
           <w:sz w:val="18"/>
           <w:szCs w:val="18"/>
           <w:vertAlign w:val="superscript"/>
@@ -9525,10 +9589,10 @@
       </w:r>
       <w:r>
         <w:rPr>
-          <w:rStyle w:val="FootnoteReference"/>
-          <w:rFonts w:cs="Inter" w:ascii="Inter" w:hAnsi="Inter"/>
+          <w:rFonts w:ascii="Inter" w:hAnsi="Inter" w:cs="Inter"/>
           <w:b/>
           <w:color w:val="3092B1"/>
+          <w:position w:val="8"/>
           <w:sz w:val="18"/>
           <w:szCs w:val="18"/>
           <w:vertAlign w:val="superscript"/>
@@ -9580,10 +9644,10 @@
       </w:r>
       <w:r>
         <w:rPr>
-          <w:rStyle w:val="FootnoteReference"/>
-          <w:rFonts w:cs="Inter" w:ascii="Inter" w:hAnsi="Inter"/>
+          <w:rFonts w:ascii="Inter" w:hAnsi="Inter" w:cs="Inter"/>
           <w:b/>
           <w:color w:val="3092B1"/>
+          <w:position w:val="8"/>
           <w:sz w:val="18"/>
           <w:szCs w:val="18"/>
           <w:vertAlign w:val="superscript"/>
@@ -9624,10 +9688,10 @@
       </w:r>
       <w:r>
         <w:rPr>
-          <w:rStyle w:val="FootnoteReference"/>
-          <w:rFonts w:cs="Inter" w:ascii="Inter" w:hAnsi="Inter"/>
+          <w:rFonts w:ascii="Inter" w:hAnsi="Inter" w:cs="Inter"/>
           <w:b/>
           <w:color w:val="3092B1"/>
+          <w:position w:val="8"/>
           <w:sz w:val="18"/>
           <w:szCs w:val="18"/>
           <w:vertAlign w:val="superscript"/>
@@ -9646,10 +9710,10 @@
       </w:r>
       <w:r>
         <w:rPr>
-          <w:rStyle w:val="FootnoteReference"/>
-          <w:rFonts w:cs="Inter" w:ascii="Inter" w:hAnsi="Inter"/>
+          <w:rFonts w:ascii="Inter" w:hAnsi="Inter" w:cs="Inter"/>
           <w:b/>
           <w:color w:val="3092B1"/>
+          <w:position w:val="8"/>
           <w:sz w:val="18"/>
           <w:szCs w:val="18"/>
           <w:vertAlign w:val="superscript"/>
@@ -9918,10 +9982,10 @@
       </w:r>
       <w:r>
         <w:rPr>
-          <w:rStyle w:val="FootnoteReference"/>
-          <w:rFonts w:cs="Inter" w:ascii="Inter" w:hAnsi="Inter"/>
+          <w:rFonts w:ascii="Inter" w:hAnsi="Inter" w:cs="Inter"/>
           <w:b/>
           <w:color w:val="3092B1"/>
+          <w:position w:val="8"/>
           <w:sz w:val="18"/>
           <w:szCs w:val="18"/>
           <w:vertAlign w:val="superscript"/>
@@ -10088,10 +10152,10 @@
       </w:r>
       <w:r>
         <w:rPr>
-          <w:rStyle w:val="FootnoteReference"/>
-          <w:rFonts w:cs="Inter" w:ascii="Inter" w:hAnsi="Inter"/>
+          <w:rFonts w:ascii="Inter" w:hAnsi="Inter" w:cs="Inter"/>
           <w:b/>
           <w:color w:val="3092B1"/>
+          <w:position w:val="8"/>
           <w:sz w:val="18"/>
           <w:szCs w:val="18"/>
           <w:vertAlign w:val="superscript"/>
@@ -10114,10 +10178,10 @@
       </w:r>
       <w:r>
         <w:rPr>
-          <w:rStyle w:val="FootnoteReference"/>
-          <w:rFonts w:cs="Inter" w:ascii="Inter" w:hAnsi="Inter"/>
+          <w:rFonts w:ascii="Inter" w:hAnsi="Inter" w:cs="Inter"/>
           <w:b/>
           <w:color w:val="3092B1"/>
+          <w:position w:val="8"/>
           <w:sz w:val="18"/>
           <w:szCs w:val="18"/>
           <w:vertAlign w:val="superscript"/>
@@ -10424,10 +10488,10 @@
       </w:r>
       <w:r>
         <w:rPr>
-          <w:rStyle w:val="FootnoteReference"/>
-          <w:rFonts w:cs="Inter" w:ascii="Inter" w:hAnsi="Inter"/>
+          <w:rFonts w:ascii="Inter" w:hAnsi="Inter" w:cs="Inter"/>
           <w:b/>
           <w:color w:val="3092B1"/>
+          <w:position w:val="8"/>
           <w:sz w:val="18"/>
           <w:szCs w:val="18"/>
           <w:vertAlign w:val="superscript"/>
@@ -10461,10 +10525,10 @@
       </w:r>
       <w:r>
         <w:rPr>
-          <w:rStyle w:val="FootnoteReference"/>
-          <w:rFonts w:cs="Inter" w:ascii="Inter" w:hAnsi="Inter"/>
+          <w:rFonts w:ascii="Inter" w:hAnsi="Inter" w:cs="Inter"/>
           <w:b/>
           <w:color w:val="3092B1"/>
+          <w:position w:val="8"/>
           <w:sz w:val="18"/>
           <w:szCs w:val="18"/>
           <w:vertAlign w:val="superscript"/>
@@ -10506,10 +10570,10 @@
       </w:r>
       <w:r>
         <w:rPr>
-          <w:rStyle w:val="FootnoteReference"/>
-          <w:rFonts w:cs="Inter" w:ascii="Inter" w:hAnsi="Inter"/>
+          <w:rFonts w:ascii="Inter" w:hAnsi="Inter" w:cs="Inter"/>
           <w:b/>
           <w:color w:val="3092B1"/>
+          <w:position w:val="8"/>
           <w:sz w:val="18"/>
           <w:szCs w:val="18"/>
           <w:vertAlign w:val="superscript"/>
@@ -10543,10 +10607,10 @@
       </w:r>
       <w:r>
         <w:rPr>
-          <w:rStyle w:val="FootnoteReference"/>
-          <w:rFonts w:cs="Inter" w:ascii="Inter" w:hAnsi="Inter"/>
+          <w:rFonts w:ascii="Inter" w:hAnsi="Inter" w:cs="Inter"/>
           <w:b/>
           <w:color w:val="3092B1"/>
+          <w:position w:val="8"/>
           <w:sz w:val="18"/>
           <w:szCs w:val="18"/>
           <w:vertAlign w:val="superscript"/>
@@ -10609,10 +10673,10 @@
       </w:r>
       <w:r>
         <w:rPr>
-          <w:rStyle w:val="FootnoteReference"/>
-          <w:rFonts w:cs="Inter" w:ascii="Inter" w:hAnsi="Inter"/>
+          <w:rFonts w:ascii="Inter" w:hAnsi="Inter" w:cs="Inter"/>
           <w:b/>
           <w:color w:val="3092B1"/>
+          <w:position w:val="8"/>
           <w:sz w:val="18"/>
           <w:szCs w:val="18"/>
           <w:vertAlign w:val="superscript"/>
@@ -10636,10 +10700,10 @@
       </w:r>
       <w:r>
         <w:rPr>
-          <w:rStyle w:val="FootnoteReference"/>
-          <w:rFonts w:cs="Inter" w:ascii="Inter" w:hAnsi="Inter"/>
+          <w:rFonts w:ascii="Inter" w:hAnsi="Inter" w:cs="Inter"/>
           <w:b/>
           <w:color w:val="3092B1"/>
+          <w:position w:val="8"/>
           <w:sz w:val="18"/>
           <w:szCs w:val="18"/>
           <w:vertAlign w:val="superscript"/>
@@ -10701,10 +10765,10 @@
       </w:r>
       <w:r>
         <w:rPr>
-          <w:rStyle w:val="FootnoteReference"/>
-          <w:rFonts w:cs="Inter" w:ascii="Inter" w:hAnsi="Inter"/>
+          <w:rFonts w:ascii="Inter" w:hAnsi="Inter" w:cs="Inter"/>
           <w:b/>
           <w:color w:val="3092B1"/>
+          <w:position w:val="8"/>
           <w:sz w:val="18"/>
           <w:szCs w:val="18"/>
           <w:vertAlign w:val="superscript"/>
@@ -10761,10 +10825,10 @@
       </w:r>
       <w:r>
         <w:rPr>
-          <w:rStyle w:val="FootnoteReference"/>
-          <w:rFonts w:cs="Inter" w:ascii="Inter" w:hAnsi="Inter"/>
+          <w:rFonts w:ascii="Inter" w:hAnsi="Inter" w:cs="Inter"/>
           <w:b/>
           <w:color w:val="3092B1"/>
+          <w:position w:val="8"/>
           <w:sz w:val="18"/>
           <w:szCs w:val="18"/>
           <w:vertAlign w:val="superscript"/>
@@ -10794,10 +10858,10 @@
       </w:r>
       <w:r>
         <w:rPr>
-          <w:rStyle w:val="FootnoteReference"/>
-          <w:rFonts w:cs="Inter" w:ascii="Inter" w:hAnsi="Inter"/>
+          <w:rFonts w:ascii="Inter" w:hAnsi="Inter" w:cs="Inter"/>
           <w:b/>
           <w:color w:val="3092B1"/>
+          <w:position w:val="8"/>
           <w:sz w:val="18"/>
           <w:szCs w:val="18"/>
           <w:vertAlign w:val="superscript"/>
@@ -10888,10 +10952,10 @@
       </w:r>
       <w:r>
         <w:rPr>
-          <w:rStyle w:val="FootnoteReference"/>
-          <w:rFonts w:cs="Inter" w:ascii="Inter" w:hAnsi="Inter"/>
+          <w:rFonts w:ascii="Inter" w:hAnsi="Inter" w:cs="Inter"/>
           <w:b/>
           <w:color w:val="3092B1"/>
+          <w:position w:val="8"/>
           <w:sz w:val="18"/>
           <w:szCs w:val="18"/>
           <w:vertAlign w:val="superscript"/>
@@ -11247,10 +11311,10 @@
       </w:r>
       <w:r>
         <w:rPr>
-          <w:rStyle w:val="FootnoteReference"/>
-          <w:rFonts w:cs="Inter" w:ascii="Inter" w:hAnsi="Inter"/>
+          <w:rFonts w:ascii="Inter" w:hAnsi="Inter" w:cs="Inter"/>
           <w:b/>
           <w:color w:val="3092B1"/>
+          <w:position w:val="8"/>
           <w:sz w:val="18"/>
           <w:szCs w:val="18"/>
           <w:vertAlign w:val="superscript"/>
@@ -11292,10 +11356,10 @@
       </w:r>
       <w:r>
         <w:rPr>
-          <w:rStyle w:val="FootnoteReference"/>
-          <w:rFonts w:cs="Inter" w:ascii="Inter" w:hAnsi="Inter"/>
+          <w:rFonts w:ascii="Inter" w:hAnsi="Inter" w:cs="Inter"/>
           <w:b/>
           <w:color w:val="3092B1"/>
+          <w:position w:val="8"/>
           <w:sz w:val="18"/>
           <w:szCs w:val="18"/>
           <w:vertAlign w:val="superscript"/>
@@ -11461,10 +11525,10 @@
       </w:r>
       <w:r>
         <w:rPr>
-          <w:rStyle w:val="FootnoteReference"/>
-          <w:rFonts w:cs="Inter" w:ascii="Inter" w:hAnsi="Inter"/>
+          <w:rFonts w:ascii="Inter" w:hAnsi="Inter" w:cs="Inter"/>
           <w:b/>
           <w:color w:val="3092B1"/>
+          <w:position w:val="8"/>
           <w:sz w:val="18"/>
           <w:szCs w:val="18"/>
           <w:vertAlign w:val="superscript"/>
@@ -11613,10 +11677,10 @@
       </w:r>
       <w:r>
         <w:rPr>
-          <w:rStyle w:val="FootnoteReference"/>
-          <w:rFonts w:cs="Inter" w:ascii="Inter" w:hAnsi="Inter"/>
+          <w:rFonts w:ascii="Inter" w:hAnsi="Inter" w:cs="Inter"/>
           <w:b/>
           <w:color w:val="3092B1"/>
+          <w:position w:val="8"/>
           <w:sz w:val="18"/>
           <w:szCs w:val="18"/>
           <w:vertAlign w:val="superscript"/>
@@ -11985,10 +12049,10 @@
       </w:r>
       <w:r>
         <w:rPr>
-          <w:rStyle w:val="FootnoteReference"/>
-          <w:rFonts w:cs="Inter" w:ascii="Inter" w:hAnsi="Inter"/>
+          <w:rFonts w:ascii="Inter" w:hAnsi="Inter" w:cs="Inter"/>
           <w:b/>
           <w:color w:val="3092B1"/>
+          <w:position w:val="8"/>
           <w:sz w:val="18"/>
           <w:szCs w:val="18"/>
           <w:vertAlign w:val="superscript"/>
@@ -12318,15 +12382,13 @@
             </w:r>
             <w:r>
               <w:rPr>
-                <w:rStyle w:val="FootnoteReference"/>
-                <w:rFonts w:eastAsia="ＭＳ 明朝" w:cs="Inter" w:ascii="Inter" w:hAnsi="Inter"/>
+                <w:rFonts w:ascii="Inter" w:hAnsi="Inter" w:cs="Inter"/>
                 <w:b/>
                 <w:color w:val="3092B1"/>
-                <w:kern w:val="0"/>
+                <w:position w:val="8"/>
                 <w:sz w:val="18"/>
                 <w:szCs w:val="18"/>
                 <w:vertAlign w:val="superscript"/>
-                <w:lang w:val="en-US" w:eastAsia="en-US" w:bidi="ar-SA"/>
               </w:rPr>
               <w:footnoteReference w:id="94"/>
             </w:r>
@@ -12422,15 +12484,13 @@
             </w:r>
             <w:r>
               <w:rPr>
-                <w:rStyle w:val="FootnoteReference"/>
-                <w:rFonts w:eastAsia="ＭＳ 明朝" w:cs="Inter" w:ascii="Inter" w:hAnsi="Inter"/>
+                <w:rFonts w:ascii="Inter" w:hAnsi="Inter" w:cs="Inter"/>
                 <w:b/>
                 <w:color w:val="3092B1"/>
-                <w:kern w:val="0"/>
+                <w:position w:val="8"/>
                 <w:sz w:val="18"/>
                 <w:szCs w:val="18"/>
                 <w:vertAlign w:val="superscript"/>
-                <w:lang w:val="en-US" w:eastAsia="en-US" w:bidi="ar-SA"/>
               </w:rPr>
               <w:footnoteReference w:id="95"/>
             </w:r>
@@ -12526,15 +12586,13 @@
             </w:r>
             <w:r>
               <w:rPr>
-                <w:rStyle w:val="FootnoteReference"/>
-                <w:rFonts w:eastAsia="ＭＳ 明朝" w:cs="Inter" w:ascii="Inter" w:hAnsi="Inter"/>
+                <w:rFonts w:ascii="Inter" w:hAnsi="Inter" w:cs="Inter"/>
                 <w:b/>
                 <w:color w:val="3092B1"/>
-                <w:kern w:val="0"/>
+                <w:position w:val="8"/>
                 <w:sz w:val="18"/>
                 <w:szCs w:val="18"/>
                 <w:vertAlign w:val="superscript"/>
-                <w:lang w:val="en-US" w:eastAsia="en-US" w:bidi="ar-SA"/>
               </w:rPr>
               <w:footnoteReference w:id="96"/>
             </w:r>
@@ -12630,15 +12688,13 @@
             </w:r>
             <w:r>
               <w:rPr>
-                <w:rStyle w:val="FootnoteReference"/>
-                <w:rFonts w:eastAsia="ＭＳ 明朝" w:cs="Inter" w:ascii="Inter" w:hAnsi="Inter"/>
+                <w:rFonts w:ascii="Inter" w:hAnsi="Inter" w:cs="Inter"/>
                 <w:b/>
                 <w:color w:val="3092B1"/>
-                <w:kern w:val="0"/>
+                <w:position w:val="8"/>
                 <w:sz w:val="18"/>
                 <w:szCs w:val="18"/>
                 <w:vertAlign w:val="superscript"/>
-                <w:lang w:val="en-US" w:eastAsia="en-US" w:bidi="ar-SA"/>
               </w:rPr>
               <w:footnoteReference w:id="97"/>
             </w:r>
@@ -12734,15 +12790,13 @@
             </w:r>
             <w:r>
               <w:rPr>
-                <w:rStyle w:val="FootnoteReference"/>
-                <w:rFonts w:eastAsia="ＭＳ 明朝" w:cs="Inter" w:ascii="Inter" w:hAnsi="Inter"/>
+                <w:rFonts w:ascii="Inter" w:hAnsi="Inter" w:cs="Inter"/>
                 <w:b/>
                 <w:color w:val="3092B1"/>
-                <w:kern w:val="0"/>
+                <w:position w:val="8"/>
                 <w:sz w:val="18"/>
                 <w:szCs w:val="18"/>
                 <w:vertAlign w:val="superscript"/>
-                <w:lang w:val="en-US" w:eastAsia="en-US" w:bidi="ar-SA"/>
               </w:rPr>
               <w:footnoteReference w:id="98"/>
             </w:r>
@@ -12838,15 +12892,13 @@
             </w:r>
             <w:r>
               <w:rPr>
-                <w:rStyle w:val="FootnoteReference"/>
-                <w:rFonts w:eastAsia="ＭＳ 明朝" w:cs="Inter" w:ascii="Inter" w:hAnsi="Inter"/>
+                <w:rFonts w:ascii="Inter" w:hAnsi="Inter" w:cs="Inter"/>
                 <w:b/>
                 <w:color w:val="3092B1"/>
-                <w:kern w:val="0"/>
+                <w:position w:val="8"/>
                 <w:sz w:val="18"/>
                 <w:szCs w:val="18"/>
                 <w:vertAlign w:val="superscript"/>
-                <w:lang w:val="en-US" w:eastAsia="en-US" w:bidi="ar-SA"/>
               </w:rPr>
               <w:footnoteReference w:id="99"/>
             </w:r>
@@ -12942,15 +12994,13 @@
             </w:r>
             <w:r>
               <w:rPr>
-                <w:rStyle w:val="FootnoteReference"/>
-                <w:rFonts w:eastAsia="ＭＳ 明朝" w:cs="Inter" w:ascii="Inter" w:hAnsi="Inter"/>
+                <w:rFonts w:ascii="Inter" w:hAnsi="Inter" w:cs="Inter"/>
                 <w:b/>
                 <w:color w:val="3092B1"/>
-                <w:kern w:val="0"/>
+                <w:position w:val="8"/>
                 <w:sz w:val="18"/>
                 <w:szCs w:val="18"/>
                 <w:vertAlign w:val="superscript"/>
-                <w:lang w:val="en-US" w:eastAsia="en-US" w:bidi="ar-SA"/>
               </w:rPr>
               <w:footnoteReference w:id="100"/>
             </w:r>
@@ -13046,15 +13096,13 @@
             </w:r>
             <w:r>
               <w:rPr>
-                <w:rStyle w:val="FootnoteReference"/>
-                <w:rFonts w:eastAsia="ＭＳ 明朝" w:cs="Inter" w:ascii="Inter" w:hAnsi="Inter"/>
+                <w:rFonts w:ascii="Inter" w:hAnsi="Inter" w:cs="Inter"/>
                 <w:b/>
                 <w:color w:val="3092B1"/>
-                <w:kern w:val="0"/>
+                <w:position w:val="8"/>
                 <w:sz w:val="18"/>
                 <w:szCs w:val="18"/>
                 <w:vertAlign w:val="superscript"/>
-                <w:lang w:val="en-US" w:eastAsia="en-US" w:bidi="ar-SA"/>
               </w:rPr>
               <w:footnoteReference w:id="101"/>
             </w:r>
@@ -13240,15 +13288,13 @@
             </w:r>
             <w:r>
               <w:rPr>
-                <w:rStyle w:val="FootnoteReference"/>
-                <w:rFonts w:eastAsia="ＭＳ 明朝" w:cs="Inter" w:ascii="Inter" w:hAnsi="Inter"/>
+                <w:rFonts w:ascii="Inter" w:hAnsi="Inter" w:cs="Inter"/>
                 <w:b/>
                 <w:color w:val="3092B1"/>
-                <w:kern w:val="0"/>
+                <w:position w:val="8"/>
                 <w:sz w:val="18"/>
                 <w:szCs w:val="18"/>
                 <w:vertAlign w:val="superscript"/>
-                <w:lang w:val="en-US" w:eastAsia="en-US" w:bidi="ar-SA"/>
               </w:rPr>
               <w:footnoteReference w:id="102"/>
             </w:r>
@@ -13735,15 +13781,13 @@
             </w:r>
             <w:r>
               <w:rPr>
-                <w:rStyle w:val="FootnoteReference"/>
-                <w:rFonts w:eastAsia="ＭＳ 明朝" w:cs="Inter" w:ascii="Inter" w:hAnsi="Inter"/>
+                <w:rFonts w:ascii="Inter" w:hAnsi="Inter" w:cs="Inter"/>
                 <w:b/>
                 <w:color w:val="3092B1"/>
-                <w:kern w:val="0"/>
+                <w:position w:val="8"/>
                 <w:sz w:val="18"/>
                 <w:szCs w:val="18"/>
                 <w:vertAlign w:val="superscript"/>
-                <w:lang w:val="en-US" w:eastAsia="en-US" w:bidi="ar-SA"/>
               </w:rPr>
               <w:footnoteReference w:id="103"/>
             </w:r>
@@ -13850,15 +13894,13 @@
             </w:r>
             <w:r>
               <w:rPr>
-                <w:rStyle w:val="FootnoteReference"/>
-                <w:rFonts w:eastAsia="ＭＳ 明朝" w:cs="Inter" w:ascii="Inter" w:hAnsi="Inter"/>
+                <w:rFonts w:ascii="Inter" w:hAnsi="Inter" w:cs="Inter"/>
                 <w:b/>
                 <w:color w:val="3092B1"/>
-                <w:kern w:val="0"/>
+                <w:position w:val="8"/>
                 <w:sz w:val="18"/>
                 <w:szCs w:val="18"/>
                 <w:vertAlign w:val="superscript"/>
-                <w:lang w:val="en-US" w:eastAsia="en-US" w:bidi="ar-SA"/>
               </w:rPr>
               <w:footnoteReference w:id="104"/>
             </w:r>
@@ -13965,15 +14007,13 @@
             </w:r>
             <w:r>
               <w:rPr>
-                <w:rStyle w:val="FootnoteReference"/>
-                <w:rFonts w:eastAsia="ＭＳ 明朝" w:cs="Inter" w:ascii="Inter" w:hAnsi="Inter"/>
+                <w:rFonts w:ascii="Inter" w:hAnsi="Inter" w:cs="Inter"/>
                 <w:b/>
                 <w:color w:val="3092B1"/>
-                <w:kern w:val="0"/>
+                <w:position w:val="8"/>
                 <w:sz w:val="18"/>
                 <w:szCs w:val="18"/>
                 <w:vertAlign w:val="superscript"/>
-                <w:lang w:val="en-US" w:eastAsia="en-US" w:bidi="ar-SA"/>
               </w:rPr>
               <w:footnoteReference w:id="105"/>
             </w:r>
@@ -14080,15 +14120,13 @@
             </w:r>
             <w:r>
               <w:rPr>
-                <w:rStyle w:val="FootnoteReference"/>
-                <w:rFonts w:eastAsia="ＭＳ 明朝" w:cs="Inter" w:ascii="Inter" w:hAnsi="Inter"/>
+                <w:rFonts w:ascii="Inter" w:hAnsi="Inter" w:cs="Inter"/>
                 <w:b/>
                 <w:color w:val="3092B1"/>
-                <w:kern w:val="0"/>
+                <w:position w:val="8"/>
                 <w:sz w:val="18"/>
                 <w:szCs w:val="18"/>
                 <w:vertAlign w:val="superscript"/>
-                <w:lang w:val="en-US" w:eastAsia="en-US" w:bidi="ar-SA"/>
               </w:rPr>
               <w:footnoteReference w:id="106"/>
             </w:r>
@@ -14790,15 +14828,13 @@
             </w:r>
             <w:r>
               <w:rPr>
-                <w:rStyle w:val="FootnoteReference"/>
-                <w:rFonts w:eastAsia="ＭＳ 明朝" w:cs="Inter" w:ascii="Inter" w:hAnsi="Inter"/>
+                <w:rFonts w:ascii="Inter" w:hAnsi="Inter" w:cs="Inter"/>
                 <w:b/>
                 <w:color w:val="3092B1"/>
-                <w:kern w:val="0"/>
+                <w:position w:val="8"/>
                 <w:sz w:val="18"/>
                 <w:szCs w:val="18"/>
                 <w:vertAlign w:val="superscript"/>
-                <w:lang w:val="en-US" w:eastAsia="en-US" w:bidi="ar-SA"/>
               </w:rPr>
               <w:footnoteReference w:id="107"/>
             </w:r>
@@ -14894,15 +14930,13 @@
             </w:r>
             <w:r>
               <w:rPr>
-                <w:rStyle w:val="FootnoteReference"/>
-                <w:rFonts w:eastAsia="ＭＳ 明朝" w:cs="Inter" w:ascii="Inter" w:hAnsi="Inter"/>
+                <w:rFonts w:ascii="Inter" w:hAnsi="Inter" w:cs="Inter"/>
                 <w:b/>
                 <w:color w:val="3092B1"/>
-                <w:kern w:val="0"/>
+                <w:position w:val="8"/>
                 <w:sz w:val="18"/>
                 <w:szCs w:val="18"/>
                 <w:vertAlign w:val="superscript"/>
-                <w:lang w:val="en-US" w:eastAsia="en-US" w:bidi="ar-SA"/>
               </w:rPr>
               <w:footnoteReference w:id="108"/>
             </w:r>
@@ -15009,15 +15043,13 @@
             </w:r>
             <w:r>
               <w:rPr>
-                <w:rStyle w:val="FootnoteReference"/>
-                <w:rFonts w:eastAsia="ＭＳ 明朝" w:cs="Inter" w:ascii="Inter" w:hAnsi="Inter"/>
+                <w:rFonts w:ascii="Inter" w:hAnsi="Inter" w:cs="Inter"/>
                 <w:b/>
                 <w:color w:val="3092B1"/>
-                <w:kern w:val="0"/>
+                <w:position w:val="8"/>
                 <w:sz w:val="18"/>
                 <w:szCs w:val="18"/>
                 <w:vertAlign w:val="superscript"/>
-                <w:lang w:val="en-US" w:eastAsia="en-US" w:bidi="ar-SA"/>
               </w:rPr>
               <w:footnoteReference w:id="109"/>
             </w:r>
@@ -15124,15 +15156,13 @@
             </w:r>
             <w:r>
               <w:rPr>
-                <w:rStyle w:val="FootnoteReference"/>
-                <w:rFonts w:eastAsia="ＭＳ 明朝" w:cs="Inter" w:ascii="Inter" w:hAnsi="Inter"/>
+                <w:rFonts w:ascii="Inter" w:hAnsi="Inter" w:cs="Inter"/>
                 <w:b/>
                 <w:color w:val="3092B1"/>
-                <w:kern w:val="0"/>
+                <w:position w:val="8"/>
                 <w:sz w:val="18"/>
                 <w:szCs w:val="18"/>
                 <w:vertAlign w:val="superscript"/>
-                <w:lang w:val="en-US" w:eastAsia="en-US" w:bidi="ar-SA"/>
               </w:rPr>
               <w:footnoteReference w:id="110"/>
             </w:r>
@@ -15228,15 +15258,13 @@
             </w:r>
             <w:r>
               <w:rPr>
-                <w:rStyle w:val="FootnoteReference"/>
-                <w:rFonts w:eastAsia="ＭＳ 明朝" w:cs="Inter" w:ascii="Inter" w:hAnsi="Inter"/>
+                <w:rFonts w:ascii="Inter" w:hAnsi="Inter" w:cs="Inter"/>
                 <w:b/>
                 <w:color w:val="3092B1"/>
-                <w:kern w:val="0"/>
+                <w:position w:val="8"/>
                 <w:sz w:val="18"/>
                 <w:szCs w:val="18"/>
                 <w:vertAlign w:val="superscript"/>
-                <w:lang w:val="en-US" w:eastAsia="en-US" w:bidi="ar-SA"/>
               </w:rPr>
               <w:footnoteReference w:id="111"/>
             </w:r>

</xml_diff>

<commit_message>
Polish gas-tax wording and rebuild artefacts
</commit_message>
<xml_diff>
--- a/final/report.docx
+++ b/final/report.docx
@@ -53,14 +53,14 @@
       </w:pPr>
       <w:r>
         <w:rPr/>
-        <w:t xml:space="preserve">How much does Australia actually collect from its gas exports? And what does that look like next to a beer, a HECS debt, a Norwegian sovereign wealth fund, or the choices in the current Commonwealth Budget? </w:t>
+        <w:t xml:space="preserve">How much does Australia actually collect from its gas exports? And what does that look like compared with beer excise, HECS debt, a Norwegian sovereign wealth fund, and choices in the current Commonwealth Budget? </w:t>
       </w:r>
       <w:r>
         <w:rPr>
           <w:b/>
           <w:bCs/>
         </w:rPr>
-        <w:t>The short answer: less than the country collects from beer; about a tenth of what Norway collects per tonne; and roughly A$17 billion a year less than a 25 per cent export tax would raise — a sum roughly equal to annual Child Care Subsidy spending and more than half the 2026-27 underlying cash deficit.</w:t>
+        <w:t>The short answer: less than the country collects from beer; about a tenth of what Norway collects per tonne; and roughly A$17 billion a year less than a 25 per cent export tax would raise. That sum is roughly equal to annual Child Care Subsidy spending and more than half the 2026-27 underlying cash deficit.</w:t>
       </w:r>
     </w:p>
     <w:p>
@@ -166,7 +166,7 @@
       </w:hyperlink>
       <w:r>
         <w:rPr/>
-        <w:t>. Open it in any browser, share it as a link.</w:t>
+        <w:t>. It opens in any browser and can be shared as a link.</w:t>
       </w:r>
     </w:p>
     <w:p>
@@ -334,6 +334,23 @@
       <w:r>
         <w:rPr/>
         <w:t xml:space="preserve"> Public audit materials include the source manuscript, numerical manifest, chart scripts, rendered charts, source dossiers, and primary-source footnotes. The author is responsible for every numerical claim, interpretation, and recommendation.</w:t>
+      </w:r>
+    </w:p>
+    <w:p>
+      <w:pPr>
+        <w:pStyle w:val="BodyText"/>
+        <w:rPr/>
+      </w:pPr>
+      <w:r>
+        <w:rPr>
+          <w:b/>
+          <w:bCs/>
+        </w:rPr>
+        <w:t>AI assistance disclosure.</w:t>
+      </w:r>
+      <w:r>
+        <w:rPr/>
+        <w:t xml:space="preserve"> Research review, drafting, code/release checks, and copy-editing used assistance from OpenAI GPT-5.5/Codex, Anthropic Claude Opus 4.7/Claude Code agents, and Google Gemini 3 Flash Preview. The author is responsible for all claims, source interpretation, caveats, calculations, and final wording.</w:t>
       </w:r>
       <w:bookmarkEnd w:id="0"/>
       <w:bookmarkEnd w:id="1"/>
@@ -1247,7 +1264,7 @@
       </w:r>
       <w:r>
         <w:rPr/>
-        <w:t xml:space="preserve"> in 2026-27, the first Budget year after the release of Budget 2026-27. In the same two years, Australia is expected to collect </w:t>
+        <w:t xml:space="preserve"> in 2026-27, the 2026-27 Budget year in the new papers. In the same two years, Australia is expected to collect </w:t>
       </w:r>
       <w:r>
         <w:rPr>
@@ -1329,7 +1346,7 @@
       </w:pPr>
       <w:r>
         <w:rPr/>
-        <w:t>It is also, deliberately, a fair-minded steelmanning of the industry’s defence — back-loading by design, A$300+ billion of capital expenditure (capex), oil-indexed long-term contracts — followed by an honest critique of what stands and what does not. The 2023 PRRT deductions cap, which Treasury forecast would raise A$2.4 billion over the forward estimates, was outweighed by oil-price and FX parameter revisions at MYEFO 2023-24 (PRRT receipts revised down A$0.8 bn for 2023-24 and A$2.4 bn over the four years to 2026-27), with FY2023-24 and FY2024-25 outcomes both A$1.2–1.3 bn below the May 2023 forecast.</w:t>
+        <w:t>It also sets out the strongest version of the industry’s defence — back-loading by design, A$300+ billion of capital expenditure (capex), oil-indexed long-term contracts — followed by an honest critique of what stands and what does not. The 2023 PRRT deductions cap, which Treasury forecast would raise A$2.4 billion over the forward estimates, was outweighed by oil-price and FX parameter revisions at MYEFO 2023-24 (PRRT receipts revised down A$0.8 bn for 2023-24 and A$2.4 bn over the four years to 2026-27), with FY2023-24 and FY2024-25 outcomes both A$1.2–1.3 bn below the May 2023 forecast.</w:t>
       </w:r>
       <w:r>
         <w:rPr>
@@ -2391,7 +2408,7 @@
           <w:i/>
           <w:iCs/>
         </w:rPr>
-        <w:t>Figure 1. PRRT cash receipts did not rise with the LNG boom. The 2022-23 spike was a Russian-invasion oil-price event, not structural reform. Budget 2026-27 lifts the 2026-27 estimate to A$1.90 billion on higher oil prices and production volumes, then has receipts fading to A$1.25 billion by 2029-30. Sources: Treasury Final Budget Outcomes FY2010-11 to FY2024-25; Budget Paper 1 2026-27 Statement 5 Table 5.7.</w:t>
+        <w:t>Figure 1. PRRT cash receipts did not rise with the LNG boom. The 2022-23 spike was an oil-price spike following Russia’s invasion of Ukraine, not structural reform. Budget 2026-27 lifts the 2026-27 estimate to A$1.90 billion on higher oil prices and production volumes, then has receipts fading to A$1.25 billion by 2029-30. Sources: Treasury Final Budget Outcomes FY2010-11 to FY2024-25; Budget Paper 1 2026-27 Statement 5 Table 5.7.</w:t>
       </w:r>
     </w:p>
     <w:p>
@@ -2493,7 +2510,7 @@
           <w:i/>
           <w:iCs/>
         </w:rPr>
-        <w:t>Figure 10. Australia’s LNG export volume went from about 19 million tonnes a year in 2010-11 to about 82 million tonnes in 2024-25 — a quadrupling. PRRT cash receipts went sideways. Sources: DISR Resources and Energy Quarterly (LNG volume); Treasury Final Budget Outcomes (PRRT cash receipts).</w:t>
+        <w:t>Figure 10. Australia’s LNG export volume went from about 19 million tonnes a year in 2010-11 to about 82 million tonnes in 2024-25 — a quadrupling. PRRT cash receipts remained broadly flat. Sources: DISR Resources and Energy Quarterly (LNG volume); Treasury Final Budget Outcomes (PRRT cash receipts).</w:t>
       </w:r>
     </w:p>
     <w:p>
@@ -2576,7 +2593,7 @@
       </w:r>
       <w:r>
         <w:rPr/>
-        <w:t xml:space="preserve"> Each year, the unused stock grew with uplift. At LTBR + 15pp for exploration, that stock compounded faster than most reasonable project rates of return. The system was, by design, running away from its own tax base.</w:t>
+        <w:t xml:space="preserve"> Each year, the unused stock grew with uplift. At LTBR + 15pp for exploration, that stock compounded faster than most reasonable project rates of return. By design, the stockpile was growing faster than the tax system could absorb.</w:t>
       </w:r>
     </w:p>
     <w:p>
@@ -5288,7 +5305,7 @@
       </w:r>
       <w:r>
         <w:rPr/>
-        <w:t xml:space="preserve"> — applied to the tiny share of WA gas production in state waters, not Commonwealth waters — raised just A$16 million in 2022-23, A$20 million in 2023-24, A$33 million in 2024-25. Trivial.</w:t>
+        <w:t xml:space="preserve"> — applied to the tiny share of WA gas production in state waters, not Commonwealth waters — raised just A$16 million in 2022-23, A$20 million in 2023-24, A$33 million in 2024-25. In fiscal terms, that is very small.</w:t>
       </w:r>
     </w:p>
     <w:p>
@@ -5355,7 +5372,7 @@
       </w:r>
       <w:r>
         <w:rPr/>
-        <w:t xml:space="preserve"> Royalties were abolished in favour of PRRT. PRRT then proceeded not to collect.</w:t>
+        <w:t xml:space="preserve"> Royalties were abolished in favour of PRRT. PRRT then collected very little from that base.</w:t>
       </w:r>
     </w:p>
     <w:p>
@@ -6106,7 +6123,7 @@
       </w:pPr>
       <w:r>
         <w:rPr/>
-        <w:t>The most damaging comparison Australia loses, however, is not the domestic one. It is the international one. Per tonne of LNG-equivalent exported, Australia is an order-of-magnitude outlier among the world’s major gas exporters.</w:t>
+        <w:t>The sharper comparison, however, is not domestic but international. Per tonne of LNG-equivalent exported, Australia is an order-of-magnitude outlier among the world’s major gas exporters.</w:t>
       </w:r>
     </w:p>
     <w:p>
@@ -6412,7 +6429,7 @@
       </w:pPr>
       <w:r>
         <w:rPr/>
-        <w:t xml:space="preserve">Critically — and this is the part the Australian industry argument usually skips — Norway’s system is </w:t>
+        <w:t xml:space="preserve">Critically — and this is the design point often missing from Australian comparisons — Norway’s system is </w:t>
       </w:r>
       <w:r>
         <w:rPr>
@@ -9498,7 +9515,7 @@
       </w:pPr>
       <w:r>
         <w:rPr/>
-        <w:t xml:space="preserve">This Part steelmans the industry’s published defence of the current fiscal arrangements. Every claim restated below is drawn from a named primary source — Australian Energy Producers media releases and submissions, Wood Mackenzie / KPMG / Deloitte commissioned reports, and on-the-record statements from Woodside, Chevron, and Santos in Senate Estimates Hansard. The strongest available form of each pillar is presented first, with footnoted citations; the critique that follows in §4.6 </w:t>
+        <w:t xml:space="preserve">This Part sets out the industry’s strongest published defence of the current fiscal arrangements. Every claim restated below is drawn from a named primary source — Australian Energy Producers media releases and submissions, Wood Mackenzie / KPMG / Deloitte commissioned reports, and on-the-record statements from Woodside, Chevron, and Santos in Senate Estimates Hansard. The strongest available form of each pillar is presented first, with footnoted citations; the critique that follows in §4.6 </w:t>
       </w:r>
       <w:r>
         <w:rPr>
@@ -9509,7 +9526,7 @@
       </w:r>
       <w:r>
         <w:rPr/>
-        <w:t xml:space="preserve"> engages with what the industry has actually argued — not strawman versions.</w:t>
+        <w:t xml:space="preserve"> engages with what the industry has actually argued — not weaker versions of the argument.</w:t>
       </w:r>
     </w:p>
     <w:p>
@@ -9815,6 +9832,16 @@
       <w:r>
         <w:rPr/>
         <w:t>The Australian oil and gas industry is the second-highest corporate taxpayer in Australia, accounting for one in every ten company tax dollars paid. Samantha McCulloch, CEO, Australian Energy Producers, July 2025 media release</w:t>
+      </w:r>
+    </w:p>
+    <w:p>
+      <w:pPr>
+        <w:pStyle w:val="BodyText"/>
+        <w:rPr/>
+      </w:pPr>
+      <w:r>
+        <w:rPr/>
+        <w:t>Source note: Australian Energy Producers July 2025 media release.</w:t>
       </w:r>
       <w:r>
         <w:rPr>
@@ -10038,7 +10065,7 @@
           <w:b/>
           <w:bCs/>
         </w:rPr>
-        <w:t>The “A$21.9 billion” headline is real but not a rent figure.</w:t>
+        <w:t>The “A$21.9 billion” headline is real, but it is not evidence of rent capture.</w:t>
       </w:r>
       <w:r>
         <w:rPr/>
@@ -12199,7 +12226,7 @@
       </w:pPr>
       <w:r>
         <w:rPr/>
-        <w:t>Australia is the world’s second-largest LNG exporter. It collects more revenue from its citizens’ beer than it does from offshore gas. It collects less per tonne LNG than the United States, less than Malaysia, roughly 15 times less than Qatar, and roughly 10 times less than Norway — an order of magnitude either way on the gas-only attribution that Part 3 lays out. Its sovereign wealth fund balance per citizen is roughly one-fortieth of Norway’s.</w:t>
+        <w:t>Australia is the world’s second-largest LNG exporter. It collects more revenue from its citizens’ beer than it does from offshore gas. It collects less per tonne of LNG than the United States, less than Malaysia, roughly 15 times less than Qatar, and roughly 10 times less than Norway under the gas-only attribution that Part 3 lays out. Its sovereign wealth fund balance per citizen is roughly one-fortieth of Norway’s.</w:t>
       </w:r>
     </w:p>
     <w:p>
@@ -16549,7 +16576,7 @@
     </w:r>
     <w:r>
       <w:rPr/>
-      <w:t>64</w:t>
+      <w:t>69</w:t>
     </w:r>
     <w:r>
       <w:rPr/>
@@ -17165,6 +17192,27 @@
   </w:footnote>
   <w:footnote w:id="17">
     <w:p>
+      <w:r>
+        <w:t xml:space="preserve">Repeated source: Budget Paper 1 2026-27, Statement 5, Table 5.7 “Australian Government general governmen...</w:t>
+      </w:r>
+    </w:p>
+  </w:footnote>
+  <w:footnote w:id="18">
+    <w:p>
+      <w:r>
+        <w:t xml:space="preserve">Repeated source: Australian Energy Producers, “Media release: Australian oil &amp;amp; gas industry delivers...</w:t>
+      </w:r>
+    </w:p>
+  </w:footnote>
+  <w:footnote w:id="19">
+    <w:p>
+      <w:r>
+        <w:t xml:space="preserve">Repeated source: Rod Campbell, Gas industry claims debunked: Tax payment claims in context, Australia In...</w:t>
+      </w:r>
+    </w:p>
+  </w:footnote>
+  <w:footnote w:id="20">
+    <w:p>
       <w:pPr>
         <w:pStyle w:val="FootnoteText"/>
         <w:widowControl/>
@@ -17185,11 +17233,42 @@
       </w:r>
       <w:r>
         <w:rPr/>
-        <w:t>Budget Paper 1 2026-27, Statement 5, Table 5.7 “Australian Government general government (cash) receipts”, p. 208. PRRT estimates: 2025-26 A$1,400m; 2026-27 A$1,900m; 2027-28 A$1,750m; 2028-29 A$1,550m; 2029-30 A$1,250m. Beer excise estimates: 2026-27 A$2,810m; 2029-30 A$3,100m. Direct PDF: https://budget.gov.au/content/bp1/download/bp1_bs-5.pdf</w:t>
+        <w:t xml:space="preserve">Primary sources: ATO Corporate Tax Transparency reports (machine-readable releases at https://data.gov.au/data/dataset/c2524c87-cea4-4636-acac-599a82048a26); Treasury Final Budget Outcome 2023-24 (https://archive.budget.gov.au/2023-24/fbo/download/00_fbo_2023-24.pdf); Queensland Budget 2025-26 Budget Paper 2 (https://budget.qld.gov.au/files/Budget-2025-26-BP2-Revenue.pdf); Australia Institute working papers on Western Australian and Queensland LNG taxation. Full source-by-source primary-URL log and entity-level reconciliation: this repository, </w:t>
+      </w:r>
+      <w:r>
+        <w:rPr>
+          <w:rStyle w:val="VerbatimChar"/>
+        </w:rPr>
+        <w:t>research/02_corporate_tax_and_royalties.md</w:t>
+      </w:r>
+      <w:r>
+        <w:rPr/>
+        <w:t>.</w:t>
       </w:r>
     </w:p>
   </w:footnote>
-  <w:footnote w:id="18">
+  <w:footnote w:id="21">
+    <w:p>
+      <w:r>
+        <w:t xml:space="preserve">Repeated source: Primary sources: ATO Corporate Tax Transparency reports (machine-readable releases at h...</w:t>
+      </w:r>
+    </w:p>
+  </w:footnote>
+  <w:footnote w:id="22">
+    <w:p>
+      <w:r>
+        <w:t xml:space="preserve">Repeated source: Mike Callaghan AM, Petroleum Resource Rent Tax Review: Final Report, Australian Treasur...</w:t>
+      </w:r>
+    </w:p>
+  </w:footnote>
+  <w:footnote w:id="23">
+    <w:p>
+      <w:r>
+        <w:t xml:space="preserve">Repeated source: Primary sources: Treasury Final Budget Outcome reports FY2010-11 to FY2024-25 (archived...</w:t>
+      </w:r>
+    </w:p>
+  </w:footnote>
+  <w:footnote w:id="24">
     <w:p>
       <w:pPr>
         <w:pStyle w:val="FootnoteText"/>
@@ -17211,11 +17290,11 @@
       </w:r>
       <w:r>
         <w:rPr/>
-        <w:t>Australian Energy Producers, “Media release: Australian oil &amp; gas industry delivers record $22 billion in taxes and royalties to government revenues in 2024-25”, 27 July 2025. https://energyproducers.au/news/all_news/media-release-australian-oil-gas-industry-delivers-record-22-billion-in-taxes-and-royalties-to-government-revenues-in-2024-25</w:t>
+        <w:t>Callaghan Review §4.2 on uplift rates: LTBR + 15pp for exploration; LTBR + 5pp for general project expenditure (post-1990).</w:t>
       </w:r>
     </w:p>
   </w:footnote>
-  <w:footnote w:id="19">
+  <w:footnote w:id="25">
     <w:p>
       <w:pPr>
         <w:pStyle w:val="FootnoteText"/>
@@ -17237,22 +17316,11 @@
       </w:r>
       <w:r>
         <w:rPr/>
-        <w:t xml:space="preserve">Rod Campbell, </w:t>
-      </w:r>
-      <w:r>
-        <w:rPr>
-          <w:i/>
-          <w:iCs/>
-        </w:rPr>
-        <w:t>Gas industry claims debunked: Tax payment claims in context</w:t>
-      </w:r>
-      <w:r>
-        <w:rPr/>
-        <w:t>, Australia Institute, May 2024. https://australiainstitute.org.au/wp-content/uploads/2024/06/The-Australia-Institute-Gas-industry-claims-debunked-Web.pdf</w:t>
+        <w:t>Callaghan Review Figure 2.3 “Total deductible expenditure” — series rises from ~A$50 bn in 2002 to ~A$300 bn in 2015-16.</w:t>
       </w:r>
     </w:p>
   </w:footnote>
-  <w:footnote w:id="20">
+  <w:footnote w:id="26">
     <w:p>
       <w:pPr>
         <w:pStyle w:val="FootnoteText"/>
@@ -17274,13 +17342,24 @@
       </w:r>
       <w:r>
         <w:rPr/>
-        <w:t xml:space="preserve">Primary sources: ATO Corporate Tax Transparency reports (machine-readable releases at https://data.gov.au/data/dataset/c2524c87-cea4-4636-acac-599a82048a26); Treasury Final Budget Outcome 2023-24 (https://archive.budget.gov.au/2023-24/fbo/download/00_fbo_2023-24.pdf); Queensland Budget 2025-26 Budget Paper 2 (https://budget.qld.gov.au/files/Budget-2025-26-BP2-Revenue.pdf); Australia Institute working papers on Western Australian and Queensland LNG taxation. Full source-by-source primary-URL log and entity-level reconciliation: this repository, </w:t>
+        <w:t xml:space="preserve">Chevron Australia, </w:t>
+      </w:r>
+      <w:r>
+        <w:rPr>
+          <w:i/>
+          <w:iCs/>
+        </w:rPr>
+        <w:t>Gorgon project overview</w:t>
+      </w:r>
+      <w:r>
+        <w:rPr/>
+        <w:t xml:space="preserve"> (operator project page, https://www.chevron.com/what-we-do/energy/oil-and-natural-gas/assets/gorgon); cost-overrun trajectory (US$37 bn 2009 FID → US$54 bn) triangulated via offshore-energy trade press and Black Ridge Research / Wikipedia project profiles. Operators do not publish a single audited “final project cost” in statutory filings; the figures here are the industry / trade-press triangulation. Full source log: </w:t>
       </w:r>
       <w:r>
         <w:rPr>
           <w:rStyle w:val="VerbatimChar"/>
         </w:rPr>
-        <w:t>research/02_corporate_tax_and_royalties.md</w:t>
+        <w:t>research/05_industry_steelman.md</w:t>
       </w:r>
       <w:r>
         <w:rPr/>
@@ -17288,7 +17367,7 @@
       </w:r>
     </w:p>
   </w:footnote>
-  <w:footnote w:id="21">
+  <w:footnote w:id="27">
     <w:p>
       <w:pPr>
         <w:pStyle w:val="FootnoteText"/>
@@ -17310,13 +17389,35 @@
       </w:r>
       <w:r>
         <w:rPr/>
-        <w:t xml:space="preserve">Primary sources: ATO Corporate Tax Transparency reports (machine-readable releases at https://data.gov.au/data/dataset/c2524c87-cea4-4636-acac-599a82048a26); Treasury Final Budget Outcome 2023-24 (https://archive.budget.gov.au/2023-24/fbo/download/00_fbo_2023-24.pdf); Queensland Budget 2025-26 Budget Paper 2 (https://budget.qld.gov.au/files/Budget-2025-26-BP2-Revenue.pdf); Australia Institute working papers on Western Australian and Queensland LNG taxation. Full source-by-source primary-URL log and entity-level reconciliation: this repository, </w:t>
+        <w:t xml:space="preserve">INPEX Australia, </w:t>
+      </w:r>
+      <w:r>
+        <w:rPr>
+          <w:i/>
+          <w:iCs/>
+        </w:rPr>
+        <w:t>Ichthys LNG project page</w:t>
+      </w:r>
+      <w:r>
+        <w:rPr/>
+        <w:t xml:space="preserve"> (operator project page, https://www.inpex.com.au/projects/ichthys-lng/); cost-overrun trajectory (US$34 bn 2012 FID → ~US$45 bn) triangulated via NS Energy and </w:t>
+      </w:r>
+      <w:r>
+        <w:rPr>
+          <w:i/>
+          <w:iCs/>
+        </w:rPr>
+        <w:t>Business News</w:t>
+      </w:r>
+      <w:r>
+        <w:rPr/>
+        <w:t xml:space="preserve"> “Ichthys hit by another cost blow out” trade-press coverage. Industry / trade-press triangulation as for Gorgon. Full source log: </w:t>
       </w:r>
       <w:r>
         <w:rPr>
           <w:rStyle w:val="VerbatimChar"/>
         </w:rPr>
-        <w:t>research/02_corporate_tax_and_royalties.md</w:t>
+        <w:t>research/05_industry_steelman.md</w:t>
       </w:r>
       <w:r>
         <w:rPr/>
@@ -17324,7 +17425,7 @@
       </w:r>
     </w:p>
   </w:footnote>
-  <w:footnote w:id="22">
+  <w:footnote w:id="28">
     <w:p>
       <w:pPr>
         <w:pStyle w:val="FootnoteText"/>
@@ -17346,22 +17447,54 @@
       </w:r>
       <w:r>
         <w:rPr/>
-        <w:t xml:space="preserve">Mike Callaghan AM, </w:t>
+        <w:t xml:space="preserve">Chevron Australia, </w:t>
       </w:r>
       <w:r>
         <w:rPr>
           <w:i/>
           <w:iCs/>
         </w:rPr>
-        <w:t>Petroleum Resource Rent Tax Review: Final Report</w:t>
-      </w:r>
-      <w:r>
-        <w:rPr/>
-        <w:t>, Australian Treasury, 13 April 2017. https://treasury.gov.au/sites/default/files/2019-03/R2016-001_PRRT_final_report.pdf</w:t>
+        <w:t>Wheatstone project overview</w:t>
+      </w:r>
+      <w:r>
+        <w:rPr/>
+        <w:t xml:space="preserve"> (operator project page, https://www.chevron.com/what-we-do/energy/oil-and-natural-gas/assets/wheatstone); cost-overrun trajectory (US$29 bn 2011 FID → US$34 bn) triangulated via </w:t>
+      </w:r>
+      <w:r>
+        <w:rPr>
+          <w:i/>
+          <w:iCs/>
+        </w:rPr>
+        <w:t>Oil &amp; Gas Journal</w:t>
+      </w:r>
+      <w:r>
+        <w:rPr/>
+        <w:t xml:space="preserve"> “Wheatstone LNG project costs skyrocket” and </w:t>
+      </w:r>
+      <w:r>
+        <w:rPr>
+          <w:i/>
+          <w:iCs/>
+        </w:rPr>
+        <w:t>Offshore Energy</w:t>
+      </w:r>
+      <w:r>
+        <w:rPr/>
+        <w:t xml:space="preserve"> “Chevron’s Wheatstone LNG project to cost US$5 billion more”. Industry / trade-press triangulation as for Gorgon. Full source log: </w:t>
+      </w:r>
+      <w:r>
+        <w:rPr>
+          <w:rStyle w:val="VerbatimChar"/>
+        </w:rPr>
+        <w:t>research/05_industry_steelman.md</w:t>
+      </w:r>
+      <w:r>
+        <w:rPr/>
+        <w:t>.</w:t>
       </w:r>
     </w:p>
   </w:footnote>
-  <w:footnote w:id="23">
+  <w:footnote w:id="29">
     <w:p>
       <w:pPr>
         <w:pStyle w:val="FootnoteText"/>
@@ -17383,13 +17516,24 @@
       </w:r>
       <w:r>
         <w:rPr/>
-        <w:t xml:space="preserve">Primary sources: Treasury Final Budget Outcome reports FY2010-11 to FY2024-25 (archived at https://archive.budget.gov.au//fbo/); Budget 2026-27 Budget Paper 1 Statement 5 Table 5.7 (https://budget.gov.au/content/bp1/download/bp1_bs-5.pdf); Petroleum Resource Rent Tax Assessment Act 1987 (Cth); Callaghan Review of the PRRT (April 2017, Treasury, https://treasury.gov.au/sites/default/files/2019-03/R2016-001_PRRT_final_report.pdf). Full source-by-source primary-URL log and per-year reconciliation: this repository, </w:t>
+        <w:t xml:space="preserve">Woodside, </w:t>
+      </w:r>
+      <w:r>
+        <w:rPr>
+          <w:i/>
+          <w:iCs/>
+        </w:rPr>
+        <w:t>Scarborough Energy Project and Pluto Train 2</w:t>
+      </w:r>
+      <w:r>
+        <w:rPr/>
+        <w:t xml:space="preserve"> (operator project page, https://www.woodside.com/what-we-do/growth-projects/Scarborough-Energy-Project); US$12 bn 2021 FID is the operator’s announced figure; the US$12.5 bn / ≥86% complete mid-2025 update is from Woodside investor briefings reported in the offshore-energy trade press. Industry / trade-press triangulation as for Gorgon. Full source log: </w:t>
       </w:r>
       <w:r>
         <w:rPr>
           <w:rStyle w:val="VerbatimChar"/>
         </w:rPr>
-        <w:t>research/01_prrt_history.md</w:t>
+        <w:t>research/05_industry_steelman.md</w:t>
       </w:r>
       <w:r>
         <w:rPr/>
@@ -17397,7 +17541,7 @@
       </w:r>
     </w:p>
   </w:footnote>
-  <w:footnote w:id="24">
+  <w:footnote w:id="30">
     <w:p>
       <w:pPr>
         <w:pStyle w:val="FootnoteText"/>
@@ -17419,11 +17563,54 @@
       </w:r>
       <w:r>
         <w:rPr/>
-        <w:t>Callaghan Review §4.2 on uplift rates: LTBR + 15pp for exploration; LTBR + 5pp for general project expenditure (post-1990).</w:t>
+        <w:t xml:space="preserve">Primary sources: Australian Energy Producers (AEP), </w:t>
+      </w:r>
+      <w:r>
+        <w:rPr>
+          <w:i/>
+          <w:iCs/>
+        </w:rPr>
+        <w:t>Tax factsheet 2024-25</w:t>
+      </w:r>
+      <w:r>
+        <w:rPr/>
+        <w:t xml:space="preserve"> (July 2025, https://energyproducers.au/hubfs/AEP-Tax-Factsheet-250725.pdf) and </w:t>
+      </w:r>
+      <w:r>
+        <w:rPr>
+          <w:i/>
+          <w:iCs/>
+        </w:rPr>
+        <w:t>Industry delivers record A$22 bn</w:t>
+      </w:r>
+      <w:r>
+        <w:rPr/>
+        <w:t xml:space="preserve"> media release (https://energyproducers.au/news/all_news/media-release-australian-oil-gas-industry-delivers-record-22-billion-in-taxes-and-royalties-to-government-revenues-in-2024-25); ACIL Allen, </w:t>
+      </w:r>
+      <w:r>
+        <w:rPr>
+          <w:i/>
+          <w:iCs/>
+        </w:rPr>
+        <w:t>Economic contribution of the Australian oil and gas industry, 2023</w:t>
+      </w:r>
+      <w:r>
+        <w:rPr/>
+        <w:t xml:space="preserve"> (https://acilallen.com.au/uploads/projects/767/ACILAllen_GEAEconomicContribution2023.pdf); the ANGE Association explanatory note on PRRT timing (https://angeassociation.com/fact-check/do-lng-pay-tax-in-australia/). Full reconstruction of industry claim → primary source → critique mapping: this repository, </w:t>
+      </w:r>
+      <w:r>
+        <w:rPr>
+          <w:rStyle w:val="VerbatimChar"/>
+        </w:rPr>
+        <w:t>research/05_industry_steelman.md</w:t>
+      </w:r>
+      <w:r>
+        <w:rPr/>
+        <w:t>.</w:t>
       </w:r>
     </w:p>
   </w:footnote>
-  <w:footnote w:id="25">
+  <w:footnote w:id="31">
     <w:p>
       <w:pPr>
         <w:pStyle w:val="FootnoteText"/>
@@ -17445,11 +17632,39 @@
       </w:r>
       <w:r>
         <w:rPr/>
-        <w:t>Callaghan Review Figure 2.3 “Total deductible expenditure” — series rises from ~A$50 bn in 2002 to ~A$300 bn in 2015-16.</w:t>
+        <w:t>Treasurer Jim Chalmers, “Changes to the Petroleum Resource Rent Tax”, media release. https://ministers.treasury.gov.au/ministers/jim-chalmers-2022/media-releases/changes-petroleum-resource-rent-tax . ATO PRRT deductions cap guidance: https://www.ato.gov.au/businesses-and-organisations/business-bulletins-newsroom/prrt-deductions-cap-now-law</w:t>
       </w:r>
     </w:p>
   </w:footnote>
-  <w:footnote w:id="26">
+  <w:footnote w:id="32">
+    <w:p>
+      <w:r>
+        <w:t xml:space="preserve">Repeated source: Primary sources: Treasury Final Budget Outcome reports FY2010-11 to FY2024-25 (archived...</w:t>
+      </w:r>
+    </w:p>
+  </w:footnote>
+  <w:footnote w:id="33">
+    <w:p>
+      <w:r>
+        <w:t xml:space="preserve">Repeated source: Primary sources: Treasury Final Budget Outcome reports FY2010-11 to FY2024-25 (archived...</w:t>
+      </w:r>
+    </w:p>
+  </w:footnote>
+  <w:footnote w:id="34">
+    <w:p>
+      <w:r>
+        <w:t xml:space="preserve">Repeated source: Primary sources: Treasury Final Budget Outcome reports FY2010-11 to FY2024-25 (archived...</w:t>
+      </w:r>
+    </w:p>
+  </w:footnote>
+  <w:footnote w:id="35">
+    <w:p>
+      <w:r>
+        <w:t xml:space="preserve">Repeated source: ATO Corporate Tax Transparency Report 2023-24; Chevron Australia disclosure. Dossier 01...</w:t>
+      </w:r>
+    </w:p>
+  </w:footnote>
+  <w:footnote w:id="36">
     <w:p>
       <w:pPr>
         <w:pStyle w:val="FootnoteText"/>
@@ -17471,32 +17686,36 @@
       </w:r>
       <w:r>
         <w:rPr/>
-        <w:t xml:space="preserve">Chevron Australia, </w:t>
+        <w:t xml:space="preserve">Greg Jericho, </w:t>
       </w:r>
       <w:r>
         <w:rPr>
           <w:i/>
           <w:iCs/>
         </w:rPr>
-        <w:t>Gorgon project overview</w:t>
-      </w:r>
-      <w:r>
-        <w:rPr/>
-        <w:t xml:space="preserve"> (operator project page, https://www.chevron.com/what-we-do/energy/oil-and-natural-gas/assets/gorgon); cost-overrun trajectory (US$37 bn 2009 FID → US$54 bn) triangulated via offshore-energy trade press and Black Ridge Research / Wikipedia project profiles. Operators do not publish a single audited “final project cost” in statutory filings; the figures here are the industry / trade-press triangulation. Full source log: </w:t>
-      </w:r>
-      <w:r>
-        <w:rPr>
-          <w:rStyle w:val="VerbatimChar"/>
-        </w:rPr>
-        <w:t>research/05_industry_steelman.md</w:t>
-      </w:r>
-      <w:r>
-        <w:rPr/>
-        <w:t>.</w:t>
+        <w:t>A stronger PRRT cap: A fairer way to tax gas super profits</w:t>
+      </w:r>
+      <w:r>
+        <w:rPr/>
+        <w:t>, Australia Institute, May 2024. https://australiainstitute.org.au/wp-content/uploads/2024/05/Stronger-PRRT-cap-Web.pdf</w:t>
       </w:r>
     </w:p>
   </w:footnote>
-  <w:footnote w:id="27">
+  <w:footnote w:id="37">
+    <w:p>
+      <w:r>
+        <w:t xml:space="preserve">Repeated source: Primary sources: ATO Corporate Tax Transparency reports (machine-readable releases at h...</w:t>
+      </w:r>
+    </w:p>
+  </w:footnote>
+  <w:footnote w:id="38">
+    <w:p>
+      <w:r>
+        <w:t xml:space="preserve">Repeated source: Primary sources: ATO Corporate Tax Transparency reports (machine-readable releases at h...</w:t>
+      </w:r>
+    </w:p>
+  </w:footnote>
+  <w:footnote w:id="39">
     <w:p>
       <w:pPr>
         <w:pStyle w:val="FootnoteText"/>
@@ -17517,44 +17736,19 @@
         <w:t xml:space="preserve"> </w:t>
       </w:r>
       <w:r>
-        <w:rPr/>
-        <w:t xml:space="preserve">INPEX Australia, </w:t>
-      </w:r>
-      <w:r>
         <w:rPr>
           <w:i/>
           <w:iCs/>
         </w:rPr>
-        <w:t>Ichthys LNG project page</w:t>
-      </w:r>
-      <w:r>
-        <w:rPr/>
-        <w:t xml:space="preserve"> (operator project page, https://www.inpex.com.au/projects/ichthys-lng/); cost-overrun trajectory (US$34 bn 2012 FID → ~US$45 bn) triangulated via NS Energy and </w:t>
-      </w:r>
-      <w:r>
-        <w:rPr>
-          <w:i/>
-          <w:iCs/>
-        </w:rPr>
-        <w:t>Business News</w:t>
-      </w:r>
-      <w:r>
-        <w:rPr/>
-        <w:t xml:space="preserve"> “Ichthys hit by another cost blow out” trade-press coverage. Industry / trade-press triangulation as for Gorgon. Full source log: </w:t>
-      </w:r>
-      <w:r>
-        <w:rPr>
-          <w:rStyle w:val="VerbatimChar"/>
-        </w:rPr>
-        <w:t>research/05_industry_steelman.md</w:t>
-      </w:r>
-      <w:r>
-        <w:rPr/>
-        <w:t>.</w:t>
+        <w:t>Chevron Australia Holdings Pty Ltd v Commissioner of Taxation</w:t>
+      </w:r>
+      <w:r>
+        <w:rPr/>
+        <w:t xml:space="preserve"> [2017] FCAFC 62. Settlement and US$2.5 bn related-party loan structure verified against Federal Court judgment and MinterEllison summary.</w:t>
       </w:r>
     </w:p>
   </w:footnote>
-  <w:footnote w:id="28">
+  <w:footnote w:id="40">
     <w:p>
       <w:pPr>
         <w:pStyle w:val="FootnoteText"/>
@@ -17576,54 +17770,18 @@
       </w:r>
       <w:r>
         <w:rPr/>
-        <w:t xml:space="preserve">Chevron Australia, </w:t>
-      </w:r>
-      <w:r>
-        <w:rPr>
-          <w:i/>
-          <w:iCs/>
-        </w:rPr>
-        <w:t>Wheatstone project overview</w:t>
-      </w:r>
-      <w:r>
-        <w:rPr/>
-        <w:t xml:space="preserve"> (operator project page, https://www.chevron.com/what-we-do/energy/oil-and-natural-gas/assets/wheatstone); cost-overrun trajectory (US$29 bn 2011 FID → US$34 bn) triangulated via </w:t>
-      </w:r>
-      <w:r>
-        <w:rPr>
-          <w:i/>
-          <w:iCs/>
-        </w:rPr>
-        <w:t>Oil &amp; Gas Journal</w:t>
-      </w:r>
-      <w:r>
-        <w:rPr/>
-        <w:t xml:space="preserve"> “Wheatstone LNG project costs skyrocket” and </w:t>
-      </w:r>
-      <w:r>
-        <w:rPr>
-          <w:i/>
-          <w:iCs/>
-        </w:rPr>
-        <w:t>Offshore Energy</w:t>
-      </w:r>
-      <w:r>
-        <w:rPr/>
-        <w:t xml:space="preserve"> “Chevron’s Wheatstone LNG project to cost US$5 billion more”. Industry / trade-press triangulation as for Gorgon. Full source log: </w:t>
-      </w:r>
-      <w:r>
-        <w:rPr>
-          <w:rStyle w:val="VerbatimChar"/>
-        </w:rPr>
-        <w:t>research/05_industry_steelman.md</w:t>
-      </w:r>
-      <w:r>
-        <w:rPr/>
-        <w:t>.</w:t>
+        <w:t>Australia Institute, “APPEA members pay no income tax on income of $138 billion.” https://australiainstitute.org.au/post/appea-members-pay-no-income-tax-on-income-of-138-billion/</w:t>
       </w:r>
     </w:p>
   </w:footnote>
-  <w:footnote w:id="29">
+  <w:footnote w:id="41">
+    <w:p>
+      <w:r>
+        <w:t xml:space="preserve">Repeated source: Australian Energy Producers, “Media release: Australian oil &amp;amp; gas industry delivers...</w:t>
+      </w:r>
+    </w:p>
+  </w:footnote>
+  <w:footnote w:id="42">
     <w:p>
       <w:pPr>
         <w:pStyle w:val="FootnoteText"/>
@@ -17645,549 +17803,21 @@
       </w:r>
       <w:r>
         <w:rPr/>
-        <w:t xml:space="preserve">Woodside, </w:t>
-      </w:r>
-      <w:r>
-        <w:rPr>
-          <w:i/>
-          <w:iCs/>
-        </w:rPr>
-        <w:t>Scarborough Energy Project and Pluto Train 2</w:t>
-      </w:r>
-      <w:r>
-        <w:rPr/>
-        <w:t xml:space="preserve"> (operator project page, https://www.woodside.com/what-we-do/growth-projects/Scarborough-Energy-Project); US$12 bn 2021 FID is the operator’s announced figure; the US$12.5 bn / ≥86% complete mid-2025 update is from Woodside investor briefings reported in the offshore-energy trade press. Industry / trade-press triangulation as for Gorgon. Full source log: </w:t>
-      </w:r>
-      <w:r>
-        <w:rPr>
-          <w:rStyle w:val="VerbatimChar"/>
-        </w:rPr>
-        <w:t>research/05_industry_steelman.md</w:t>
-      </w:r>
-      <w:r>
-        <w:rPr/>
-        <w:t>.</w:t>
-      </w:r>
-    </w:p>
-  </w:footnote>
-  <w:footnote w:id="30">
-    <w:p>
-      <w:pPr>
-        <w:pStyle w:val="FootnoteText"/>
-        <w:widowControl/>
-        <w:bidi w:val="0"/>
-        <w:spacing w:lineRule="auto" w:line="312" w:before="0" w:after="80"/>
-        <w:jc w:val="start"/>
-        <w:rPr/>
-      </w:pPr>
-      <w:r>
-        <w:rPr>
-          <w:rStyle w:val="FootnoteCharacters"/>
-        </w:rPr>
-        <w:footnoteRef/>
-      </w:r>
-      <w:r>
-        <w:rPr/>
-        <w:t xml:space="preserve"> </w:t>
-      </w:r>
-      <w:r>
-        <w:rPr/>
-        <w:t xml:space="preserve">Primary sources: Australian Energy Producers (AEP), </w:t>
-      </w:r>
-      <w:r>
-        <w:rPr>
-          <w:i/>
-          <w:iCs/>
-        </w:rPr>
-        <w:t>Tax factsheet 2024-25</w:t>
-      </w:r>
-      <w:r>
-        <w:rPr/>
-        <w:t xml:space="preserve"> (July 2025, https://energyproducers.au/hubfs/AEP-Tax-Factsheet-250725.pdf) and </w:t>
-      </w:r>
-      <w:r>
-        <w:rPr>
-          <w:i/>
-          <w:iCs/>
-        </w:rPr>
-        <w:t>Industry delivers record A$22 bn</w:t>
-      </w:r>
-      <w:r>
-        <w:rPr/>
-        <w:t xml:space="preserve"> media release (https://energyproducers.au/news/all_news/media-release-australian-oil-gas-industry-delivers-record-22-billion-in-taxes-and-royalties-to-government-revenues-in-2024-25); ACIL Allen, </w:t>
-      </w:r>
-      <w:r>
-        <w:rPr>
-          <w:i/>
-          <w:iCs/>
-        </w:rPr>
-        <w:t>Economic contribution of the Australian oil and gas industry, 2023</w:t>
-      </w:r>
-      <w:r>
-        <w:rPr/>
-        <w:t xml:space="preserve"> (https://acilallen.com.au/uploads/projects/767/ACILAllen_GEAEconomicContribution2023.pdf); the ANGE Association explanatory note on PRRT timing (https://angeassociation.com/fact-check/do-lng-pay-tax-in-australia/). Full reconstruction of industry claim → primary source → critique mapping: this repository, </w:t>
-      </w:r>
-      <w:r>
-        <w:rPr>
-          <w:rStyle w:val="VerbatimChar"/>
-        </w:rPr>
-        <w:t>research/05_industry_steelman.md</w:t>
-      </w:r>
-      <w:r>
-        <w:rPr/>
-        <w:t>.</w:t>
-      </w:r>
-    </w:p>
-  </w:footnote>
-  <w:footnote w:id="31">
-    <w:p>
-      <w:pPr>
-        <w:pStyle w:val="FootnoteText"/>
-        <w:widowControl/>
-        <w:bidi w:val="0"/>
-        <w:spacing w:lineRule="auto" w:line="312" w:before="0" w:after="80"/>
-        <w:jc w:val="start"/>
-        <w:rPr/>
-      </w:pPr>
-      <w:r>
-        <w:rPr>
-          <w:rStyle w:val="FootnoteCharacters"/>
-        </w:rPr>
-        <w:footnoteRef/>
-      </w:r>
-      <w:r>
-        <w:rPr/>
-        <w:t xml:space="preserve"> </w:t>
-      </w:r>
-      <w:r>
-        <w:rPr/>
-        <w:t>Treasurer Jim Chalmers, “Changes to the Petroleum Resource Rent Tax”, media release. https://ministers.treasury.gov.au/ministers/jim-chalmers-2022/media-releases/changes-petroleum-resource-rent-tax . ATO PRRT deductions cap guidance: https://www.ato.gov.au/businesses-and-organisations/business-bulletins-newsroom/prrt-deductions-cap-now-law</w:t>
-      </w:r>
-    </w:p>
-  </w:footnote>
-  <w:footnote w:id="32">
-    <w:p>
-      <w:pPr>
-        <w:pStyle w:val="FootnoteText"/>
-        <w:widowControl/>
-        <w:bidi w:val="0"/>
-        <w:spacing w:lineRule="auto" w:line="312" w:before="0" w:after="80"/>
-        <w:jc w:val="start"/>
-        <w:rPr/>
-      </w:pPr>
-      <w:r>
-        <w:rPr>
-          <w:rStyle w:val="FootnoteCharacters"/>
-        </w:rPr>
-        <w:footnoteRef/>
-      </w:r>
-      <w:r>
-        <w:rPr/>
-        <w:t xml:space="preserve"> </w:t>
-      </w:r>
-      <w:r>
-        <w:rPr/>
-        <w:t xml:space="preserve">Primary sources: Treasury Final Budget Outcome reports FY2010-11 to FY2024-25 (archived at https://archive.budget.gov.au//fbo/); Budget 2026-27 Budget Paper 1 Statement 5 Table 5.7 (https://budget.gov.au/content/bp1/download/bp1_bs-5.pdf); Petroleum Resource Rent Tax Assessment Act 1987 (Cth); Callaghan Review of the PRRT (April 2017, Treasury, https://treasury.gov.au/sites/default/files/2019-03/R2016-001_PRRT_final_report.pdf). Full source-by-source primary-URL log and per-year reconciliation: this repository, </w:t>
-      </w:r>
-      <w:r>
-        <w:rPr>
-          <w:rStyle w:val="VerbatimChar"/>
-        </w:rPr>
-        <w:t>research/01_prrt_history.md</w:t>
-      </w:r>
-      <w:r>
-        <w:rPr/>
-        <w:t>.</w:t>
-      </w:r>
-    </w:p>
-  </w:footnote>
-  <w:footnote w:id="33">
-    <w:p>
-      <w:pPr>
-        <w:pStyle w:val="FootnoteText"/>
-        <w:widowControl/>
-        <w:bidi w:val="0"/>
-        <w:spacing w:lineRule="auto" w:line="312" w:before="0" w:after="80"/>
-        <w:jc w:val="start"/>
-        <w:rPr/>
-      </w:pPr>
-      <w:r>
-        <w:rPr>
-          <w:rStyle w:val="FootnoteCharacters"/>
-        </w:rPr>
-        <w:footnoteRef/>
-      </w:r>
-      <w:r>
-        <w:rPr/>
-        <w:t xml:space="preserve"> </w:t>
-      </w:r>
-      <w:r>
-        <w:rPr/>
-        <w:t xml:space="preserve">Primary sources: Treasury Final Budget Outcome reports FY2010-11 to FY2024-25 (archived at https://archive.budget.gov.au//fbo/); Budget 2026-27 Budget Paper 1 Statement 5 Table 5.7 (https://budget.gov.au/content/bp1/download/bp1_bs-5.pdf); Petroleum Resource Rent Tax Assessment Act 1987 (Cth); Callaghan Review of the PRRT (April 2017, Treasury, https://treasury.gov.au/sites/default/files/2019-03/R2016-001_PRRT_final_report.pdf). Full source-by-source primary-URL log and per-year reconciliation: this repository, </w:t>
-      </w:r>
-      <w:r>
-        <w:rPr>
-          <w:rStyle w:val="VerbatimChar"/>
-        </w:rPr>
-        <w:t>research/01_prrt_history.md</w:t>
-      </w:r>
-      <w:r>
-        <w:rPr/>
-        <w:t>.</w:t>
-      </w:r>
-    </w:p>
-  </w:footnote>
-  <w:footnote w:id="34">
-    <w:p>
-      <w:pPr>
-        <w:pStyle w:val="FootnoteText"/>
-        <w:widowControl/>
-        <w:bidi w:val="0"/>
-        <w:spacing w:lineRule="auto" w:line="312" w:before="0" w:after="80"/>
-        <w:jc w:val="start"/>
-        <w:rPr/>
-      </w:pPr>
-      <w:r>
-        <w:rPr>
-          <w:rStyle w:val="FootnoteCharacters"/>
-        </w:rPr>
-        <w:footnoteRef/>
-      </w:r>
-      <w:r>
-        <w:rPr/>
-        <w:t xml:space="preserve"> </w:t>
-      </w:r>
-      <w:r>
-        <w:rPr/>
-        <w:t xml:space="preserve">Primary sources: Treasury Final Budget Outcome reports FY2010-11 to FY2024-25 (archived at https://archive.budget.gov.au//fbo/); Budget 2026-27 Budget Paper 1 Statement 5 Table 5.7 (https://budget.gov.au/content/bp1/download/bp1_bs-5.pdf); Petroleum Resource Rent Tax Assessment Act 1987 (Cth); Callaghan Review of the PRRT (April 2017, Treasury, https://treasury.gov.au/sites/default/files/2019-03/R2016-001_PRRT_final_report.pdf). Full source-by-source primary-URL log and per-year reconciliation: this repository, </w:t>
-      </w:r>
-      <w:r>
-        <w:rPr>
-          <w:rStyle w:val="VerbatimChar"/>
-        </w:rPr>
-        <w:t>research/01_prrt_history.md</w:t>
-      </w:r>
-      <w:r>
-        <w:rPr/>
-        <w:t>.</w:t>
-      </w:r>
-    </w:p>
-  </w:footnote>
-  <w:footnote w:id="35">
-    <w:p>
-      <w:pPr>
-        <w:pStyle w:val="FootnoteText"/>
-        <w:widowControl/>
-        <w:bidi w:val="0"/>
-        <w:spacing w:lineRule="auto" w:line="312" w:before="0" w:after="80"/>
-        <w:jc w:val="start"/>
-        <w:rPr/>
-      </w:pPr>
-      <w:r>
-        <w:rPr>
-          <w:rStyle w:val="FootnoteCharacters"/>
-        </w:rPr>
-        <w:footnoteRef/>
-      </w:r>
-      <w:r>
-        <w:rPr/>
-        <w:t xml:space="preserve"> </w:t>
-      </w:r>
-      <w:r>
-        <w:rPr/>
-        <w:t>ATO Corporate Tax Transparency Report 2023-24; Chevron Australia disclosure. Dossier 01, §4c.</w:t>
-      </w:r>
-    </w:p>
-  </w:footnote>
-  <w:footnote w:id="36">
-    <w:p>
-      <w:pPr>
-        <w:pStyle w:val="FootnoteText"/>
-        <w:widowControl/>
-        <w:bidi w:val="0"/>
-        <w:spacing w:lineRule="auto" w:line="312" w:before="0" w:after="80"/>
-        <w:jc w:val="start"/>
-        <w:rPr/>
-      </w:pPr>
-      <w:r>
-        <w:rPr>
-          <w:rStyle w:val="FootnoteCharacters"/>
-        </w:rPr>
-        <w:footnoteRef/>
-      </w:r>
-      <w:r>
-        <w:rPr/>
-        <w:t xml:space="preserve"> </w:t>
-      </w:r>
-      <w:r>
-        <w:rPr/>
-        <w:t xml:space="preserve">Greg Jericho, </w:t>
-      </w:r>
-      <w:r>
-        <w:rPr>
-          <w:i/>
-          <w:iCs/>
-        </w:rPr>
-        <w:t>A stronger PRRT cap: A fairer way to tax gas super profits</w:t>
-      </w:r>
-      <w:r>
-        <w:rPr/>
-        <w:t>, Australia Institute, May 2024. https://australiainstitute.org.au/wp-content/uploads/2024/05/Stronger-PRRT-cap-Web.pdf</w:t>
-      </w:r>
-    </w:p>
-  </w:footnote>
-  <w:footnote w:id="37">
-    <w:p>
-      <w:pPr>
-        <w:pStyle w:val="FootnoteText"/>
-        <w:widowControl/>
-        <w:bidi w:val="0"/>
-        <w:spacing w:lineRule="auto" w:line="312" w:before="0" w:after="80"/>
-        <w:jc w:val="start"/>
-        <w:rPr/>
-      </w:pPr>
-      <w:r>
-        <w:rPr>
-          <w:rStyle w:val="FootnoteCharacters"/>
-        </w:rPr>
-        <w:footnoteRef/>
-      </w:r>
-      <w:r>
-        <w:rPr/>
-        <w:t xml:space="preserve"> </w:t>
-      </w:r>
-      <w:r>
-        <w:rPr/>
-        <w:t xml:space="preserve">Primary sources: ATO Corporate Tax Transparency reports (machine-readable releases at https://data.gov.au/data/dataset/c2524c87-cea4-4636-acac-599a82048a26); Treasury Final Budget Outcome 2023-24 (https://archive.budget.gov.au/2023-24/fbo/download/00_fbo_2023-24.pdf); Queensland Budget 2025-26 Budget Paper 2 (https://budget.qld.gov.au/files/Budget-2025-26-BP2-Revenue.pdf); Australia Institute working papers on Western Australian and Queensland LNG taxation. Full source-by-source primary-URL log and entity-level reconciliation: this repository, </w:t>
-      </w:r>
-      <w:r>
-        <w:rPr>
-          <w:rStyle w:val="VerbatimChar"/>
-        </w:rPr>
-        <w:t>research/02_corporate_tax_and_royalties.md</w:t>
-      </w:r>
-      <w:r>
-        <w:rPr/>
-        <w:t>.</w:t>
-      </w:r>
-    </w:p>
-  </w:footnote>
-  <w:footnote w:id="38">
-    <w:p>
-      <w:pPr>
-        <w:pStyle w:val="FootnoteText"/>
-        <w:widowControl/>
-        <w:bidi w:val="0"/>
-        <w:spacing w:lineRule="auto" w:line="312" w:before="0" w:after="80"/>
-        <w:jc w:val="start"/>
-        <w:rPr/>
-      </w:pPr>
-      <w:r>
-        <w:rPr>
-          <w:rStyle w:val="FootnoteCharacters"/>
-        </w:rPr>
-        <w:footnoteRef/>
-      </w:r>
-      <w:r>
-        <w:rPr/>
-        <w:t xml:space="preserve"> </w:t>
-      </w:r>
-      <w:r>
-        <w:rPr/>
-        <w:t xml:space="preserve">Primary sources: ATO Corporate Tax Transparency reports (machine-readable releases at https://data.gov.au/data/dataset/c2524c87-cea4-4636-acac-599a82048a26); Treasury Final Budget Outcome 2023-24 (https://archive.budget.gov.au/2023-24/fbo/download/00_fbo_2023-24.pdf); Queensland Budget 2025-26 Budget Paper 2 (https://budget.qld.gov.au/files/Budget-2025-26-BP2-Revenue.pdf); Australia Institute working papers on Western Australian and Queensland LNG taxation. Full source-by-source primary-URL log and entity-level reconciliation: this repository, </w:t>
-      </w:r>
-      <w:r>
-        <w:rPr>
-          <w:rStyle w:val="VerbatimChar"/>
-        </w:rPr>
-        <w:t>research/02_corporate_tax_and_royalties.md</w:t>
-      </w:r>
-      <w:r>
-        <w:rPr/>
-        <w:t>.</w:t>
-      </w:r>
-    </w:p>
-  </w:footnote>
-  <w:footnote w:id="39">
-    <w:p>
-      <w:pPr>
-        <w:pStyle w:val="FootnoteText"/>
-        <w:widowControl/>
-        <w:bidi w:val="0"/>
-        <w:spacing w:lineRule="auto" w:line="312" w:before="0" w:after="80"/>
-        <w:jc w:val="start"/>
-        <w:rPr/>
-      </w:pPr>
-      <w:r>
-        <w:rPr>
-          <w:rStyle w:val="FootnoteCharacters"/>
-        </w:rPr>
-        <w:footnoteRef/>
-      </w:r>
-      <w:r>
-        <w:rPr/>
-        <w:t xml:space="preserve"> </w:t>
-      </w:r>
-      <w:r>
-        <w:rPr>
-          <w:i/>
-          <w:iCs/>
-        </w:rPr>
-        <w:t>Chevron Australia Holdings Pty Ltd v Commissioner of Taxation</w:t>
-      </w:r>
-      <w:r>
-        <w:rPr/>
-        <w:t xml:space="preserve"> [2017] FCAFC 62. Settlement and US$2.5 bn related-party loan structure verified against Federal Court judgment and MinterEllison summary.</w:t>
-      </w:r>
-    </w:p>
-  </w:footnote>
-  <w:footnote w:id="40">
-    <w:p>
-      <w:pPr>
-        <w:pStyle w:val="FootnoteText"/>
-        <w:widowControl/>
-        <w:bidi w:val="0"/>
-        <w:spacing w:lineRule="auto" w:line="312" w:before="0" w:after="80"/>
-        <w:jc w:val="start"/>
-        <w:rPr/>
-      </w:pPr>
-      <w:r>
-        <w:rPr>
-          <w:rStyle w:val="FootnoteCharacters"/>
-        </w:rPr>
-        <w:footnoteRef/>
-      </w:r>
-      <w:r>
-        <w:rPr/>
-        <w:t xml:space="preserve"> </w:t>
-      </w:r>
-      <w:r>
-        <w:rPr/>
-        <w:t>Australia Institute, “APPEA members pay no income tax on income of $138 billion.” https://australiainstitute.org.au/post/appea-members-pay-no-income-tax-on-income-of-138-billion/</w:t>
-      </w:r>
-    </w:p>
-  </w:footnote>
-  <w:footnote w:id="41">
-    <w:p>
-      <w:pPr>
-        <w:pStyle w:val="FootnoteText"/>
-        <w:widowControl/>
-        <w:bidi w:val="0"/>
-        <w:spacing w:lineRule="auto" w:line="312" w:before="0" w:after="80"/>
-        <w:jc w:val="start"/>
-        <w:rPr/>
-      </w:pPr>
-      <w:r>
-        <w:rPr>
-          <w:rStyle w:val="FootnoteCharacters"/>
-        </w:rPr>
-        <w:footnoteRef/>
-      </w:r>
-      <w:r>
-        <w:rPr/>
-        <w:t xml:space="preserve"> </w:t>
-      </w:r>
-      <w:r>
-        <w:rPr/>
-        <w:t>Australian Energy Producers, “Media release: Australian oil &amp; gas industry delivers record $22 billion in taxes and royalties to government revenues in 2024-25”, 27 July 2025. https://energyproducers.au/news/all_news/media-release-australian-oil-gas-industry-delivers-record-22-billion-in-taxes-and-royalties-to-government-revenues-in-2024-25</w:t>
-      </w:r>
-    </w:p>
-  </w:footnote>
-  <w:footnote w:id="42">
-    <w:p>
-      <w:pPr>
-        <w:pStyle w:val="FootnoteText"/>
-        <w:widowControl/>
-        <w:bidi w:val="0"/>
-        <w:spacing w:lineRule="auto" w:line="312" w:before="0" w:after="80"/>
-        <w:jc w:val="start"/>
-        <w:rPr/>
-      </w:pPr>
-      <w:r>
-        <w:rPr>
-          <w:rStyle w:val="FootnoteCharacters"/>
-        </w:rPr>
-        <w:footnoteRef/>
-      </w:r>
-      <w:r>
-        <w:rPr/>
-        <w:t xml:space="preserve"> </w:t>
-      </w:r>
-      <w:r>
-        <w:rPr/>
         <w:t>ANGEA (Australia New Zealand East Asia Natural Gas Association), “Do LNG companies pay tax in Australia?” — Chevron Australia A$5 bn 2024 company tax; Woodside A$4 bn 2024 company tax. https://angeassociation.com/fact-check/do-lng-pay-tax-in-australia/</w:t>
       </w:r>
     </w:p>
   </w:footnote>
   <w:footnote w:id="43">
     <w:p>
-      <w:pPr>
-        <w:pStyle w:val="FootnoteText"/>
-        <w:widowControl/>
-        <w:bidi w:val="0"/>
-        <w:spacing w:lineRule="auto" w:line="312" w:before="0" w:after="80"/>
-        <w:jc w:val="start"/>
-        <w:rPr/>
-      </w:pPr>
-      <w:r>
-        <w:rPr>
-          <w:rStyle w:val="FootnoteCharacters"/>
-        </w:rPr>
-        <w:footnoteRef/>
-      </w:r>
-      <w:r>
-        <w:rPr/>
-        <w:t xml:space="preserve"> </w:t>
-      </w:r>
-      <w:r>
-        <w:rPr/>
-        <w:t xml:space="preserve">Primary sources: ATO Corporate Tax Transparency reports (machine-readable releases at https://data.gov.au/data/dataset/c2524c87-cea4-4636-acac-599a82048a26); Treasury Final Budget Outcome 2023-24 (https://archive.budget.gov.au/2023-24/fbo/download/00_fbo_2023-24.pdf); Queensland Budget 2025-26 Budget Paper 2 (https://budget.qld.gov.au/files/Budget-2025-26-BP2-Revenue.pdf); Australia Institute working papers on Western Australian and Queensland LNG taxation. Full source-by-source primary-URL log and entity-level reconciliation: this repository, </w:t>
-      </w:r>
-      <w:r>
-        <w:rPr>
-          <w:rStyle w:val="VerbatimChar"/>
-        </w:rPr>
-        <w:t>research/02_corporate_tax_and_royalties.md</w:t>
-      </w:r>
-      <w:r>
-        <w:rPr/>
-        <w:t>.</w:t>
+      <w:r>
+        <w:t xml:space="preserve">Repeated source: Primary sources: ATO Corporate Tax Transparency reports (machine-readable releases at h...</w:t>
       </w:r>
     </w:p>
   </w:footnote>
   <w:footnote w:id="44">
     <w:p>
-      <w:pPr>
-        <w:pStyle w:val="FootnoteText"/>
-        <w:widowControl/>
-        <w:bidi w:val="0"/>
-        <w:spacing w:lineRule="auto" w:line="312" w:before="0" w:after="80"/>
-        <w:jc w:val="start"/>
-        <w:rPr/>
-      </w:pPr>
-      <w:r>
-        <w:rPr>
-          <w:rStyle w:val="FootnoteCharacters"/>
-        </w:rPr>
-        <w:footnoteRef/>
-      </w:r>
-      <w:r>
-        <w:rPr/>
-        <w:t xml:space="preserve"> </w:t>
-      </w:r>
-      <w:r>
-        <w:rPr/>
-        <w:t xml:space="preserve">Primary sources: ATO Corporate Tax Transparency reports (machine-readable releases at https://data.gov.au/data/dataset/c2524c87-cea4-4636-acac-599a82048a26); Treasury Final Budget Outcome 2023-24 (https://archive.budget.gov.au/2023-24/fbo/download/00_fbo_2023-24.pdf); Queensland Budget 2025-26 Budget Paper 2 (https://budget.qld.gov.au/files/Budget-2025-26-BP2-Revenue.pdf); Australia Institute working papers on Western Australian and Queensland LNG taxation. Full source-by-source primary-URL log and entity-level reconciliation: this repository, </w:t>
-      </w:r>
-      <w:r>
-        <w:rPr>
-          <w:rStyle w:val="VerbatimChar"/>
-        </w:rPr>
-        <w:t>research/02_corporate_tax_and_royalties.md</w:t>
-      </w:r>
-      <w:r>
-        <w:rPr/>
-        <w:t>.</w:t>
+      <w:r>
+        <w:t xml:space="preserve">Repeated source: Primary sources: ATO Corporate Tax Transparency reports (machine-readable releases at h...</w:t>
       </w:r>
     </w:p>
   </w:footnote>
@@ -18346,6 +17976,13 @@
   </w:footnote>
   <w:footnote w:id="50">
     <w:p>
+      <w:r>
+        <w:t xml:space="preserve">Repeated source: Budget Paper 1 2026-27, Statement 5, Table 5.7 “Australian Government general governmen...</w:t>
+      </w:r>
+    </w:p>
+  </w:footnote>
+  <w:footnote w:id="51">
+    <w:p>
       <w:pPr>
         <w:pStyle w:val="FootnoteText"/>
         <w:widowControl/>
@@ -18366,11 +18003,18 @@
       </w:r>
       <w:r>
         <w:rPr/>
-        <w:t>Budget Paper 1 2026-27, Statement 5, Table 5.7 “Australian Government general government (cash) receipts”, p. 208. PRRT estimates: 2025-26 A$1,400m; 2026-27 A$1,900m; 2027-28 A$1,750m; 2028-29 A$1,550m; 2029-30 A$1,250m. Beer excise estimates: 2026-27 A$2,810m; 2029-30 A$3,100m. Direct PDF: https://budget.gov.au/content/bp1/download/bp1_bs-5.pdf</w:t>
+        <w:t>Norwegian Petroleum (norskpetroleum.no), “The Petroleum Tax System.” https://www.norskpetroleum.no/en/economy/petroleum-tax/</w:t>
       </w:r>
     </w:p>
   </w:footnote>
-  <w:footnote w:id="51">
+  <w:footnote w:id="52">
+    <w:p>
+      <w:r>
+        <w:t xml:space="preserve">Repeated source: Primary sources: Norwegian Petroleum Directorate (annual state petroleum cash-flow tabl...</w:t>
+      </w:r>
+    </w:p>
+  </w:footnote>
+  <w:footnote w:id="53">
     <w:p>
       <w:pPr>
         <w:pStyle w:val="FootnoteText"/>
@@ -18392,11 +18036,11 @@
       </w:r>
       <w:r>
         <w:rPr/>
-        <w:t>Norwegian Petroleum (norskpetroleum.no), “The Petroleum Tax System.” https://www.norskpetroleum.no/en/economy/petroleum-tax/</w:t>
+        <w:t>NBIM, Government Pension Fund Global market value at 31 December 2025. https://www.nbim.no/en/the-fund/key-figures/</w:t>
       </w:r>
     </w:p>
   </w:footnote>
-  <w:footnote w:id="52">
+  <w:footnote w:id="54">
     <w:p>
       <w:pPr>
         <w:pStyle w:val="FootnoteText"/>
@@ -18418,31 +18062,11 @@
       </w:r>
       <w:r>
         <w:rPr/>
-        <w:t xml:space="preserve">Primary sources: Norwegian Petroleum Directorate (annual state petroleum cash-flow tables); IMF Country Report 25/47 (Qatar); US BOEM / DOI ONRR statistics; HMRC oil &amp; gas tax receipts (United Kingdom); PETRONAS Integrated Report 2024 (Malaysia); Australia Institute / DISR Resources and Energy Quarterly (Australia). FX conversions per </w:t>
-      </w:r>
-      <w:r>
-        <w:rPr>
-          <w:rStyle w:val="VerbatimChar"/>
-        </w:rPr>
-        <w:t>sources/fx_rates.md</w:t>
-      </w:r>
-      <w:r>
-        <w:rPr/>
-        <w:t xml:space="preserve"> (RBA F11.1 2026-05-11). Full per-country working and primary-URL log: this repository, </w:t>
-      </w:r>
-      <w:r>
-        <w:rPr>
-          <w:rStyle w:val="VerbatimChar"/>
-        </w:rPr>
-        <w:t>research/04_international_comparison.md</w:t>
-      </w:r>
-      <w:r>
-        <w:rPr/>
-        <w:t>.</w:t>
+        <w:t>PwC Tax Summaries — Qatar, citing Law No. 24 of 2018 and Law No. 3 of 2007 (35% rate on oil/gas operations). https://taxsummaries.pwc.com/qatar</w:t>
       </w:r>
     </w:p>
   </w:footnote>
-  <w:footnote w:id="53">
+  <w:footnote w:id="55">
     <w:p>
       <w:pPr>
         <w:pStyle w:val="FootnoteText"/>
@@ -18464,11 +18088,43 @@
       </w:r>
       <w:r>
         <w:rPr/>
-        <w:t>NBIM, Government Pension Fund Global market value at 31 December 2025. https://www.nbim.no/en/the-fund/key-figures/</w:t>
+        <w:t xml:space="preserve">Primary sources: Australia Institute, </w:t>
+      </w:r>
+      <w:r>
+        <w:rPr>
+          <w:i/>
+          <w:iCs/>
+        </w:rPr>
+        <w:t>Government revenue from LNG exports — Australia vs Qatar</w:t>
+      </w:r>
+      <w:r>
+        <w:rPr/>
+        <w:t xml:space="preserve"> (https://australiainstitute.org.au/wp-content/uploads/2026/01/P1816-Government-revenue-from-LNG-Qatar-vs-Aus-Web.pdf); IMF Country Report 25/47 (Qatar fiscal accounts); MEC Council, </w:t>
+      </w:r>
+      <w:r>
+        <w:rPr>
+          <w:i/>
+          <w:iCs/>
+        </w:rPr>
+        <w:t>LNG giant and solar dreams: Qatar’s next energy</w:t>
+      </w:r>
+      <w:r>
+        <w:rPr/>
+        <w:t xml:space="preserve"> (https://mecouncil.org/publication_chapters/lng-giant-and-solar-dreams-qatars-next-energy/); Global SWF QIA / ADIA / KIA fund-size pages (https://globalswf.com/fund/QIA etc.); Oman LNG public reports. Full per-country working: this repository, </w:t>
+      </w:r>
+      <w:r>
+        <w:rPr>
+          <w:rStyle w:val="VerbatimChar"/>
+        </w:rPr>
+        <w:t>research/08_middle_east_deepdive.md</w:t>
+      </w:r>
+      <w:r>
+        <w:rPr/>
+        <w:t>.</w:t>
       </w:r>
     </w:p>
   </w:footnote>
-  <w:footnote w:id="54">
+  <w:footnote w:id="56">
     <w:p>
       <w:pPr>
         <w:pStyle w:val="FootnoteText"/>
@@ -18490,11 +18146,29 @@
       </w:r>
       <w:r>
         <w:rPr/>
-        <w:t>PwC Tax Summaries — Qatar, citing Law No. 24 of 2018 and Law No. 3 of 2007 (35% rate on oil/gas operations). https://taxsummaries.pwc.com/qatar</w:t>
+        <w:t xml:space="preserve">Matt Saunders &amp; Rod Campbell, </w:t>
+      </w:r>
+      <w:r>
+        <w:rPr>
+          <w:i/>
+          <w:iCs/>
+        </w:rPr>
+        <w:t>Government revenue from LNG exports: Australia vs Qatar</w:t>
+      </w:r>
+      <w:r>
+        <w:rPr/>
+        <w:t>, Australia Institute Working Paper P1816, May 2025. https://australiainstitute.org.au/wp-content/uploads/2026/01/P1816-Government-revenue-from-LNG-Qatar-vs-Aus-Web.pdf</w:t>
       </w:r>
     </w:p>
   </w:footnote>
-  <w:footnote w:id="55">
+  <w:footnote w:id="57">
+    <w:p>
+      <w:r>
+        <w:t xml:space="preserve">Repeated source: Primary sources: Norwegian Petroleum Directorate (annual state petroleum cash-flow tabl...</w:t>
+      </w:r>
+    </w:p>
+  </w:footnote>
+  <w:footnote w:id="58">
     <w:p>
       <w:pPr>
         <w:pStyle w:val="FootnoteText"/>
@@ -18516,43 +18190,36 @@
       </w:r>
       <w:r>
         <w:rPr/>
-        <w:t xml:space="preserve">Primary sources: Australia Institute, </w:t>
+        <w:t xml:space="preserve">U.S. Department of the Interior, </w:t>
       </w:r>
       <w:r>
         <w:rPr>
           <w:i/>
           <w:iCs/>
         </w:rPr>
-        <w:t>Government revenue from LNG exports — Australia vs Qatar</w:t>
-      </w:r>
-      <w:r>
-        <w:rPr/>
-        <w:t xml:space="preserve"> (https://australiainstitute.org.au/wp-content/uploads/2026/01/P1816-Government-revenue-from-LNG-Qatar-vs-Aus-Web.pdf); IMF Country Report 25/47 (Qatar fiscal accounts); MEC Council, </w:t>
-      </w:r>
-      <w:r>
-        <w:rPr>
-          <w:i/>
-          <w:iCs/>
-        </w:rPr>
-        <w:t>LNG giant and solar dreams: Qatar’s next energy</w:t>
-      </w:r>
-      <w:r>
-        <w:rPr/>
-        <w:t xml:space="preserve"> (https://mecouncil.org/publication_chapters/lng-giant-and-solar-dreams-qatars-next-energy/); Global SWF QIA / ADIA / KIA fund-size pages (https://globalswf.com/fund/QIA etc.); Oman LNG public reports. Full per-country working: this repository, </w:t>
-      </w:r>
-      <w:r>
-        <w:rPr>
-          <w:rStyle w:val="VerbatimChar"/>
-        </w:rPr>
-        <w:t>research/08_middle_east_deepdive.md</w:t>
-      </w:r>
-      <w:r>
-        <w:rPr/>
-        <w:t>.</w:t>
+        <w:t>Office of Natural Resources Revenue FY2024 statistics</w:t>
+      </w:r>
+      <w:r>
+        <w:rPr/>
+        <w:t>. https://revenuedata.doi.gov</w:t>
       </w:r>
     </w:p>
   </w:footnote>
-  <w:footnote w:id="56">
+  <w:footnote w:id="59">
+    <w:p>
+      <w:r>
+        <w:t xml:space="preserve">Repeated source: Primary sources: Norwegian Petroleum Directorate (annual state petroleum cash-flow tabl...</w:t>
+      </w:r>
+    </w:p>
+  </w:footnote>
+  <w:footnote w:id="60">
+    <w:p>
+      <w:r>
+        <w:t xml:space="preserve">Repeated source: Primary sources: Australian Energy Producers (AEP), Tax factsheet 2024-25 (July 2025, h...</w:t>
+      </w:r>
+    </w:p>
+  </w:footnote>
+  <w:footnote w:id="61">
     <w:p>
       <w:pPr>
         <w:pStyle w:val="FootnoteText"/>
@@ -18574,22 +18241,18 @@
       </w:r>
       <w:r>
         <w:rPr/>
-        <w:t xml:space="preserve">Matt Saunders &amp; Rod Campbell, </w:t>
-      </w:r>
-      <w:r>
-        <w:rPr>
-          <w:i/>
-          <w:iCs/>
-        </w:rPr>
-        <w:t>Government revenue from LNG exports: Australia vs Qatar</w:t>
-      </w:r>
-      <w:r>
-        <w:rPr/>
-        <w:t>, Australia Institute Working Paper P1816, May 2025. https://australiainstitute.org.au/wp-content/uploads/2026/01/P1816-Government-revenue-from-LNG-Qatar-vs-Aus-Web.pdf</w:t>
+        <w:t>PETRONAS Integrated Report 2024. https://www.petronas.com/investor-relations</w:t>
       </w:r>
     </w:p>
   </w:footnote>
-  <w:footnote w:id="57">
+  <w:footnote w:id="62">
+    <w:p>
+      <w:r>
+        <w:t xml:space="preserve">Repeated source: Primary sources: Australia Institute, Taxing gas in Australia and Japan (April 2026), h...</w:t>
+      </w:r>
+    </w:p>
+  </w:footnote>
+  <w:footnote w:id="63">
     <w:p>
       <w:pPr>
         <w:pStyle w:val="FootnoteText"/>
@@ -18611,31 +18274,21 @@
       </w:r>
       <w:r>
         <w:rPr/>
-        <w:t xml:space="preserve">Primary sources: Norwegian Petroleum Directorate (annual state petroleum cash-flow tables); IMF Country Report 25/47 (Qatar); US BOEM / DOI ONRR statistics; HMRC oil &amp; gas tax receipts (United Kingdom); PETRONAS Integrated Report 2024 (Malaysia); Australia Institute / DISR Resources and Energy Quarterly (Australia). FX conversions per </w:t>
+        <w:t xml:space="preserve">Japan Ministry of Finance, Petroleum and Coal Tax rate schedule (document </w:t>
       </w:r>
       <w:r>
         <w:rPr>
           <w:rStyle w:val="VerbatimChar"/>
         </w:rPr>
-        <w:t>sources/fx_rates.md</w:t>
-      </w:r>
-      <w:r>
-        <w:rPr/>
-        <w:t xml:space="preserve"> (RBA F11.1 2026-05-11). Full per-country working and primary-URL log: this repository, </w:t>
-      </w:r>
-      <w:r>
-        <w:rPr>
-          <w:rStyle w:val="VerbatimChar"/>
-        </w:rPr>
-        <w:t>research/04_international_comparison.md</w:t>
-      </w:r>
-      <w:r>
-        <w:rPr/>
-        <w:t>.</w:t>
+        <w:t>333.pdf</w:t>
+      </w:r>
+      <w:r>
+        <w:rPr/>
+        <w:t>). https://www.mof.go.jp/tax_policy/summary/consumption/333.pdf</w:t>
       </w:r>
     </w:p>
   </w:footnote>
-  <w:footnote w:id="58">
+  <w:footnote w:id="64">
     <w:p>
       <w:pPr>
         <w:pStyle w:val="FootnoteText"/>
@@ -18657,22 +18310,53 @@
       </w:r>
       <w:r>
         <w:rPr/>
-        <w:t xml:space="preserve">U.S. Department of the Interior, </w:t>
+        <w:t xml:space="preserve">Cited via Australia Institute (Denniss et al., </w:t>
       </w:r>
       <w:r>
         <w:rPr>
           <w:i/>
           <w:iCs/>
         </w:rPr>
-        <w:t>Office of Natural Resources Revenue FY2024 statistics</w:t>
-      </w:r>
-      <w:r>
-        <w:rPr/>
-        <w:t>. https://revenuedata.doi.gov</w:t>
+        <w:t>Taxing gas in Australia and Japan</w:t>
+      </w:r>
+      <w:r>
+        <w:rPr/>
+        <w:t xml:space="preserve">, April 2026) which references Japanese Ministry of Economy, Trade and Industry (METI), </w:t>
+      </w:r>
+      <w:r>
+        <w:rPr>
+          <w:i/>
+          <w:iCs/>
+        </w:rPr>
+        <w:t>Yearbook of Mineral Resources and Petroleum Product Statistics 2024</w:t>
+      </w:r>
+      <w:r>
+        <w:rPr/>
+        <w:t>, p. 80 (</w:t>
+      </w:r>
+      <w:r>
+        <w:rPr>
+          <w:rStyle w:val="VerbatimChar"/>
+        </w:rPr>
+        <w:t>https://www.meti.go.jp/statistics/tyo/sekiyuka/pdf/h2dhhpe2024k.pdf</w:t>
+      </w:r>
+      <w:r>
+        <w:rPr/>
+        <w:t xml:space="preserve">). The METI primary PDF was not independently retrievable from the METI domain at the time of writing; the 25.1 Mt / 65.9 Mt 2024 import figures are internally consistent with Statista, IEEFA, and EnergyQuest March 2026 secondary aggregations of the same series. See </w:t>
+      </w:r>
+      <w:r>
+        <w:rPr>
+          <w:rStyle w:val="VerbatimChar"/>
+        </w:rPr>
+        <w:t>research/07_japan_deepdive.md</w:t>
+      </w:r>
+      <w:r>
+        <w:rPr/>
+        <w:t xml:space="preserve"> for the full primary-source verification log and cite-chain reasoning.</w:t>
       </w:r>
     </w:p>
   </w:footnote>
-  <w:footnote w:id="59">
+  <w:footnote w:id="65">
     <w:p>
       <w:pPr>
         <w:pStyle w:val="FootnoteText"/>
@@ -18694,31 +18378,85 @@
       </w:r>
       <w:r>
         <w:rPr/>
-        <w:t xml:space="preserve">Primary sources: Norwegian Petroleum Directorate (annual state petroleum cash-flow tables); IMF Country Report 25/47 (Qatar); US BOEM / DOI ONRR statistics; HMRC oil &amp; gas tax receipts (United Kingdom); PETRONAS Integrated Report 2024 (Malaysia); Australia Institute / DISR Resources and Energy Quarterly (Australia). FX conversions per </w:t>
-      </w:r>
-      <w:r>
-        <w:rPr>
-          <w:rStyle w:val="VerbatimChar"/>
-        </w:rPr>
-        <w:t>sources/fx_rates.md</w:t>
-      </w:r>
-      <w:r>
-        <w:rPr/>
-        <w:t xml:space="preserve"> (RBA F11.1 2026-05-11). Full per-country working and primary-URL log: this repository, </w:t>
-      </w:r>
-      <w:r>
-        <w:rPr>
-          <w:rStyle w:val="VerbatimChar"/>
-        </w:rPr>
-        <w:t>research/04_international_comparison.md</w:t>
-      </w:r>
-      <w:r>
-        <w:rPr/>
-        <w:t>.</w:t>
+        <w:t xml:space="preserve">The Korean per-tonne figure of A$14.80 is the importer-level tax stack on </w:t>
+      </w:r>
+      <w:r>
+        <w:rPr>
+          <w:b/>
+          <w:bCs/>
+        </w:rPr>
+        <w:t>power-generation LNG only</w:t>
+      </w:r>
+      <w:r>
+        <w:rPr/>
+        <w:t xml:space="preserve"> (KRW 12/kg Individual Consumption Tax + KRW 3,800/tonne import surcharge for power-fuel use, converted at the RBA 2026-05-11 fix of A$1 = KRW 1067.80). Approximately 60-70 per cent of Korean LNG imports go to power generation; the remaining 30-40 per cent enters the city-gas network and faces the unreformed statutory rate (KRW 42-60/kg IST + KRW 24,242/tonne import surcharge). A weighted-average tax across all Korean LNG end uses would be materially higher — roughly A$30-40/tonne on a 65/35 power/city-gas mix. The report uses the power-generation figure because it is the like-for-like comparator with Japan’s power-leaning Petroleum and Coal Tax. Sources: Korea Individual Consumption Tax Act and Enforcement Decree (law.go.kr); Petroleum and Petroleum Substitute Fuel Business Act Enforcement Decree Art. 24; DFAT KAFTA Schedule of Tariff Commitments; KAFTA HSK 2711110000 staging category 0.</w:t>
       </w:r>
     </w:p>
   </w:footnote>
-  <w:footnote w:id="60">
+  <w:footnote w:id="66">
+    <w:p>
+      <w:r>
+        <w:t xml:space="preserve">Repeated source: Primary sources: Australia Institute, Taxing gas in Australia and Japan (April 2026), h...</w:t>
+      </w:r>
+    </w:p>
+  </w:footnote>
+  <w:footnote w:id="67">
+    <w:p>
+      <w:r>
+        <w:t xml:space="preserve">Repeated source: Primary sources: Australia Institute, Government revenue from LNG exports — Australia v...</w:t>
+      </w:r>
+    </w:p>
+  </w:footnote>
+  <w:footnote w:id="68">
+    <w:p>
+      <w:r>
+        <w:t xml:space="preserve">Repeated source: Primary sources: Australia Institute, Government revenue from LNG exports — Australia v...</w:t>
+      </w:r>
+    </w:p>
+  </w:footnote>
+  <w:footnote w:id="69">
+    <w:p>
+      <w:r>
+        <w:t xml:space="preserve">Repeated source: Mike Callaghan AM, Petroleum Resource Rent Tax Review: Final Report, Australian Treasur...</w:t>
+      </w:r>
+    </w:p>
+  </w:footnote>
+  <w:footnote w:id="70">
+    <w:p>
+      <w:r>
+        <w:t xml:space="preserve">Repeated source: Mike Callaghan AM, Petroleum Resource Rent Tax Review: Final Report, Australian Treasur...</w:t>
+      </w:r>
+    </w:p>
+  </w:footnote>
+  <w:footnote w:id="71">
+    <w:p>
+      <w:r>
+        <w:t xml:space="preserve">Repeated source: Mike Callaghan AM, Petroleum Resource Rent Tax Review: Final Report, Australian Treasur...</w:t>
+      </w:r>
+    </w:p>
+  </w:footnote>
+  <w:footnote w:id="72">
+    <w:p>
+      <w:r>
+        <w:t xml:space="preserve">Repeated source: Primary sources: Australian Energy Producers (AEP), Tax factsheet 2024-25 (July 2025, h...</w:t>
+      </w:r>
+    </w:p>
+  </w:footnote>
+  <w:footnote w:id="73">
+    <w:p>
+      <w:r>
+        <w:t xml:space="preserve">Repeated source: Treasurer Jim Chalmers, “Changes to the Petroleum Resource Rent Tax”, media release. ht...</w:t>
+      </w:r>
+    </w:p>
+  </w:footnote>
+  <w:footnote w:id="74">
+    <w:p>
+      <w:r>
+        <w:t xml:space="preserve">Repeated source: Primary sources: Australian Energy Producers (AEP), Tax factsheet 2024-25 (July 2025, h...</w:t>
+      </w:r>
+    </w:p>
+  </w:footnote>
+  <w:footnote w:id="75">
     <w:p>
       <w:pPr>
         <w:pStyle w:val="FootnoteText"/>
@@ -18740,40 +18478,18 @@
       </w:r>
       <w:r>
         <w:rPr/>
-        <w:t xml:space="preserve">Primary sources: Australian Energy Producers (AEP), </w:t>
+        <w:t xml:space="preserve">Woodside Energy, </w:t>
       </w:r>
       <w:r>
         <w:rPr>
           <w:i/>
           <w:iCs/>
         </w:rPr>
-        <w:t>Tax factsheet 2024-25</w:t>
-      </w:r>
-      <w:r>
-        <w:rPr/>
-        <w:t xml:space="preserve"> (July 2025, https://energyproducers.au/hubfs/AEP-Tax-Factsheet-250725.pdf) and </w:t>
-      </w:r>
-      <w:r>
-        <w:rPr>
-          <w:i/>
-          <w:iCs/>
-        </w:rPr>
-        <w:t>Industry delivers record A$22 bn</w:t>
-      </w:r>
-      <w:r>
-        <w:rPr/>
-        <w:t xml:space="preserve"> media release (https://energyproducers.au/news/all_news/media-release-australian-oil-gas-industry-delivers-record-22-billion-in-taxes-and-royalties-to-government-revenues-in-2024-25); ACIL Allen, </w:t>
-      </w:r>
-      <w:r>
-        <w:rPr>
-          <w:i/>
-          <w:iCs/>
-        </w:rPr>
-        <w:t>Economic contribution of the Australian oil and gas industry, 2023</w:t>
-      </w:r>
-      <w:r>
-        <w:rPr/>
-        <w:t xml:space="preserve"> (https://acilallen.com.au/uploads/projects/767/ACILAllen_GEAEconomicContribution2023.pdf); the ANGE Association explanatory note on PRRT timing (https://angeassociation.com/fact-check/do-lng-pay-tax-in-australia/). Full reconstruction of industry claim → primary source → critique mapping: this repository, </w:t>
+        <w:t>2024 Annual Tax Contribution Report</w:t>
+      </w:r>
+      <w:r>
+        <w:rPr/>
+        <w:t xml:space="preserve"> and accompanying media note. CEO Meg O’Neill, verbatim: “Our Australian all-in effective tax rate for 2024 was 46%. Put simply, for every A$100 of taxable profit, A$46 of taxes apply.” Verbatim extraction from the Woodside 2023-24 tax media release captured in </w:t>
       </w:r>
       <w:r>
         <w:rPr>
@@ -18783,11 +18499,39 @@
       </w:r>
       <w:r>
         <w:rPr/>
-        <w:t>.</w:t>
+        <w:t xml:space="preserve"> line 107. The 46 per cent figure aggregates company income tax (A$2.26 bn), PRRT (A$795.5 m), and state royalties; the rent-only sub-component is the A$795.5 m PRRT line.</w:t>
       </w:r>
     </w:p>
   </w:footnote>
-  <w:footnote w:id="61">
+  <w:footnote w:id="76">
+    <w:p>
+      <w:r>
+        <w:t xml:space="preserve">Repeated source: Rod Campbell, Gas industry claims debunked: Tax payment claims in context, Australia In...</w:t>
+      </w:r>
+    </w:p>
+  </w:footnote>
+  <w:footnote w:id="77">
+    <w:p>
+      <w:r>
+        <w:t xml:space="preserve">Repeated source: Australia Institute live tracker, https://gas.australiainstitute.org.au/ — confirmed A$...</w:t>
+      </w:r>
+    </w:p>
+  </w:footnote>
+  <w:footnote w:id="78">
+    <w:p>
+      <w:r>
+        <w:t xml:space="preserve">Repeated source: Commonwealth of Australia, Budget 2026-27, delivered 12 May 2026. Budget homepage: http...</w:t>
+      </w:r>
+    </w:p>
+  </w:footnote>
+  <w:footnote w:id="79">
+    <w:p>
+      <w:r>
+        <w:t xml:space="preserve">Repeated source: Budget Paper 1 2026-27, Statement 6. Expense comparators use tables as appropriate: Tab...</w:t>
+      </w:r>
+    </w:p>
+  </w:footnote>
+  <w:footnote w:id="80">
     <w:p>
       <w:pPr>
         <w:pStyle w:val="FootnoteText"/>
@@ -18809,11 +18553,29 @@
       </w:r>
       <w:r>
         <w:rPr/>
-        <w:t>PETRONAS Integrated Report 2024. https://www.petronas.com/investor-relations</w:t>
+        <w:t xml:space="preserve">Productivity Commission, </w:t>
+      </w:r>
+      <w:r>
+        <w:rPr>
+          <w:i/>
+          <w:iCs/>
+        </w:rPr>
+        <w:t>A path to universal early childhood education and care</w:t>
+      </w:r>
+      <w:r>
+        <w:rPr/>
+        <w:t>, September 2024. https://www.pc.gov.au/inquiries/completed/childhood</w:t>
       </w:r>
     </w:p>
   </w:footnote>
-  <w:footnote w:id="62">
+  <w:footnote w:id="81">
+    <w:p>
+      <w:r>
+        <w:t xml:space="preserve">Repeated source: Budget Paper 1 2026-27, Statement 6. Expense comparators use tables as appropriate: Tab...</w:t>
+      </w:r>
+    </w:p>
+  </w:footnote>
+  <w:footnote w:id="82">
     <w:p>
       <w:pPr>
         <w:pStyle w:val="FootnoteText"/>
@@ -18835,53 +18597,22 @@
       </w:r>
       <w:r>
         <w:rPr/>
-        <w:t xml:space="preserve">Primary sources: Australia Institute, </w:t>
+        <w:t xml:space="preserve">Wood, Griffiths &amp; Emslie, </w:t>
       </w:r>
       <w:r>
         <w:rPr>
           <w:i/>
           <w:iCs/>
         </w:rPr>
-        <w:t>Taxing gas in Australia and Japan</w:t>
-      </w:r>
-      <w:r>
-        <w:rPr/>
-        <w:t xml:space="preserve"> (April 2026), https://australiainstitute.org.au/wp-content/uploads/2026/04/P2006-Taxing-gas-in-Australia-and-Japan-Web-002.pdf ; AI media note </w:t>
-      </w:r>
-      <w:r>
-        <w:rPr>
-          <w:i/>
-          <w:iCs/>
-        </w:rPr>
-        <w:t>Japanese government collects more tax from Australian gas than Australian government</w:t>
-      </w:r>
-      <w:r>
-        <w:rPr/>
-        <w:t xml:space="preserve"> (April 2026), https://australiainstitute.org.au/post/japanese-government-collects-more-tax-from-australian-gas-than-australian-government/ ; METI/MOF rate-schedule document 333.pdf cited in </w:t>
-      </w:r>
-      <w:r>
-        <w:rPr>
-          <w:rStyle w:val="VerbatimChar"/>
-        </w:rPr>
-        <w:t>research/07_japan_deepdive.md</w:t>
-      </w:r>
-      <w:r>
-        <w:rPr/>
-        <w:t xml:space="preserve">. Full chain of evidence and primary-source verification log: this repository, </w:t>
-      </w:r>
-      <w:r>
-        <w:rPr>
-          <w:rStyle w:val="VerbatimChar"/>
-        </w:rPr>
-        <w:t>research/07_japan_deepdive.md</w:t>
-      </w:r>
-      <w:r>
-        <w:rPr/>
-        <w:t>.</w:t>
+        <w:t>Cheaper Childcare: A practical plan to boost female workforce participation</w:t>
+      </w:r>
+      <w:r>
+        <w:rPr/>
+        <w:t>, Grattan Institute, 2020.</w:t>
       </w:r>
     </w:p>
   </w:footnote>
-  <w:footnote w:id="63">
+  <w:footnote w:id="83">
     <w:p>
       <w:pPr>
         <w:pStyle w:val="FootnoteText"/>
@@ -18903,21 +18634,11 @@
       </w:r>
       <w:r>
         <w:rPr/>
-        <w:t xml:space="preserve">Japan Ministry of Finance, Petroleum and Coal Tax rate schedule (document </w:t>
-      </w:r>
-      <w:r>
-        <w:rPr>
-          <w:rStyle w:val="VerbatimChar"/>
-        </w:rPr>
-        <w:t>333.pdf</w:t>
-      </w:r>
-      <w:r>
-        <w:rPr/>
-        <w:t>). https://www.mof.go.jp/tax_policy/summary/consumption/333.pdf</w:t>
+        <w:t>Australian Taxation Office, HECS-HELP debt statistics 2023-24. (Total outstanding balance A$81.05 bn.)</w:t>
       </w:r>
     </w:p>
   </w:footnote>
-  <w:footnote w:id="64">
+  <w:footnote w:id="84">
     <w:p>
       <w:pPr>
         <w:pStyle w:val="FootnoteText"/>
@@ -18938,54 +18659,19 @@
         <w:t xml:space="preserve"> </w:t>
       </w:r>
       <w:r>
-        <w:rPr/>
-        <w:t xml:space="preserve">Cited via Australia Institute (Denniss et al., </w:t>
-      </w:r>
-      <w:r>
         <w:rPr>
           <w:i/>
           <w:iCs/>
         </w:rPr>
-        <w:t>Taxing gas in Australia and Japan</w:t>
-      </w:r>
-      <w:r>
-        <w:rPr/>
-        <w:t xml:space="preserve">, April 2026) which references Japanese Ministry of Economy, Trade and Industry (METI), </w:t>
-      </w:r>
-      <w:r>
-        <w:rPr>
-          <w:i/>
-          <w:iCs/>
-        </w:rPr>
-        <w:t>Yearbook of Mineral Resources and Petroleum Product Statistics 2024</w:t>
-      </w:r>
-      <w:r>
-        <w:rPr/>
-        <w:t>, p. 80 (</w:t>
-      </w:r>
-      <w:r>
-        <w:rPr>
-          <w:rStyle w:val="VerbatimChar"/>
-        </w:rPr>
-        <w:t>https://www.meti.go.jp/statistics/tyo/sekiyuka/pdf/h2dhhpe2024k.pdf</w:t>
-      </w:r>
-      <w:r>
-        <w:rPr/>
-        <w:t xml:space="preserve">). The METI primary PDF was not independently retrievable from the METI domain at the time of writing; the 25.1 Mt / 65.9 Mt 2024 import figures are internally consistent with Statista, IEEFA, and EnergyQuest March 2026 secondary aggregations of the same series. See </w:t>
-      </w:r>
-      <w:r>
-        <w:rPr>
-          <w:rStyle w:val="VerbatimChar"/>
-        </w:rPr>
-        <w:t>research/07_japan_deepdive.md</w:t>
-      </w:r>
-      <w:r>
-        <w:rPr/>
-        <w:t xml:space="preserve"> for the full primary-source verification log and cite-chain reasoning.</w:t>
+        <w:t>Australian Universities Accord Final Report</w:t>
+      </w:r>
+      <w:r>
+        <w:rPr/>
+        <w:t>, February 2024, prepared by the Hon. Mary O’Kane AC FRS et al. for the Department of Education. https://www.education.gov.au/australian-universities-accord</w:t>
       </w:r>
     </w:p>
   </w:footnote>
-  <w:footnote w:id="65">
+  <w:footnote w:id="85">
     <w:p>
       <w:pPr>
         <w:pStyle w:val="FootnoteText"/>
@@ -19007,22 +18693,11 @@
       </w:r>
       <w:r>
         <w:rPr/>
-        <w:t xml:space="preserve">The Korean per-tonne figure of A$14.80 is the importer-level tax stack on </w:t>
-      </w:r>
-      <w:r>
-        <w:rPr>
-          <w:b/>
-          <w:bCs/>
-        </w:rPr>
-        <w:t>power-generation LNG only</w:t>
-      </w:r>
-      <w:r>
-        <w:rPr/>
-        <w:t xml:space="preserve"> (KRW 12/kg Individual Consumption Tax + KRW 3,800/tonne import surcharge for power-fuel use, converted at the RBA 2026-05-11 fix of A$1 = KRW 1067.80). Approximately 60-70 per cent of Korean LNG imports go to power generation; the remaining 30-40 per cent enters the city-gas network and faces the unreformed statutory rate (KRW 42-60/kg IST + KRW 24,242/tonne import surcharge). A weighted-average tax across all Korean LNG end uses would be materially higher — roughly A$30-40/tonne on a 65/35 power/city-gas mix. The report uses the power-generation figure because it is the like-for-like comparator with Japan’s power-leaning Petroleum and Coal Tax. Sources: Korea Individual Consumption Tax Act and Enforcement Decree (law.go.kr); Petroleum and Petroleum Substitute Fuel Business Act Enforcement Decree Art. 24; DFAT KAFTA Schedule of Tariff Commitments; KAFTA HSK 2711110000 staging category 0.</w:t>
+        <w:t>Budget Paper 1 2026-27 Statement 6 Tables 6.1.3, 6.3 and 6.8 — Commonwealth health spending breakdown. Medical Benefits program/component = A$37.563bn; Pharmaceutical Benefits program = A$23.448bn; the broader pharmaceutical benefits and services subfunction = A$24.636bn; dental services = A$335m; total Health function = A$136.918bn. Direct PDF: https://budget.gov.au/content/bp1/download/bp1_bs-6.pdf</w:t>
       </w:r>
     </w:p>
   </w:footnote>
-  <w:footnote w:id="66">
+  <w:footnote w:id="86">
     <w:p>
       <w:pPr>
         <w:pStyle w:val="FootnoteText"/>
@@ -19044,53 +18719,11 @@
       </w:r>
       <w:r>
         <w:rPr/>
-        <w:t xml:space="preserve">Primary sources: Australia Institute, </w:t>
-      </w:r>
-      <w:r>
-        <w:rPr>
-          <w:i/>
-          <w:iCs/>
-        </w:rPr>
-        <w:t>Taxing gas in Australia and Japan</w:t>
-      </w:r>
-      <w:r>
-        <w:rPr/>
-        <w:t xml:space="preserve"> (April 2026), https://australiainstitute.org.au/wp-content/uploads/2026/04/P2006-Taxing-gas-in-Australia-and-Japan-Web-002.pdf ; AI media note </w:t>
-      </w:r>
-      <w:r>
-        <w:rPr>
-          <w:i/>
-          <w:iCs/>
-        </w:rPr>
-        <w:t>Japanese government collects more tax from Australian gas than Australian government</w:t>
-      </w:r>
-      <w:r>
-        <w:rPr/>
-        <w:t xml:space="preserve"> (April 2026), https://australiainstitute.org.au/post/japanese-government-collects-more-tax-from-australian-gas-than-australian-government/ ; METI/MOF rate-schedule document 333.pdf cited in </w:t>
-      </w:r>
-      <w:r>
-        <w:rPr>
-          <w:rStyle w:val="VerbatimChar"/>
-        </w:rPr>
-        <w:t>research/07_japan_deepdive.md</w:t>
-      </w:r>
-      <w:r>
-        <w:rPr/>
-        <w:t xml:space="preserve">. Full chain of evidence and primary-source verification log: this repository, </w:t>
-      </w:r>
-      <w:r>
-        <w:rPr>
-          <w:rStyle w:val="VerbatimChar"/>
-        </w:rPr>
-        <w:t>research/07_japan_deepdive.md</w:t>
-      </w:r>
-      <w:r>
-        <w:rPr/>
-        <w:t>.</w:t>
+        <w:t>Australian Greens / Parliamentary Budget Office costing ECR547 (2022 election), updated 2025 election cycle.</w:t>
       </w:r>
     </w:p>
   </w:footnote>
-  <w:footnote w:id="67">
+  <w:footnote w:id="87">
     <w:p>
       <w:pPr>
         <w:pStyle w:val="FootnoteText"/>
@@ -19112,43 +18745,29 @@
       </w:r>
       <w:r>
         <w:rPr/>
-        <w:t xml:space="preserve">Primary sources: Australia Institute, </w:t>
+        <w:t xml:space="preserve">Budget Paper 1 2025-26 Statement 3 p. 67; </w:t>
       </w:r>
       <w:r>
         <w:rPr>
           <w:i/>
           <w:iCs/>
         </w:rPr>
-        <w:t>Government revenue from LNG exports — Australia vs Qatar</w:t>
-      </w:r>
-      <w:r>
-        <w:rPr/>
-        <w:t xml:space="preserve"> (https://australiainstitute.org.au/wp-content/uploads/2026/01/P1816-Government-revenue-from-LNG-Qatar-vs-Aus-Web.pdf); IMF Country Report 25/47 (Qatar fiscal accounts); MEC Council, </w:t>
-      </w:r>
-      <w:r>
-        <w:rPr>
-          <w:i/>
-          <w:iCs/>
-        </w:rPr>
-        <w:t>LNG giant and solar dreams: Qatar’s next energy</w:t>
-      </w:r>
-      <w:r>
-        <w:rPr/>
-        <w:t xml:space="preserve"> (https://mecouncil.org/publication_chapters/lng-giant-and-solar-dreams-qatars-next-energy/); Global SWF QIA / ADIA / KIA fund-size pages (https://globalswf.com/fund/QIA etc.); Oman LNG public reports. Full per-country working: this repository, </w:t>
-      </w:r>
-      <w:r>
-        <w:rPr>
-          <w:rStyle w:val="VerbatimChar"/>
-        </w:rPr>
-        <w:t>research/08_middle_east_deepdive.md</w:t>
-      </w:r>
-      <w:r>
-        <w:rPr/>
-        <w:t>.</w:t>
+        <w:t>Strengthening Medicare</w:t>
+      </w:r>
+      <w:r>
+        <w:rPr/>
+        <w:t xml:space="preserve"> package — A$8.4 bn over 5 years.</w:t>
       </w:r>
     </w:p>
   </w:footnote>
-  <w:footnote w:id="68">
+  <w:footnote w:id="88">
+    <w:p>
+      <w:r>
+        <w:t xml:space="preserve">Repeated source: Budget Paper 1 2025-26 Statement 3 p. 67; Strengthening Medicare package — A$8.4 bn ove...</w:t>
+      </w:r>
+    </w:p>
+  </w:footnote>
+  <w:footnote w:id="89">
     <w:p>
       <w:pPr>
         <w:pStyle w:val="FootnoteText"/>
@@ -19170,35 +18789,24 @@
       </w:r>
       <w:r>
         <w:rPr/>
-        <w:t xml:space="preserve">Primary sources: Australia Institute, </w:t>
+        <w:t xml:space="preserve">Primary sources: Budget 2026-27 Budget Paper 1 Statements 3, 5 and 6 (https://budget.gov.au/); Treasury Final Budget Outcome 2024-25 (https://archive.budget.gov.au/2024-25/fbo/download/00_fbo_2024-25.pdf); Productivity Commission </w:t>
       </w:r>
       <w:r>
         <w:rPr>
           <w:i/>
           <w:iCs/>
         </w:rPr>
-        <w:t>Government revenue from LNG exports — Australia vs Qatar</w:t>
-      </w:r>
-      <w:r>
-        <w:rPr/>
-        <w:t xml:space="preserve"> (https://australiainstitute.org.au/wp-content/uploads/2026/01/P1816-Government-revenue-from-LNG-Qatar-vs-Aus-Web.pdf); IMF Country Report 25/47 (Qatar fiscal accounts); MEC Council, </w:t>
-      </w:r>
-      <w:r>
-        <w:rPr>
-          <w:i/>
-          <w:iCs/>
-        </w:rPr>
-        <w:t>LNG giant and solar dreams: Qatar’s next energy</w:t>
-      </w:r>
-      <w:r>
-        <w:rPr/>
-        <w:t xml:space="preserve"> (https://mecouncil.org/publication_chapters/lng-giant-and-solar-dreams-qatars-next-energy/); Global SWF QIA / ADIA / KIA fund-size pages (https://globalswf.com/fund/QIA etc.); Oman LNG public reports. Full per-country working: this repository, </w:t>
+        <w:t>A path to universal early childhood education and care</w:t>
+      </w:r>
+      <w:r>
+        <w:rPr/>
+        <w:t xml:space="preserve"> (September 2024); Greens / Parliamentary Budget Office costing ECR547 (universal dental Medicare, 2022); Australia Institute submission to the Senate Select Committee on the Taxation of Gas Resources (https://australiainstitute.org.au/wp-content/uploads/2026/04/P1999-Australia-Institute-Submission-to-Select-Committee-on-the-Taxation-of-Gas-Resources-updated.pdf). Items flagged UNVERIFIED in the dossier (mental-health Better Access expansion at ~A$1.5 bn/yr; PBS co-payment full abolition; permanent fee-free TAFE recurrent cost) are explicitly so noted in the body. Full reconciliation: this repository, </w:t>
       </w:r>
       <w:r>
         <w:rPr>
           <w:rStyle w:val="VerbatimChar"/>
         </w:rPr>
-        <w:t>research/08_middle_east_deepdive.md</w:t>
+        <w:t>research/06_budget_modelling.md</w:t>
       </w:r>
       <w:r>
         <w:rPr/>
@@ -19206,7 +18814,7 @@
       </w:r>
     </w:p>
   </w:footnote>
-  <w:footnote w:id="69">
+  <w:footnote w:id="90">
     <w:p>
       <w:pPr>
         <w:pStyle w:val="FootnoteText"/>
@@ -19228,22 +18836,25 @@
       </w:r>
       <w:r>
         <w:rPr/>
-        <w:t xml:space="preserve">Mike Callaghan AM, </w:t>
-      </w:r>
-      <w:r>
-        <w:rPr>
-          <w:i/>
-          <w:iCs/>
-        </w:rPr>
-        <w:t>Petroleum Resource Rent Tax Review: Final Report</w:t>
-      </w:r>
-      <w:r>
-        <w:rPr/>
-        <w:t>, Australian Treasury, 13 April 2017. https://treasury.gov.au/sites/default/files/2019-03/R2016-001_PRRT_final_report.pdf</w:t>
+        <w:t>Norges Bank Investment Management, Government Pension Fund Global Annual Report 2024. https://www.nbim.no/en/</w:t>
       </w:r>
     </w:p>
   </w:footnote>
-  <w:footnote w:id="70">
+  <w:footnote w:id="91">
+    <w:p>
+      <w:r>
+        <w:t xml:space="preserve">Repeated source: Primary sources: Budget 2026-27 Budget Paper 1 Statements 3, 5 and 6 (https://budget.go...</w:t>
+      </w:r>
+    </w:p>
+  </w:footnote>
+  <w:footnote w:id="92">
+    <w:p>
+      <w:r>
+        <w:t xml:space="preserve">Repeated source: Greg Jericho, A stronger PRRT cap: A fairer way to tax gas super profits, Australia Ins...</w:t>
+      </w:r>
+    </w:p>
+  </w:footnote>
+  <w:footnote w:id="93">
     <w:p>
       <w:pPr>
         <w:pStyle w:val="FootnoteText"/>
@@ -19265,1736 +18876,175 @@
       </w:r>
       <w:r>
         <w:rPr/>
-        <w:t xml:space="preserve">Mike Callaghan AM, </w:t>
-      </w:r>
-      <w:r>
-        <w:rPr>
-          <w:i/>
-          <w:iCs/>
-        </w:rPr>
-        <w:t>Petroleum Resource Rent Tax Review: Final Report</w:t>
-      </w:r>
-      <w:r>
-        <w:rPr/>
-        <w:t>, Australian Treasury, 13 April 2017. https://treasury.gov.au/sites/default/files/2019-03/R2016-001_PRRT_final_report.pdf</w:t>
-      </w:r>
-    </w:p>
-  </w:footnote>
-  <w:footnote w:id="71">
-    <w:p>
-      <w:pPr>
-        <w:pStyle w:val="FootnoteText"/>
-        <w:widowControl/>
-        <w:bidi w:val="0"/>
-        <w:spacing w:lineRule="auto" w:line="312" w:before="0" w:after="80"/>
-        <w:jc w:val="start"/>
-        <w:rPr/>
-      </w:pPr>
-      <w:r>
-        <w:rPr>
-          <w:rStyle w:val="FootnoteCharacters"/>
-        </w:rPr>
-        <w:footnoteRef/>
-      </w:r>
-      <w:r>
-        <w:rPr/>
-        <w:t xml:space="preserve"> </w:t>
-      </w:r>
-      <w:r>
-        <w:rPr/>
-        <w:t xml:space="preserve">Mike Callaghan AM, </w:t>
-      </w:r>
-      <w:r>
-        <w:rPr>
-          <w:i/>
-          <w:iCs/>
-        </w:rPr>
-        <w:t>Petroleum Resource Rent Tax Review: Final Report</w:t>
-      </w:r>
-      <w:r>
-        <w:rPr/>
-        <w:t>, Australian Treasury, 13 April 2017. https://treasury.gov.au/sites/default/files/2019-03/R2016-001_PRRT_final_report.pdf</w:t>
-      </w:r>
-    </w:p>
-  </w:footnote>
-  <w:footnote w:id="72">
-    <w:p>
-      <w:pPr>
-        <w:pStyle w:val="FootnoteText"/>
-        <w:widowControl/>
-        <w:bidi w:val="0"/>
-        <w:spacing w:lineRule="auto" w:line="312" w:before="0" w:after="80"/>
-        <w:jc w:val="start"/>
-        <w:rPr/>
-      </w:pPr>
-      <w:r>
-        <w:rPr>
-          <w:rStyle w:val="FootnoteCharacters"/>
-        </w:rPr>
-        <w:footnoteRef/>
-      </w:r>
-      <w:r>
-        <w:rPr/>
-        <w:t xml:space="preserve"> </w:t>
-      </w:r>
-      <w:r>
-        <w:rPr/>
-        <w:t xml:space="preserve">Primary sources: Australian Energy Producers (AEP), </w:t>
-      </w:r>
-      <w:r>
-        <w:rPr>
-          <w:i/>
-          <w:iCs/>
-        </w:rPr>
-        <w:t>Tax factsheet 2024-25</w:t>
-      </w:r>
-      <w:r>
-        <w:rPr/>
-        <w:t xml:space="preserve"> (July 2025, https://energyproducers.au/hubfs/AEP-Tax-Factsheet-250725.pdf) and </w:t>
-      </w:r>
-      <w:r>
-        <w:rPr>
-          <w:i/>
-          <w:iCs/>
-        </w:rPr>
-        <w:t>Industry delivers record A$22 bn</w:t>
-      </w:r>
-      <w:r>
-        <w:rPr/>
-        <w:t xml:space="preserve"> media release (https://energyproducers.au/news/all_news/media-release-australian-oil-gas-industry-delivers-record-22-billion-in-taxes-and-royalties-to-government-revenues-in-2024-25); ACIL Allen, </w:t>
-      </w:r>
-      <w:r>
-        <w:rPr>
-          <w:i/>
-          <w:iCs/>
-        </w:rPr>
-        <w:t>Economic contribution of the Australian oil and gas industry, 2023</w:t>
-      </w:r>
-      <w:r>
-        <w:rPr/>
-        <w:t xml:space="preserve"> (https://acilallen.com.au/uploads/projects/767/ACILAllen_GEAEconomicContribution2023.pdf); the ANGE Association explanatory note on PRRT timing (https://angeassociation.com/fact-check/do-lng-pay-tax-in-australia/). Full reconstruction of industry claim → primary source → critique mapping: this repository, </w:t>
-      </w:r>
-      <w:r>
-        <w:rPr>
-          <w:rStyle w:val="VerbatimChar"/>
-        </w:rPr>
-        <w:t>research/05_industry_steelman.md</w:t>
-      </w:r>
-      <w:r>
-        <w:rPr/>
-        <w:t>.</w:t>
-      </w:r>
-    </w:p>
-  </w:footnote>
-  <w:footnote w:id="73">
-    <w:p>
-      <w:pPr>
-        <w:pStyle w:val="FootnoteText"/>
-        <w:widowControl/>
-        <w:bidi w:val="0"/>
-        <w:spacing w:lineRule="auto" w:line="312" w:before="0" w:after="80"/>
-        <w:jc w:val="start"/>
-        <w:rPr/>
-      </w:pPr>
-      <w:r>
-        <w:rPr>
-          <w:rStyle w:val="FootnoteCharacters"/>
-        </w:rPr>
-        <w:footnoteRef/>
-      </w:r>
-      <w:r>
-        <w:rPr/>
-        <w:t xml:space="preserve"> </w:t>
-      </w:r>
-      <w:r>
-        <w:rPr/>
-        <w:t>Treasurer Jim Chalmers, “Changes to the Petroleum Resource Rent Tax”, media release. https://ministers.treasury.gov.au/ministers/jim-chalmers-2022/media-releases/changes-petroleum-resource-rent-tax . ATO PRRT deductions cap guidance: https://www.ato.gov.au/businesses-and-organisations/business-bulletins-newsroom/prrt-deductions-cap-now-law</w:t>
-      </w:r>
-    </w:p>
-  </w:footnote>
-  <w:footnote w:id="74">
-    <w:p>
-      <w:pPr>
-        <w:pStyle w:val="FootnoteText"/>
-        <w:widowControl/>
-        <w:bidi w:val="0"/>
-        <w:spacing w:lineRule="auto" w:line="312" w:before="0" w:after="80"/>
-        <w:jc w:val="start"/>
-        <w:rPr/>
-      </w:pPr>
-      <w:r>
-        <w:rPr>
-          <w:rStyle w:val="FootnoteCharacters"/>
-        </w:rPr>
-        <w:footnoteRef/>
-      </w:r>
-      <w:r>
-        <w:rPr/>
-        <w:t xml:space="preserve"> </w:t>
-      </w:r>
-      <w:r>
-        <w:rPr/>
-        <w:t xml:space="preserve">Primary sources: Australian Energy Producers (AEP), </w:t>
-      </w:r>
-      <w:r>
-        <w:rPr>
-          <w:i/>
-          <w:iCs/>
-        </w:rPr>
-        <w:t>Tax factsheet 2024-25</w:t>
-      </w:r>
-      <w:r>
-        <w:rPr/>
-        <w:t xml:space="preserve"> (July 2025, https://energyproducers.au/hubfs/AEP-Tax-Factsheet-250725.pdf) and </w:t>
-      </w:r>
-      <w:r>
-        <w:rPr>
-          <w:i/>
-          <w:iCs/>
-        </w:rPr>
-        <w:t>Industry delivers record A$22 bn</w:t>
-      </w:r>
-      <w:r>
-        <w:rPr/>
-        <w:t xml:space="preserve"> media release (https://energyproducers.au/news/all_news/media-release-australian-oil-gas-industry-delivers-record-22-billion-in-taxes-and-royalties-to-government-revenues-in-2024-25); ACIL Allen, </w:t>
-      </w:r>
-      <w:r>
-        <w:rPr>
-          <w:i/>
-          <w:iCs/>
-        </w:rPr>
-        <w:t>Economic contribution of the Australian oil and gas industry, 2023</w:t>
-      </w:r>
-      <w:r>
-        <w:rPr/>
-        <w:t xml:space="preserve"> (https://acilallen.com.au/uploads/projects/767/ACILAllen_GEAEconomicContribution2023.pdf); the ANGE Association explanatory note on PRRT timing (https://angeassociation.com/fact-check/do-lng-pay-tax-in-australia/). Full reconstruction of industry claim → primary source → critique mapping: this repository, </w:t>
-      </w:r>
-      <w:r>
-        <w:rPr>
-          <w:rStyle w:val="VerbatimChar"/>
-        </w:rPr>
-        <w:t>research/05_industry_steelman.md</w:t>
-      </w:r>
-      <w:r>
-        <w:rPr/>
-        <w:t>.</w:t>
-      </w:r>
-    </w:p>
-  </w:footnote>
-  <w:footnote w:id="75">
-    <w:p>
-      <w:pPr>
-        <w:pStyle w:val="FootnoteText"/>
-        <w:widowControl/>
-        <w:bidi w:val="0"/>
-        <w:spacing w:lineRule="auto" w:line="312" w:before="0" w:after="80"/>
-        <w:jc w:val="start"/>
-        <w:rPr/>
-      </w:pPr>
-      <w:r>
-        <w:rPr>
-          <w:rStyle w:val="FootnoteCharacters"/>
-        </w:rPr>
-        <w:footnoteRef/>
-      </w:r>
-      <w:r>
-        <w:rPr/>
-        <w:t xml:space="preserve"> </w:t>
-      </w:r>
-      <w:r>
-        <w:rPr/>
-        <w:t xml:space="preserve">Woodside Energy, </w:t>
-      </w:r>
-      <w:r>
-        <w:rPr>
-          <w:i/>
-          <w:iCs/>
-        </w:rPr>
-        <w:t>2024 Annual Tax Contribution Report</w:t>
-      </w:r>
-      <w:r>
-        <w:rPr/>
-        <w:t xml:space="preserve"> and accompanying media note. CEO Meg O’Neill, verbatim: “Our Australian all-in effective tax rate for 2024 was 46%. Put simply, for every A$100 of taxable profit, A$46 of taxes apply.” Verbatim extraction from the Woodside 2023-24 tax media release captured in </w:t>
-      </w:r>
-      <w:r>
-        <w:rPr>
-          <w:rStyle w:val="VerbatimChar"/>
-        </w:rPr>
-        <w:t>research/05_industry_steelman.md</w:t>
-      </w:r>
-      <w:r>
-        <w:rPr/>
-        <w:t xml:space="preserve"> line 107. The 46 per cent figure aggregates company income tax (A$2.26 bn), PRRT (A$795.5 m), and state royalties; the rent-only sub-component is the A$795.5 m PRRT line.</w:t>
-      </w:r>
-    </w:p>
-  </w:footnote>
-  <w:footnote w:id="76">
-    <w:p>
-      <w:pPr>
-        <w:pStyle w:val="FootnoteText"/>
-        <w:widowControl/>
-        <w:bidi w:val="0"/>
-        <w:spacing w:lineRule="auto" w:line="312" w:before="0" w:after="80"/>
-        <w:jc w:val="start"/>
-        <w:rPr/>
-      </w:pPr>
-      <w:r>
-        <w:rPr>
-          <w:rStyle w:val="FootnoteCharacters"/>
-        </w:rPr>
-        <w:footnoteRef/>
-      </w:r>
-      <w:r>
-        <w:rPr/>
-        <w:t xml:space="preserve"> </w:t>
-      </w:r>
-      <w:r>
-        <w:rPr/>
-        <w:t xml:space="preserve">Rod Campbell, </w:t>
-      </w:r>
-      <w:r>
-        <w:rPr>
-          <w:i/>
-          <w:iCs/>
-        </w:rPr>
-        <w:t>Gas industry claims debunked: Tax payment claims in context</w:t>
-      </w:r>
-      <w:r>
-        <w:rPr/>
-        <w:t>, Australia Institute, May 2024. https://australiainstitute.org.au/wp-content/uploads/2024/06/The-Australia-Institute-Gas-industry-claims-debunked-Web.pdf</w:t>
-      </w:r>
-    </w:p>
-  </w:footnote>
-  <w:footnote w:id="77">
-    <w:p>
-      <w:pPr>
-        <w:pStyle w:val="FootnoteText"/>
-        <w:widowControl/>
-        <w:bidi w:val="0"/>
-        <w:spacing w:lineRule="auto" w:line="312" w:before="0" w:after="80"/>
-        <w:jc w:val="start"/>
-        <w:rPr/>
-      </w:pPr>
-      <w:r>
-        <w:rPr>
-          <w:rStyle w:val="FootnoteCharacters"/>
-        </w:rPr>
-        <w:footnoteRef/>
-      </w:r>
-      <w:r>
-        <w:rPr/>
-        <w:t xml:space="preserve"> </w:t>
-      </w:r>
-      <w:r>
-        <w:rPr/>
-        <w:t xml:space="preserve">Australia Institute live tracker, https://gas.australiainstitute.org.au/ — confirmed A$17 bn/year flow estimate; A$63.8 bn cumulative since 1 July 2022. Underlying paper: Saunders &amp; Campbell, </w:t>
-      </w:r>
-      <w:r>
-        <w:rPr>
-          <w:i/>
-          <w:iCs/>
-        </w:rPr>
-        <w:t>Government revenue from LNG exports: Australia vs Qatar</w:t>
-      </w:r>
-      <w:r>
-        <w:rPr/>
-        <w:t xml:space="preserve"> (May 2025).</w:t>
-      </w:r>
-    </w:p>
-  </w:footnote>
-  <w:footnote w:id="78">
-    <w:p>
-      <w:pPr>
-        <w:pStyle w:val="FootnoteText"/>
-        <w:widowControl/>
-        <w:bidi w:val="0"/>
-        <w:spacing w:lineRule="auto" w:line="312" w:before="0" w:after="80"/>
-        <w:jc w:val="start"/>
-        <w:rPr/>
-      </w:pPr>
-      <w:r>
-        <w:rPr>
-          <w:rStyle w:val="FootnoteCharacters"/>
-        </w:rPr>
-        <w:footnoteRef/>
-      </w:r>
-      <w:r>
-        <w:rPr/>
-        <w:t xml:space="preserve"> </w:t>
-      </w:r>
-      <w:r>
-        <w:rPr/>
-        <w:t xml:space="preserve">Commonwealth of Australia, </w:t>
-      </w:r>
-      <w:r>
-        <w:rPr>
-          <w:i/>
-          <w:iCs/>
-        </w:rPr>
-        <w:t>Budget 2026-27</w:t>
-      </w:r>
-      <w:r>
-        <w:rPr/>
-        <w:t>, delivered 12 May 2026. Budget homepage: https://budget.gov.au/ ; Budget Paper 1, Statement 5: Revenue, Table 5.1 and Table 5.7: https://budget.gov.au/content/bp1/download/bp1_bs-5.pdf ; Budget Paper 1, Statement 3: Fiscal Strategy and Outlook: https://budget.gov.au/content/bp1/download/bp1_bs-3.pdf</w:t>
-      </w:r>
-    </w:p>
-  </w:footnote>
-  <w:footnote w:id="79">
-    <w:p>
-      <w:pPr>
-        <w:pStyle w:val="FootnoteText"/>
-        <w:widowControl/>
-        <w:bidi w:val="0"/>
-        <w:spacing w:lineRule="auto" w:line="312" w:before="0" w:after="80"/>
-        <w:jc w:val="start"/>
-        <w:rPr/>
-      </w:pPr>
-      <w:r>
-        <w:rPr>
-          <w:rStyle w:val="FootnoteCharacters"/>
-        </w:rPr>
-        <w:footnoteRef/>
-      </w:r>
-      <w:r>
-        <w:rPr/>
-        <w:t xml:space="preserve"> </w:t>
-      </w:r>
-      <w:r>
-        <w:rPr/>
-        <w:t>Budget Paper 1 2026-27, Statement 6. Expense comparators use tables as appropriate: Table 6.1.3 for top-20 program lines such as Medical Benefits, Pharmaceutical Benefits, JobSeeker Income Support, Support for Families, Child Care Subsidy and Fuel Tax Credits; Table 6.3 for function totals such as Defence and Health; and Tables 6.8-6.9 for relevant subfunction/component cross-checks. Total expenses 2026-27 = A$833.262bn; Defence = A$52.055bn; Health = A$136.918bn; Social security and welfare = A$308.737bn; JobSeeker Income Support = A$18.304bn; Child Care Subsidy program = A$16.917bn; Support for Families = A$18.148bn. Direct PDF: https://budget.gov.au/content/bp1/download/bp1_bs-6.pdf</w:t>
-      </w:r>
-    </w:p>
-  </w:footnote>
-  <w:footnote w:id="80">
-    <w:p>
-      <w:pPr>
-        <w:pStyle w:val="FootnoteText"/>
-        <w:widowControl/>
-        <w:bidi w:val="0"/>
-        <w:spacing w:lineRule="auto" w:line="312" w:before="0" w:after="80"/>
-        <w:jc w:val="start"/>
-        <w:rPr/>
-      </w:pPr>
-      <w:r>
-        <w:rPr>
-          <w:rStyle w:val="FootnoteCharacters"/>
-        </w:rPr>
-        <w:footnoteRef/>
-      </w:r>
-      <w:r>
-        <w:rPr/>
-        <w:t xml:space="preserve"> </w:t>
-      </w:r>
-      <w:r>
-        <w:rPr/>
-        <w:t xml:space="preserve">Productivity Commission, </w:t>
-      </w:r>
-      <w:r>
-        <w:rPr>
-          <w:i/>
-          <w:iCs/>
-        </w:rPr>
-        <w:t>A path to universal early childhood education and care</w:t>
-      </w:r>
-      <w:r>
-        <w:rPr/>
-        <w:t>, September 2024. https://www.pc.gov.au/inquiries/completed/childhood</w:t>
-      </w:r>
-    </w:p>
-  </w:footnote>
-  <w:footnote w:id="81">
-    <w:p>
-      <w:pPr>
-        <w:pStyle w:val="FootnoteText"/>
-        <w:widowControl/>
-        <w:bidi w:val="0"/>
-        <w:spacing w:lineRule="auto" w:line="312" w:before="0" w:after="80"/>
-        <w:jc w:val="start"/>
-        <w:rPr/>
-      </w:pPr>
-      <w:r>
-        <w:rPr>
-          <w:rStyle w:val="FootnoteCharacters"/>
-        </w:rPr>
-        <w:footnoteRef/>
-      </w:r>
-      <w:r>
-        <w:rPr/>
-        <w:t xml:space="preserve"> </w:t>
-      </w:r>
-      <w:r>
-        <w:rPr/>
-        <w:t>Budget Paper 1 2026-27, Statement 6. Expense comparators use tables as appropriate: Table 6.1.3 for top-20 program lines such as Medical Benefits, Pharmaceutical Benefits, JobSeeker Income Support, Support for Families, Child Care Subsidy and Fuel Tax Credits; Table 6.3 for function totals such as Defence and Health; and Tables 6.8-6.9 for relevant subfunction/component cross-checks. Total expenses 2026-27 = A$833.262bn; Defence = A$52.055bn; Health = A$136.918bn; Social security and welfare = A$308.737bn; JobSeeker Income Support = A$18.304bn; Child Care Subsidy program = A$16.917bn; Support for Families = A$18.148bn. Direct PDF: https://budget.gov.au/content/bp1/download/bp1_bs-6.pdf</w:t>
-      </w:r>
-    </w:p>
-  </w:footnote>
-  <w:footnote w:id="82">
-    <w:p>
-      <w:pPr>
-        <w:pStyle w:val="FootnoteText"/>
-        <w:widowControl/>
-        <w:bidi w:val="0"/>
-        <w:spacing w:lineRule="auto" w:line="312" w:before="0" w:after="80"/>
-        <w:jc w:val="start"/>
-        <w:rPr/>
-      </w:pPr>
-      <w:r>
-        <w:rPr>
-          <w:rStyle w:val="FootnoteCharacters"/>
-        </w:rPr>
-        <w:footnoteRef/>
-      </w:r>
-      <w:r>
-        <w:rPr/>
-        <w:t xml:space="preserve"> </w:t>
-      </w:r>
-      <w:r>
-        <w:rPr/>
-        <w:t xml:space="preserve">Wood, Griffiths &amp; Emslie, </w:t>
-      </w:r>
-      <w:r>
-        <w:rPr>
-          <w:i/>
-          <w:iCs/>
-        </w:rPr>
-        <w:t>Cheaper Childcare: A practical plan to boost female workforce participation</w:t>
-      </w:r>
-      <w:r>
-        <w:rPr/>
-        <w:t>, Grattan Institute, 2020.</w:t>
-      </w:r>
-    </w:p>
-  </w:footnote>
-  <w:footnote w:id="83">
-    <w:p>
-      <w:pPr>
-        <w:pStyle w:val="FootnoteText"/>
-        <w:widowControl/>
-        <w:bidi w:val="0"/>
-        <w:spacing w:lineRule="auto" w:line="312" w:before="0" w:after="80"/>
-        <w:jc w:val="start"/>
-        <w:rPr/>
-      </w:pPr>
-      <w:r>
-        <w:rPr>
-          <w:rStyle w:val="FootnoteCharacters"/>
-        </w:rPr>
-        <w:footnoteRef/>
-      </w:r>
-      <w:r>
-        <w:rPr/>
-        <w:t xml:space="preserve"> </w:t>
-      </w:r>
-      <w:r>
-        <w:rPr/>
-        <w:t>Australian Taxation Office, HECS-HELP debt statistics 2023-24. (Total outstanding balance A$81.05 bn.)</w:t>
-      </w:r>
-    </w:p>
-  </w:footnote>
-  <w:footnote w:id="84">
-    <w:p>
-      <w:pPr>
-        <w:pStyle w:val="FootnoteText"/>
-        <w:widowControl/>
-        <w:bidi w:val="0"/>
-        <w:spacing w:lineRule="auto" w:line="312" w:before="0" w:after="80"/>
-        <w:jc w:val="start"/>
-        <w:rPr/>
-      </w:pPr>
-      <w:r>
-        <w:rPr>
-          <w:rStyle w:val="FootnoteCharacters"/>
-        </w:rPr>
-        <w:footnoteRef/>
-      </w:r>
-      <w:r>
-        <w:rPr/>
-        <w:t xml:space="preserve"> </w:t>
-      </w:r>
-      <w:r>
-        <w:rPr>
-          <w:i/>
-          <w:iCs/>
-        </w:rPr>
-        <w:t>Australian Universities Accord Final Report</w:t>
-      </w:r>
-      <w:r>
-        <w:rPr/>
-        <w:t>, February 2024, prepared by the Hon. Mary O’Kane AC FRS et al. for the Department of Education. https://www.education.gov.au/australian-universities-accord</w:t>
-      </w:r>
-    </w:p>
-  </w:footnote>
-  <w:footnote w:id="85">
-    <w:p>
-      <w:pPr>
-        <w:pStyle w:val="FootnoteText"/>
-        <w:widowControl/>
-        <w:bidi w:val="0"/>
-        <w:spacing w:lineRule="auto" w:line="312" w:before="0" w:after="80"/>
-        <w:jc w:val="start"/>
-        <w:rPr/>
-      </w:pPr>
-      <w:r>
-        <w:rPr>
-          <w:rStyle w:val="FootnoteCharacters"/>
-        </w:rPr>
-        <w:footnoteRef/>
-      </w:r>
-      <w:r>
-        <w:rPr/>
-        <w:t xml:space="preserve"> </w:t>
-      </w:r>
-      <w:r>
-        <w:rPr/>
-        <w:t>Budget Paper 1 2026-27 Statement 6 Tables 6.1.3, 6.3 and 6.8 — Commonwealth health spending breakdown. Medical Benefits program/component = A$37.563bn; Pharmaceutical Benefits program = A$23.448bn; the broader pharmaceutical benefits and services subfunction = A$24.636bn; dental services = A$335m; total Health function = A$136.918bn. Direct PDF: https://budget.gov.au/content/bp1/download/bp1_bs-6.pdf</w:t>
-      </w:r>
-    </w:p>
-  </w:footnote>
-  <w:footnote w:id="86">
-    <w:p>
-      <w:pPr>
-        <w:pStyle w:val="FootnoteText"/>
-        <w:widowControl/>
-        <w:bidi w:val="0"/>
-        <w:spacing w:lineRule="auto" w:line="312" w:before="0" w:after="80"/>
-        <w:jc w:val="start"/>
-        <w:rPr/>
-      </w:pPr>
-      <w:r>
-        <w:rPr>
-          <w:rStyle w:val="FootnoteCharacters"/>
-        </w:rPr>
-        <w:footnoteRef/>
-      </w:r>
-      <w:r>
-        <w:rPr/>
-        <w:t xml:space="preserve"> </w:t>
-      </w:r>
-      <w:r>
-        <w:rPr/>
-        <w:t>Australian Greens / Parliamentary Budget Office costing ECR547 (2022 election), updated 2025 election cycle.</w:t>
-      </w:r>
-    </w:p>
-  </w:footnote>
-  <w:footnote w:id="87">
-    <w:p>
-      <w:pPr>
-        <w:pStyle w:val="FootnoteText"/>
-        <w:widowControl/>
-        <w:bidi w:val="0"/>
-        <w:spacing w:lineRule="auto" w:line="312" w:before="0" w:after="80"/>
-        <w:jc w:val="start"/>
-        <w:rPr/>
-      </w:pPr>
-      <w:r>
-        <w:rPr>
-          <w:rStyle w:val="FootnoteCharacters"/>
-        </w:rPr>
-        <w:footnoteRef/>
-      </w:r>
-      <w:r>
-        <w:rPr/>
-        <w:t xml:space="preserve"> </w:t>
-      </w:r>
-      <w:r>
-        <w:rPr/>
-        <w:t xml:space="preserve">Budget Paper 1 2025-26 Statement 3 p. 67; </w:t>
-      </w:r>
-      <w:r>
-        <w:rPr>
-          <w:i/>
-          <w:iCs/>
-        </w:rPr>
-        <w:t>Strengthening Medicare</w:t>
-      </w:r>
-      <w:r>
-        <w:rPr/>
-        <w:t xml:space="preserve"> package — A$8.4 bn over 5 years.</w:t>
-      </w:r>
-    </w:p>
-  </w:footnote>
-  <w:footnote w:id="88">
-    <w:p>
-      <w:pPr>
-        <w:pStyle w:val="FootnoteText"/>
-        <w:widowControl/>
-        <w:bidi w:val="0"/>
-        <w:spacing w:lineRule="auto" w:line="312" w:before="0" w:after="80"/>
-        <w:jc w:val="start"/>
-        <w:rPr/>
-      </w:pPr>
-      <w:r>
-        <w:rPr>
-          <w:rStyle w:val="FootnoteCharacters"/>
-        </w:rPr>
-        <w:footnoteRef/>
-      </w:r>
-      <w:r>
-        <w:rPr/>
-        <w:t xml:space="preserve"> </w:t>
-      </w:r>
-      <w:r>
-        <w:rPr/>
-        <w:t xml:space="preserve">Budget Paper 1 2025-26 Statement 3 p. 67; </w:t>
-      </w:r>
-      <w:r>
-        <w:rPr>
-          <w:i/>
-          <w:iCs/>
-        </w:rPr>
-        <w:t>Strengthening Medicare</w:t>
-      </w:r>
-      <w:r>
-        <w:rPr/>
-        <w:t xml:space="preserve"> package — A$8.4 bn over 5 years.</w:t>
-      </w:r>
-    </w:p>
-  </w:footnote>
-  <w:footnote w:id="89">
-    <w:p>
-      <w:pPr>
-        <w:pStyle w:val="FootnoteText"/>
-        <w:widowControl/>
-        <w:bidi w:val="0"/>
-        <w:spacing w:lineRule="auto" w:line="312" w:before="0" w:after="80"/>
-        <w:jc w:val="start"/>
-        <w:rPr/>
-      </w:pPr>
-      <w:r>
-        <w:rPr>
-          <w:rStyle w:val="FootnoteCharacters"/>
-        </w:rPr>
-        <w:footnoteRef/>
-      </w:r>
-      <w:r>
-        <w:rPr/>
-        <w:t xml:space="preserve"> </w:t>
-      </w:r>
-      <w:r>
-        <w:rPr/>
-        <w:t xml:space="preserve">Primary sources: Budget 2026-27 Budget Paper 1 Statements 3, 5 and 6 (https://budget.gov.au/); Treasury Final Budget Outcome 2024-25 (https://archive.budget.gov.au/2024-25/fbo/download/00_fbo_2024-25.pdf); Productivity Commission </w:t>
-      </w:r>
-      <w:r>
-        <w:rPr>
-          <w:i/>
-          <w:iCs/>
-        </w:rPr>
-        <w:t>A path to universal early childhood education and care</w:t>
-      </w:r>
-      <w:r>
-        <w:rPr/>
-        <w:t xml:space="preserve"> (September 2024); Greens / Parliamentary Budget Office costing ECR547 (universal dental Medicare, 2022); Australia Institute submission to the Senate Select Committee on the Taxation of Gas Resources (https://australiainstitute.org.au/wp-content/uploads/2026/04/P1999-Australia-Institute-Submission-to-Select-Committee-on-the-Taxation-of-Gas-Resources-updated.pdf). Items flagged UNVERIFIED in the dossier (mental-health Better Access expansion at ~A$1.5 bn/yr; PBS co-payment full abolition; permanent fee-free TAFE recurrent cost) are explicitly so noted in the body. Full reconciliation: this repository, </w:t>
-      </w:r>
-      <w:r>
-        <w:rPr>
-          <w:rStyle w:val="VerbatimChar"/>
-        </w:rPr>
-        <w:t>research/06_budget_modelling.md</w:t>
-      </w:r>
-      <w:r>
-        <w:rPr/>
-        <w:t>.</w:t>
-      </w:r>
-    </w:p>
-  </w:footnote>
-  <w:footnote w:id="90">
-    <w:p>
-      <w:pPr>
-        <w:pStyle w:val="FootnoteText"/>
-        <w:widowControl/>
-        <w:bidi w:val="0"/>
-        <w:spacing w:lineRule="auto" w:line="312" w:before="0" w:after="80"/>
-        <w:jc w:val="start"/>
-        <w:rPr/>
-      </w:pPr>
-      <w:r>
-        <w:rPr>
-          <w:rStyle w:val="FootnoteCharacters"/>
-        </w:rPr>
-        <w:footnoteRef/>
-      </w:r>
-      <w:r>
-        <w:rPr/>
-        <w:t xml:space="preserve"> </w:t>
-      </w:r>
-      <w:r>
-        <w:rPr/>
-        <w:t>Norges Bank Investment Management, Government Pension Fund Global Annual Report 2024. https://www.nbim.no/en/</w:t>
-      </w:r>
-    </w:p>
-  </w:footnote>
-  <w:footnote w:id="91">
-    <w:p>
-      <w:pPr>
-        <w:pStyle w:val="FootnoteText"/>
-        <w:widowControl/>
-        <w:bidi w:val="0"/>
-        <w:spacing w:lineRule="auto" w:line="312" w:before="0" w:after="80"/>
-        <w:jc w:val="start"/>
-        <w:rPr/>
-      </w:pPr>
-      <w:r>
-        <w:rPr>
-          <w:rStyle w:val="FootnoteCharacters"/>
-        </w:rPr>
-        <w:footnoteRef/>
-      </w:r>
-      <w:r>
-        <w:rPr/>
-        <w:t xml:space="preserve"> </w:t>
-      </w:r>
-      <w:r>
-        <w:rPr/>
-        <w:t xml:space="preserve">Primary sources: Budget 2026-27 Budget Paper 1 Statements 3, 5 and 6 (https://budget.gov.au/); Treasury Final Budget Outcome 2024-25 (https://archive.budget.gov.au/2024-25/fbo/download/00_fbo_2024-25.pdf); Productivity Commission </w:t>
-      </w:r>
-      <w:r>
-        <w:rPr>
-          <w:i/>
-          <w:iCs/>
-        </w:rPr>
-        <w:t>A path to universal early childhood education and care</w:t>
-      </w:r>
-      <w:r>
-        <w:rPr/>
-        <w:t xml:space="preserve"> (September 2024); Greens / Parliamentary Budget Office costing ECR547 (universal dental Medicare, 2022); Australia Institute submission to the Senate Select Committee on the Taxation of Gas Resources (https://australiainstitute.org.au/wp-content/uploads/2026/04/P1999-Australia-Institute-Submission-to-Select-Committee-on-the-Taxation-of-Gas-Resources-updated.pdf). Items flagged UNVERIFIED in the dossier (mental-health Better Access expansion at ~A$1.5 bn/yr; PBS co-payment full abolition; permanent fee-free TAFE recurrent cost) are explicitly so noted in the body. Full reconciliation: this repository, </w:t>
-      </w:r>
-      <w:r>
-        <w:rPr>
-          <w:rStyle w:val="VerbatimChar"/>
-        </w:rPr>
-        <w:t>research/06_budget_modelling.md</w:t>
-      </w:r>
-      <w:r>
-        <w:rPr/>
-        <w:t>.</w:t>
-      </w:r>
-    </w:p>
-  </w:footnote>
-  <w:footnote w:id="92">
-    <w:p>
-      <w:pPr>
-        <w:pStyle w:val="FootnoteText"/>
-        <w:widowControl/>
-        <w:bidi w:val="0"/>
-        <w:spacing w:lineRule="auto" w:line="312" w:before="0" w:after="80"/>
-        <w:jc w:val="start"/>
-        <w:rPr/>
-      </w:pPr>
-      <w:r>
-        <w:rPr>
-          <w:rStyle w:val="FootnoteCharacters"/>
-        </w:rPr>
-        <w:footnoteRef/>
-      </w:r>
-      <w:r>
-        <w:rPr/>
-        <w:t xml:space="preserve"> </w:t>
-      </w:r>
-      <w:r>
-        <w:rPr/>
-        <w:t xml:space="preserve">Greg Jericho, </w:t>
-      </w:r>
-      <w:r>
-        <w:rPr>
-          <w:i/>
-          <w:iCs/>
-        </w:rPr>
-        <w:t>A stronger PRRT cap: A fairer way to tax gas super profits</w:t>
-      </w:r>
-      <w:r>
-        <w:rPr/>
-        <w:t>, Australia Institute, May 2024. https://australiainstitute.org.au/wp-content/uploads/2024/05/Stronger-PRRT-cap-Web.pdf</w:t>
-      </w:r>
-    </w:p>
-  </w:footnote>
-  <w:footnote w:id="93">
-    <w:p>
-      <w:pPr>
-        <w:pStyle w:val="FootnoteText"/>
-        <w:widowControl/>
-        <w:bidi w:val="0"/>
-        <w:spacing w:lineRule="auto" w:line="312" w:before="0" w:after="80"/>
-        <w:jc w:val="start"/>
-        <w:rPr/>
-      </w:pPr>
-      <w:r>
-        <w:rPr>
-          <w:rStyle w:val="FootnoteCharacters"/>
-        </w:rPr>
-        <w:footnoteRef/>
-      </w:r>
-      <w:r>
-        <w:rPr/>
-        <w:t xml:space="preserve"> </w:t>
-      </w:r>
-      <w:r>
-        <w:rPr/>
         <w:t>Adam Bandt MP, Australian Greens, “Robin Hood reforms” announcement. https://greens.org.au/news/media-release/adam-bandt-announce-robin-hood-tax-plan-take-big-corporations-national-press</w:t>
       </w:r>
     </w:p>
   </w:footnote>
   <w:footnote w:id="94">
     <w:p>
-      <w:pPr>
-        <w:pStyle w:val="FootnoteText"/>
-        <w:widowControl/>
-        <w:bidi w:val="0"/>
-        <w:spacing w:lineRule="auto" w:line="312" w:before="0" w:after="80"/>
-        <w:jc w:val="start"/>
-        <w:rPr/>
-      </w:pPr>
-      <w:r>
-        <w:rPr>
-          <w:rStyle w:val="FootnoteCharacters"/>
-        </w:rPr>
-        <w:footnoteRef/>
-      </w:r>
-      <w:r>
-        <w:rPr/>
-        <w:t xml:space="preserve"> </w:t>
-      </w:r>
-      <w:r>
-        <w:rPr/>
-        <w:t>Budget Paper 1 2026-27, Statement 5, Table 5.7 “Australian Government general government (cash) receipts”, p. 208. PRRT estimates: 2025-26 A$1,400m; 2026-27 A$1,900m; 2027-28 A$1,750m; 2028-29 A$1,550m; 2029-30 A$1,250m. Beer excise estimates: 2026-27 A$2,810m; 2029-30 A$3,100m. Direct PDF: https://budget.gov.au/content/bp1/download/bp1_bs-5.pdf</w:t>
+      <w:r>
+        <w:t xml:space="preserve">Repeated source: Budget Paper 1 2026-27, Statement 5, Table 5.7 “Australian Government general governmen...</w:t>
       </w:r>
     </w:p>
   </w:footnote>
   <w:footnote w:id="95">
     <w:p>
-      <w:pPr>
-        <w:pStyle w:val="FootnoteText"/>
-        <w:widowControl/>
-        <w:bidi w:val="0"/>
-        <w:spacing w:lineRule="auto" w:line="312" w:before="0" w:after="80"/>
-        <w:jc w:val="start"/>
-        <w:rPr/>
-      </w:pPr>
-      <w:r>
-        <w:rPr>
-          <w:rStyle w:val="FootnoteCharacters"/>
-        </w:rPr>
-        <w:footnoteRef/>
-      </w:r>
-      <w:r>
-        <w:rPr/>
-        <w:t xml:space="preserve"> </w:t>
-      </w:r>
-      <w:r>
-        <w:rPr/>
-        <w:t>Budget Paper 1 2026-27, Statement 5, Table 5.7 “Australian Government general government (cash) receipts”, p. 208. PRRT estimates: 2025-26 A$1,400m; 2026-27 A$1,900m; 2027-28 A$1,750m; 2028-29 A$1,550m; 2029-30 A$1,250m. Beer excise estimates: 2026-27 A$2,810m; 2029-30 A$3,100m. Direct PDF: https://budget.gov.au/content/bp1/download/bp1_bs-5.pdf</w:t>
+      <w:r>
+        <w:t xml:space="preserve">Repeated source: Budget Paper 1 2026-27, Statement 5, Table 5.7 “Australian Government general governmen...</w:t>
       </w:r>
     </w:p>
   </w:footnote>
   <w:footnote w:id="96">
     <w:p>
-      <w:pPr>
-        <w:pStyle w:val="FootnoteText"/>
-        <w:widowControl/>
-        <w:bidi w:val="0"/>
-        <w:spacing w:lineRule="auto" w:line="312" w:before="0" w:after="80"/>
-        <w:jc w:val="start"/>
-        <w:rPr/>
-      </w:pPr>
-      <w:r>
-        <w:rPr>
-          <w:rStyle w:val="FootnoteCharacters"/>
-        </w:rPr>
-        <w:footnoteRef/>
-      </w:r>
-      <w:r>
-        <w:rPr/>
-        <w:t xml:space="preserve"> </w:t>
-      </w:r>
-      <w:r>
-        <w:rPr/>
-        <w:t>Budget Paper 1 2026-27, Statement 5, Table 5.7 “Australian Government general government (cash) receipts”, p. 208. PRRT estimates: 2025-26 A$1,400m; 2026-27 A$1,900m; 2027-28 A$1,750m; 2028-29 A$1,550m; 2029-30 A$1,250m. Beer excise estimates: 2026-27 A$2,810m; 2029-30 A$3,100m. Direct PDF: https://budget.gov.au/content/bp1/download/bp1_bs-5.pdf</w:t>
+      <w:r>
+        <w:t xml:space="preserve">Repeated source: Budget Paper 1 2026-27, Statement 5, Table 5.7 “Australian Government general governmen...</w:t>
       </w:r>
     </w:p>
   </w:footnote>
   <w:footnote w:id="97">
     <w:p>
-      <w:pPr>
-        <w:pStyle w:val="FootnoteText"/>
-        <w:widowControl/>
-        <w:bidi w:val="0"/>
-        <w:spacing w:lineRule="auto" w:line="312" w:before="0" w:after="80"/>
-        <w:jc w:val="start"/>
-        <w:rPr/>
-      </w:pPr>
-      <w:r>
-        <w:rPr>
-          <w:rStyle w:val="FootnoteCharacters"/>
-        </w:rPr>
-        <w:footnoteRef/>
-      </w:r>
-      <w:r>
-        <w:rPr/>
-        <w:t xml:space="preserve"> </w:t>
-      </w:r>
-      <w:r>
-        <w:rPr/>
-        <w:t xml:space="preserve">Primary sources: Treasury Final Budget Outcome reports FY2010-11 to FY2024-25 (archived at https://archive.budget.gov.au//fbo/); Budget 2026-27 Budget Paper 1 Statement 5 Table 5.7 (https://budget.gov.au/content/bp1/download/bp1_bs-5.pdf); Petroleum Resource Rent Tax Assessment Act 1987 (Cth); Callaghan Review of the PRRT (April 2017, Treasury, https://treasury.gov.au/sites/default/files/2019-03/R2016-001_PRRT_final_report.pdf). Full source-by-source primary-URL log and per-year reconciliation: this repository, </w:t>
-      </w:r>
-      <w:r>
-        <w:rPr>
-          <w:rStyle w:val="VerbatimChar"/>
-        </w:rPr>
-        <w:t>research/01_prrt_history.md</w:t>
-      </w:r>
-      <w:r>
-        <w:rPr/>
-        <w:t>.</w:t>
+      <w:r>
+        <w:t xml:space="preserve">Repeated source: Primary sources: Treasury Final Budget Outcome reports FY2010-11 to FY2024-25 (archived...</w:t>
       </w:r>
     </w:p>
   </w:footnote>
   <w:footnote w:id="98">
     <w:p>
-      <w:pPr>
-        <w:pStyle w:val="FootnoteText"/>
-        <w:widowControl/>
-        <w:bidi w:val="0"/>
-        <w:spacing w:lineRule="auto" w:line="312" w:before="0" w:after="80"/>
-        <w:jc w:val="start"/>
-        <w:rPr/>
-      </w:pPr>
-      <w:r>
-        <w:rPr>
-          <w:rStyle w:val="FootnoteCharacters"/>
-        </w:rPr>
-        <w:footnoteRef/>
-      </w:r>
-      <w:r>
-        <w:rPr/>
-        <w:t xml:space="preserve"> </w:t>
-      </w:r>
-      <w:r>
-        <w:rPr/>
-        <w:t>Budget Paper 1 2026-27, Statement 5, Table 5.7 “Australian Government general government (cash) receipts”, p. 208. PRRT estimates: 2025-26 A$1,400m; 2026-27 A$1,900m; 2027-28 A$1,750m; 2028-29 A$1,550m; 2029-30 A$1,250m. Beer excise estimates: 2026-27 A$2,810m; 2029-30 A$3,100m. Direct PDF: https://budget.gov.au/content/bp1/download/bp1_bs-5.pdf</w:t>
+      <w:r>
+        <w:t xml:space="preserve">Repeated source: Budget Paper 1 2026-27, Statement 5, Table 5.7 “Australian Government general governmen...</w:t>
       </w:r>
     </w:p>
   </w:footnote>
   <w:footnote w:id="99">
     <w:p>
-      <w:pPr>
-        <w:pStyle w:val="FootnoteText"/>
-        <w:widowControl/>
-        <w:bidi w:val="0"/>
-        <w:spacing w:lineRule="auto" w:line="312" w:before="0" w:after="80"/>
-        <w:jc w:val="start"/>
-        <w:rPr/>
-      </w:pPr>
-      <w:r>
-        <w:rPr>
-          <w:rStyle w:val="FootnoteCharacters"/>
-        </w:rPr>
-        <w:footnoteRef/>
-      </w:r>
-      <w:r>
-        <w:rPr/>
-        <w:t xml:space="preserve"> </w:t>
-      </w:r>
-      <w:r>
-        <w:rPr/>
-        <w:t>Budget Paper 1 2026-27, Statement 5, Table 5.7 “Australian Government general government (cash) receipts”, p. 208. PRRT estimates: 2025-26 A$1,400m; 2026-27 A$1,900m; 2027-28 A$1,750m; 2028-29 A$1,550m; 2029-30 A$1,250m. Beer excise estimates: 2026-27 A$2,810m; 2029-30 A$3,100m. Direct PDF: https://budget.gov.au/content/bp1/download/bp1_bs-5.pdf</w:t>
+      <w:r>
+        <w:t xml:space="preserve">Repeated source: Budget Paper 1 2026-27, Statement 5, Table 5.7 “Australian Government general governmen...</w:t>
       </w:r>
     </w:p>
   </w:footnote>
   <w:footnote w:id="100">
     <w:p>
-      <w:pPr>
-        <w:pStyle w:val="FootnoteText"/>
-        <w:widowControl/>
-        <w:bidi w:val="0"/>
-        <w:spacing w:lineRule="auto" w:line="312" w:before="0" w:after="80"/>
-        <w:jc w:val="start"/>
-        <w:rPr/>
-      </w:pPr>
-      <w:r>
-        <w:rPr>
-          <w:rStyle w:val="FootnoteCharacters"/>
-        </w:rPr>
-        <w:footnoteRef/>
-      </w:r>
-      <w:r>
-        <w:rPr/>
-        <w:t xml:space="preserve"> </w:t>
-      </w:r>
-      <w:r>
-        <w:rPr/>
-        <w:t xml:space="preserve">Primary sources: Norwegian Petroleum Directorate (annual state petroleum cash-flow tables); IMF Country Report 25/47 (Qatar); US BOEM / DOI ONRR statistics; HMRC oil &amp; gas tax receipts (United Kingdom); PETRONAS Integrated Report 2024 (Malaysia); Australia Institute / DISR Resources and Energy Quarterly (Australia). FX conversions per </w:t>
-      </w:r>
-      <w:r>
-        <w:rPr>
-          <w:rStyle w:val="VerbatimChar"/>
-        </w:rPr>
-        <w:t>sources/fx_rates.md</w:t>
-      </w:r>
-      <w:r>
-        <w:rPr/>
-        <w:t xml:space="preserve"> (RBA F11.1 2026-05-11). Full per-country working and primary-URL log: this repository, </w:t>
-      </w:r>
-      <w:r>
-        <w:rPr>
-          <w:rStyle w:val="VerbatimChar"/>
-        </w:rPr>
-        <w:t>research/04_international_comparison.md</w:t>
-      </w:r>
-      <w:r>
-        <w:rPr/>
-        <w:t>.</w:t>
+      <w:r>
+        <w:t xml:space="preserve">Repeated source: Primary sources: Norwegian Petroleum Directorate (annual state petroleum cash-flow tabl...</w:t>
       </w:r>
     </w:p>
   </w:footnote>
   <w:footnote w:id="101">
     <w:p>
-      <w:pPr>
-        <w:pStyle w:val="FootnoteText"/>
-        <w:widowControl/>
-        <w:bidi w:val="0"/>
-        <w:spacing w:lineRule="auto" w:line="312" w:before="0" w:after="80"/>
-        <w:jc w:val="start"/>
-        <w:rPr/>
-      </w:pPr>
-      <w:r>
-        <w:rPr>
-          <w:rStyle w:val="FootnoteCharacters"/>
-        </w:rPr>
-        <w:footnoteRef/>
-      </w:r>
-      <w:r>
-        <w:rPr/>
-        <w:t xml:space="preserve"> </w:t>
-      </w:r>
-      <w:r>
-        <w:rPr/>
-        <w:t>Budget Paper 1 2026-27, Statement 5, Table 5.7 “Australian Government general government (cash) receipts”, p. 208. PRRT estimates: 2025-26 A$1,400m; 2026-27 A$1,900m; 2027-28 A$1,750m; 2028-29 A$1,550m; 2029-30 A$1,250m. Beer excise estimates: 2026-27 A$2,810m; 2029-30 A$3,100m. Direct PDF: https://budget.gov.au/content/bp1/download/bp1_bs-5.pdf</w:t>
+      <w:r>
+        <w:t xml:space="preserve">Repeated source: Budget Paper 1 2026-27, Statement 5, Table 5.7 “Australian Government general governmen...</w:t>
       </w:r>
     </w:p>
   </w:footnote>
   <w:footnote w:id="102">
     <w:p>
-      <w:pPr>
-        <w:pStyle w:val="FootnoteText"/>
-        <w:widowControl/>
-        <w:bidi w:val="0"/>
-        <w:spacing w:lineRule="auto" w:line="312" w:before="0" w:after="80"/>
-        <w:jc w:val="start"/>
-        <w:rPr/>
-      </w:pPr>
-      <w:r>
-        <w:rPr>
-          <w:rStyle w:val="FootnoteCharacters"/>
-        </w:rPr>
-        <w:footnoteRef/>
-      </w:r>
-      <w:r>
-        <w:rPr/>
-        <w:t xml:space="preserve"> </w:t>
-      </w:r>
-      <w:r>
-        <w:rPr/>
-        <w:t>Budget Paper 1 2026-27, Statement 5, Table 5.7 “Australian Government general government (cash) receipts”, p. 208. PRRT estimates: 2025-26 A$1,400m; 2026-27 A$1,900m; 2027-28 A$1,750m; 2028-29 A$1,550m; 2029-30 A$1,250m. Beer excise estimates: 2026-27 A$2,810m; 2029-30 A$3,100m. Direct PDF: https://budget.gov.au/content/bp1/download/bp1_bs-5.pdf</w:t>
+      <w:r>
+        <w:t xml:space="preserve">Repeated source: Budget Paper 1 2026-27, Statement 5, Table 5.7 “Australian Government general governmen...</w:t>
       </w:r>
     </w:p>
   </w:footnote>
   <w:footnote w:id="103">
     <w:p>
-      <w:pPr>
-        <w:pStyle w:val="FootnoteText"/>
-        <w:widowControl/>
-        <w:bidi w:val="0"/>
-        <w:spacing w:lineRule="auto" w:line="312" w:before="0" w:after="80"/>
-        <w:jc w:val="start"/>
-        <w:rPr/>
-      </w:pPr>
-      <w:r>
-        <w:rPr>
-          <w:rStyle w:val="FootnoteCharacters"/>
-        </w:rPr>
-        <w:footnoteRef/>
-      </w:r>
-      <w:r>
-        <w:rPr/>
-        <w:t xml:space="preserve"> </w:t>
-      </w:r>
-      <w:r>
-        <w:rPr/>
-        <w:t xml:space="preserve">Commonwealth of Australia, </w:t>
-      </w:r>
-      <w:r>
-        <w:rPr>
-          <w:i/>
-          <w:iCs/>
-        </w:rPr>
-        <w:t>Budget 2026-27</w:t>
-      </w:r>
-      <w:r>
-        <w:rPr/>
-        <w:t>, delivered 12 May 2026. Budget homepage: https://budget.gov.au/ ; Budget Paper 1, Statement 5: Revenue, Table 5.1 and Table 5.7: https://budget.gov.au/content/bp1/download/bp1_bs-5.pdf ; Budget Paper 1, Statement 3: Fiscal Strategy and Outlook: https://budget.gov.au/content/bp1/download/bp1_bs-3.pdf</w:t>
+      <w:r>
+        <w:t xml:space="preserve">Repeated source: Commonwealth of Australia, Budget 2026-27, delivered 12 May 2026. Budget homepage: http...</w:t>
       </w:r>
     </w:p>
   </w:footnote>
   <w:footnote w:id="104">
     <w:p>
-      <w:pPr>
-        <w:pStyle w:val="FootnoteText"/>
-        <w:widowControl/>
-        <w:bidi w:val="0"/>
-        <w:spacing w:lineRule="auto" w:line="312" w:before="0" w:after="80"/>
-        <w:jc w:val="start"/>
-        <w:rPr/>
-      </w:pPr>
-      <w:r>
-        <w:rPr>
-          <w:rStyle w:val="FootnoteCharacters"/>
-        </w:rPr>
-        <w:footnoteRef/>
-      </w:r>
-      <w:r>
-        <w:rPr/>
-        <w:t xml:space="preserve"> </w:t>
-      </w:r>
-      <w:r>
-        <w:rPr/>
-        <w:t>Budget Paper 1 2026-27, Statement 6. Expense comparators use tables as appropriate: Table 6.1.3 for top-20 program lines such as Medical Benefits, Pharmaceutical Benefits, JobSeeker Income Support, Support for Families, Child Care Subsidy and Fuel Tax Credits; Table 6.3 for function totals such as Defence and Health; and Tables 6.8-6.9 for relevant subfunction/component cross-checks. Total expenses 2026-27 = A$833.262bn; Defence = A$52.055bn; Health = A$136.918bn; Social security and welfare = A$308.737bn; JobSeeker Income Support = A$18.304bn; Child Care Subsidy program = A$16.917bn; Support for Families = A$18.148bn. Direct PDF: https://budget.gov.au/content/bp1/download/bp1_bs-6.pdf</w:t>
+      <w:r>
+        <w:t xml:space="preserve">Repeated source: Budget Paper 1 2026-27, Statement 6. Expense comparators use tables as appropriate: Tab...</w:t>
       </w:r>
     </w:p>
   </w:footnote>
   <w:footnote w:id="105">
     <w:p>
-      <w:pPr>
-        <w:pStyle w:val="FootnoteText"/>
-        <w:widowControl/>
-        <w:bidi w:val="0"/>
-        <w:spacing w:lineRule="auto" w:line="312" w:before="0" w:after="80"/>
-        <w:jc w:val="start"/>
-        <w:rPr/>
-      </w:pPr>
-      <w:r>
-        <w:rPr>
-          <w:rStyle w:val="FootnoteCharacters"/>
-        </w:rPr>
-        <w:footnoteRef/>
-      </w:r>
-      <w:r>
-        <w:rPr/>
-        <w:t xml:space="preserve"> </w:t>
-      </w:r>
-      <w:r>
-        <w:rPr/>
-        <w:t xml:space="preserve">Commonwealth of Australia, </w:t>
-      </w:r>
-      <w:r>
-        <w:rPr>
-          <w:i/>
-          <w:iCs/>
-        </w:rPr>
-        <w:t>Budget 2026-27</w:t>
-      </w:r>
-      <w:r>
-        <w:rPr/>
-        <w:t>, delivered 12 May 2026. Budget homepage: https://budget.gov.au/ ; Budget Paper 1, Statement 5: Revenue, Table 5.1 and Table 5.7: https://budget.gov.au/content/bp1/download/bp1_bs-5.pdf ; Budget Paper 1, Statement 3: Fiscal Strategy and Outlook: https://budget.gov.au/content/bp1/download/bp1_bs-3.pdf</w:t>
+      <w:r>
+        <w:t xml:space="preserve">Repeated source: Commonwealth of Australia, Budget 2026-27, delivered 12 May 2026. Budget homepage: http...</w:t>
       </w:r>
     </w:p>
   </w:footnote>
   <w:footnote w:id="106">
     <w:p>
-      <w:pPr>
-        <w:pStyle w:val="FootnoteText"/>
-        <w:widowControl/>
-        <w:bidi w:val="0"/>
-        <w:spacing w:lineRule="auto" w:line="312" w:before="0" w:after="80"/>
-        <w:jc w:val="start"/>
-        <w:rPr/>
-      </w:pPr>
-      <w:r>
-        <w:rPr>
-          <w:rStyle w:val="FootnoteCharacters"/>
-        </w:rPr>
-        <w:footnoteRef/>
-      </w:r>
-      <w:r>
-        <w:rPr/>
-        <w:t xml:space="preserve"> </w:t>
-      </w:r>
-      <w:r>
-        <w:rPr/>
-        <w:t xml:space="preserve">Primary sources: Treasury Final Budget Outcome reports FY2010-11 to FY2024-25 (archived at https://archive.budget.gov.au//fbo/); Budget 2026-27 Budget Paper 1 Statement 5 Table 5.7 (https://budget.gov.au/content/bp1/download/bp1_bs-5.pdf); Petroleum Resource Rent Tax Assessment Act 1987 (Cth); Callaghan Review of the PRRT (April 2017, Treasury, https://treasury.gov.au/sites/default/files/2019-03/R2016-001_PRRT_final_report.pdf). Full source-by-source primary-URL log and per-year reconciliation: this repository, </w:t>
-      </w:r>
-      <w:r>
-        <w:rPr>
-          <w:rStyle w:val="VerbatimChar"/>
-        </w:rPr>
-        <w:t>research/01_prrt_history.md</w:t>
-      </w:r>
-      <w:r>
-        <w:rPr/>
-        <w:t>.</w:t>
+      <w:r>
+        <w:t xml:space="preserve">Repeated source: Primary sources: Treasury Final Budget Outcome reports FY2010-11 to FY2024-25 (archived...</w:t>
       </w:r>
     </w:p>
   </w:footnote>
   <w:footnote w:id="107">
     <w:p>
-      <w:pPr>
-        <w:pStyle w:val="FootnoteText"/>
-        <w:widowControl/>
-        <w:bidi w:val="0"/>
-        <w:spacing w:lineRule="auto" w:line="312" w:before="0" w:after="80"/>
-        <w:jc w:val="start"/>
-        <w:rPr/>
-      </w:pPr>
-      <w:r>
-        <w:rPr>
-          <w:rStyle w:val="FootnoteCharacters"/>
-        </w:rPr>
-        <w:footnoteRef/>
-      </w:r>
-      <w:r>
-        <w:rPr/>
-        <w:t xml:space="preserve"> </w:t>
-      </w:r>
-      <w:r>
-        <w:rPr/>
-        <w:t xml:space="preserve">Primary sources: Treasury Final Budget Outcome reports FY2010-11 to FY2024-25 (archived at https://archive.budget.gov.au//fbo/); Budget 2026-27 Budget Paper 1 Statement 5 Table 5.7 (https://budget.gov.au/content/bp1/download/bp1_bs-5.pdf); Petroleum Resource Rent Tax Assessment Act 1987 (Cth); Callaghan Review of the PRRT (April 2017, Treasury, https://treasury.gov.au/sites/default/files/2019-03/R2016-001_PRRT_final_report.pdf). Full source-by-source primary-URL log and per-year reconciliation: this repository, </w:t>
-      </w:r>
-      <w:r>
-        <w:rPr>
-          <w:rStyle w:val="VerbatimChar"/>
-        </w:rPr>
-        <w:t>research/01_prrt_history.md</w:t>
-      </w:r>
-      <w:r>
-        <w:rPr/>
-        <w:t>.</w:t>
+      <w:r>
+        <w:t xml:space="preserve">Repeated source: Primary sources: Treasury Final Budget Outcome reports FY2010-11 to FY2024-25 (archived...</w:t>
       </w:r>
     </w:p>
   </w:footnote>
   <w:footnote w:id="108">
     <w:p>
-      <w:pPr>
-        <w:pStyle w:val="FootnoteText"/>
-        <w:widowControl/>
-        <w:bidi w:val="0"/>
-        <w:spacing w:lineRule="auto" w:line="312" w:before="0" w:after="80"/>
-        <w:jc w:val="start"/>
-        <w:rPr/>
-      </w:pPr>
-      <w:r>
-        <w:rPr>
-          <w:rStyle w:val="FootnoteCharacters"/>
-        </w:rPr>
-        <w:footnoteRef/>
-      </w:r>
-      <w:r>
-        <w:rPr/>
-        <w:t xml:space="preserve"> </w:t>
-      </w:r>
-      <w:r>
-        <w:rPr/>
-        <w:t>Australian Energy Producers, “Media release: Australian oil &amp; gas industry delivers record $22 billion in taxes and royalties to government revenues in 2024-25”, 27 July 2025. https://energyproducers.au/news/all_news/media-release-australian-oil-gas-industry-delivers-record-22-billion-in-taxes-and-royalties-to-government-revenues-in-2024-25</w:t>
+      <w:r>
+        <w:t xml:space="preserve">Repeated source: Australian Energy Producers, “Media release: Australian oil &amp;amp; gas industry delivers...</w:t>
       </w:r>
     </w:p>
   </w:footnote>
   <w:footnote w:id="109">
     <w:p>
-      <w:pPr>
-        <w:pStyle w:val="FootnoteText"/>
-        <w:widowControl/>
-        <w:bidi w:val="0"/>
-        <w:spacing w:lineRule="auto" w:line="312" w:before="0" w:after="80"/>
-        <w:jc w:val="start"/>
-        <w:rPr/>
-      </w:pPr>
-      <w:r>
-        <w:rPr>
-          <w:rStyle w:val="FootnoteCharacters"/>
-        </w:rPr>
-        <w:footnoteRef/>
-      </w:r>
-      <w:r>
-        <w:rPr/>
-        <w:t xml:space="preserve"> </w:t>
-      </w:r>
-      <w:r>
-        <w:rPr/>
-        <w:t xml:space="preserve">Primary sources: Norwegian Petroleum Directorate (annual state petroleum cash-flow tables); IMF Country Report 25/47 (Qatar); US BOEM / DOI ONRR statistics; HMRC oil &amp; gas tax receipts (United Kingdom); PETRONAS Integrated Report 2024 (Malaysia); Australia Institute / DISR Resources and Energy Quarterly (Australia). FX conversions per </w:t>
-      </w:r>
-      <w:r>
-        <w:rPr>
-          <w:rStyle w:val="VerbatimChar"/>
-        </w:rPr>
-        <w:t>sources/fx_rates.md</w:t>
-      </w:r>
-      <w:r>
-        <w:rPr/>
-        <w:t xml:space="preserve"> (RBA F11.1 2026-05-11). Full per-country working and primary-URL log: this repository, </w:t>
-      </w:r>
-      <w:r>
-        <w:rPr>
-          <w:rStyle w:val="VerbatimChar"/>
-        </w:rPr>
-        <w:t>research/04_international_comparison.md</w:t>
-      </w:r>
-      <w:r>
-        <w:rPr/>
-        <w:t>.</w:t>
+      <w:r>
+        <w:t xml:space="preserve">Repeated source: Primary sources: Norwegian Petroleum Directorate (annual state petroleum cash-flow tabl...</w:t>
       </w:r>
     </w:p>
   </w:footnote>
   <w:footnote w:id="110">
     <w:p>
-      <w:pPr>
-        <w:pStyle w:val="FootnoteText"/>
-        <w:widowControl/>
-        <w:bidi w:val="0"/>
-        <w:spacing w:lineRule="auto" w:line="312" w:before="0" w:after="80"/>
-        <w:jc w:val="start"/>
-        <w:rPr/>
-      </w:pPr>
-      <w:r>
-        <w:rPr>
-          <w:rStyle w:val="FootnoteCharacters"/>
-        </w:rPr>
-        <w:footnoteRef/>
-      </w:r>
-      <w:r>
-        <w:rPr/>
-        <w:t xml:space="preserve"> </w:t>
-      </w:r>
-      <w:r>
-        <w:rPr/>
-        <w:t>NBIM, Government Pension Fund Global market value at 31 December 2025. https://www.nbim.no/en/the-fund/key-figures/</w:t>
+      <w:r>
+        <w:t xml:space="preserve">Repeated source: NBIM, Government Pension Fund Global market value at 31 December 2025. https://www.nbim...</w:t>
       </w:r>
     </w:p>
   </w:footnote>
   <w:footnote w:id="111">
     <w:p>
-      <w:pPr>
-        <w:pStyle w:val="FootnoteText"/>
-        <w:widowControl/>
-        <w:bidi w:val="0"/>
-        <w:spacing w:lineRule="auto" w:line="312" w:before="0" w:after="80"/>
-        <w:jc w:val="start"/>
-        <w:rPr/>
-      </w:pPr>
-      <w:r>
-        <w:rPr>
-          <w:rStyle w:val="FootnoteCharacters"/>
-        </w:rPr>
-        <w:footnoteRef/>
-      </w:r>
-      <w:r>
-        <w:rPr/>
-        <w:t xml:space="preserve"> </w:t>
-      </w:r>
-      <w:r>
-        <w:rPr/>
-        <w:t xml:space="preserve">Primary sources: Australia Institute, </w:t>
-      </w:r>
-      <w:r>
-        <w:rPr>
-          <w:i/>
-          <w:iCs/>
-        </w:rPr>
-        <w:t>Government revenue from LNG exports — Australia vs Qatar</w:t>
-      </w:r>
-      <w:r>
-        <w:rPr/>
-        <w:t xml:space="preserve"> (https://australiainstitute.org.au/wp-content/uploads/2026/01/P1816-Government-revenue-from-LNG-Qatar-vs-Aus-Web.pdf); IMF Country Report 25/47 (Qatar fiscal accounts); MEC Council, </w:t>
-      </w:r>
-      <w:r>
-        <w:rPr>
-          <w:i/>
-          <w:iCs/>
-        </w:rPr>
-        <w:t>LNG giant and solar dreams: Qatar’s next energy</w:t>
-      </w:r>
-      <w:r>
-        <w:rPr/>
-        <w:t xml:space="preserve"> (https://mecouncil.org/publication_chapters/lng-giant-and-solar-dreams-qatars-next-energy/); Global SWF QIA / ADIA / KIA fund-size pages (https://globalswf.com/fund/QIA etc.); Oman LNG public reports. Full per-country working: this repository, </w:t>
-      </w:r>
-      <w:r>
-        <w:rPr>
-          <w:rStyle w:val="VerbatimChar"/>
-        </w:rPr>
-        <w:t>research/08_middle_east_deepdive.md</w:t>
-      </w:r>
-      <w:r>
-        <w:rPr/>
-        <w:t>.</w:t>
+      <w:r>
+        <w:t xml:space="preserve">Repeated source: Primary sources: Australia Institute, Government revenue from LNG exports — Australia v...</w:t>
       </w:r>
     </w:p>
   </w:footnote>
   <w:footnote w:id="112">
     <w:p>
-      <w:pPr>
-        <w:pStyle w:val="FootnoteText"/>
-        <w:widowControl/>
-        <w:bidi w:val="0"/>
-        <w:spacing w:lineRule="auto" w:line="312" w:before="0" w:after="80"/>
-        <w:jc w:val="start"/>
-        <w:rPr/>
-      </w:pPr>
-      <w:r>
-        <w:rPr>
-          <w:rStyle w:val="FootnoteCharacters"/>
-        </w:rPr>
-        <w:footnoteRef/>
-      </w:r>
-      <w:r>
-        <w:rPr/>
-        <w:t xml:space="preserve"> </w:t>
-      </w:r>
-      <w:r>
-        <w:rPr/>
-        <w:t xml:space="preserve">Primary sources: Australia Institute, </w:t>
-      </w:r>
-      <w:r>
-        <w:rPr>
-          <w:i/>
-          <w:iCs/>
-        </w:rPr>
-        <w:t>Government revenue from LNG exports — Australia vs Qatar</w:t>
-      </w:r>
-      <w:r>
-        <w:rPr/>
-        <w:t xml:space="preserve"> (https://australiainstitute.org.au/wp-content/uploads/2026/01/P1816-Government-revenue-from-LNG-Qatar-vs-Aus-Web.pdf); IMF Country Report 25/47 (Qatar fiscal accounts); MEC Council, </w:t>
-      </w:r>
-      <w:r>
-        <w:rPr>
-          <w:i/>
-          <w:iCs/>
-        </w:rPr>
-        <w:t>LNG giant and solar dreams: Qatar’s next energy</w:t>
-      </w:r>
-      <w:r>
-        <w:rPr/>
-        <w:t xml:space="preserve"> (https://mecouncil.org/publication_chapters/lng-giant-and-solar-dreams-qatars-next-energy/); Global SWF QIA / ADIA / KIA fund-size pages (https://globalswf.com/fund/QIA etc.); Oman LNG public reports. Full per-country working: this repository, </w:t>
-      </w:r>
-      <w:r>
-        <w:rPr>
-          <w:rStyle w:val="VerbatimChar"/>
-        </w:rPr>
-        <w:t>research/08_middle_east_deepdive.md</w:t>
-      </w:r>
-      <w:r>
-        <w:rPr/>
-        <w:t>.</w:t>
+      <w:r>
+        <w:t xml:space="preserve">Repeated source: Primary sources: Australia Institute, Government revenue from LNG exports — Australia v...</w:t>
       </w:r>
     </w:p>
   </w:footnote>
   <w:footnote w:id="113">
     <w:p>
-      <w:pPr>
-        <w:pStyle w:val="FootnoteText"/>
-        <w:widowControl/>
-        <w:bidi w:val="0"/>
-        <w:spacing w:lineRule="auto" w:line="312" w:before="0" w:after="80"/>
-        <w:jc w:val="start"/>
-        <w:rPr/>
-      </w:pPr>
-      <w:r>
-        <w:rPr>
-          <w:rStyle w:val="FootnoteCharacters"/>
-        </w:rPr>
-        <w:footnoteRef/>
-      </w:r>
-      <w:r>
-        <w:rPr/>
-        <w:t xml:space="preserve"> </w:t>
-      </w:r>
-      <w:r>
-        <w:rPr/>
-        <w:t xml:space="preserve">Japan Ministry of Finance, Petroleum and Coal Tax rate schedule (document </w:t>
-      </w:r>
-      <w:r>
-        <w:rPr>
-          <w:rStyle w:val="VerbatimChar"/>
-        </w:rPr>
-        <w:t>333.pdf</w:t>
-      </w:r>
-      <w:r>
-        <w:rPr/>
-        <w:t>). https://www.mof.go.jp/tax_policy/summary/consumption/333.pdf</w:t>
+      <w:r>
+        <w:t xml:space="preserve">Repeated source: Japan Ministry of Finance, Petroleum and Coal Tax rate schedule (document 333.pdf). htt...</w:t>
       </w:r>
     </w:p>
   </w:footnote>
   <w:footnote w:id="114">
     <w:p>
-      <w:pPr>
-        <w:pStyle w:val="FootnoteText"/>
-        <w:widowControl/>
-        <w:bidi w:val="0"/>
-        <w:spacing w:lineRule="auto" w:line="312" w:before="0" w:after="80"/>
-        <w:jc w:val="start"/>
-        <w:rPr/>
-      </w:pPr>
-      <w:r>
-        <w:rPr>
-          <w:rStyle w:val="FootnoteCharacters"/>
-        </w:rPr>
-        <w:footnoteRef/>
-      </w:r>
-      <w:r>
-        <w:rPr/>
-        <w:t xml:space="preserve"> </w:t>
-      </w:r>
-      <w:r>
-        <w:rPr/>
-        <w:t xml:space="preserve">Cited via Australia Institute (Denniss et al., </w:t>
-      </w:r>
-      <w:r>
-        <w:rPr>
-          <w:i/>
-          <w:iCs/>
-        </w:rPr>
-        <w:t>Taxing gas in Australia and Japan</w:t>
-      </w:r>
-      <w:r>
-        <w:rPr/>
-        <w:t xml:space="preserve">, April 2026) which references Japanese Ministry of Economy, Trade and Industry (METI), </w:t>
-      </w:r>
-      <w:r>
-        <w:rPr>
-          <w:i/>
-          <w:iCs/>
-        </w:rPr>
-        <w:t>Yearbook of Mineral Resources and Petroleum Product Statistics 2024</w:t>
-      </w:r>
-      <w:r>
-        <w:rPr/>
-        <w:t>, p. 80 (</w:t>
-      </w:r>
-      <w:r>
-        <w:rPr>
-          <w:rStyle w:val="VerbatimChar"/>
-        </w:rPr>
-        <w:t>https://www.meti.go.jp/statistics/tyo/sekiyuka/pdf/h2dhhpe2024k.pdf</w:t>
-      </w:r>
-      <w:r>
-        <w:rPr/>
-        <w:t xml:space="preserve">). The METI primary PDF was not independently retrievable from the METI domain at the time of writing; the 25.1 Mt / 65.9 Mt 2024 import figures are internally consistent with Statista, IEEFA, and EnergyQuest March 2026 secondary aggregations of the same series. See </w:t>
-      </w:r>
-      <w:r>
-        <w:rPr>
-          <w:rStyle w:val="VerbatimChar"/>
-        </w:rPr>
-        <w:t>research/07_japan_deepdive.md</w:t>
-      </w:r>
-      <w:r>
-        <w:rPr/>
-        <w:t xml:space="preserve"> for the full primary-source verification log and cite-chain reasoning.</w:t>
+      <w:r>
+        <w:t xml:space="preserve">Repeated source: Cited via Australia Institute (Denniss et al., Taxing gas in Australia and Japan, April...</w:t>
       </w:r>
     </w:p>
   </w:footnote>
   <w:footnote w:id="115">
     <w:p>
-      <w:pPr>
-        <w:pStyle w:val="FootnoteText"/>
-        <w:widowControl/>
-        <w:bidi w:val="0"/>
-        <w:spacing w:lineRule="auto" w:line="312" w:before="0" w:after="80"/>
-        <w:jc w:val="start"/>
-        <w:rPr/>
-      </w:pPr>
-      <w:r>
-        <w:rPr>
-          <w:rStyle w:val="FootnoteCharacters"/>
-        </w:rPr>
-        <w:footnoteRef/>
-      </w:r>
-      <w:r>
-        <w:rPr/>
-        <w:t xml:space="preserve"> </w:t>
-      </w:r>
-      <w:r>
-        <w:rPr/>
-        <w:t xml:space="preserve">Richard Denniss et al., </w:t>
-      </w:r>
-      <w:r>
-        <w:rPr>
-          <w:i/>
-          <w:iCs/>
-        </w:rPr>
-        <w:t>Taxing gas in Australia and Japan</w:t>
-      </w:r>
-      <w:r>
-        <w:rPr/>
-        <w:t>, Australia Institute, April 2026. https://australiainstitute.org.au/post/japanese-government-collects-more-tax-from-australian-gas-than-australian-government/</w:t>
+      <w:r>
+        <w:t xml:space="preserve">Repeated source: Richard Denniss et al., Taxing gas in Australia and Japan, Australia Institute, April 2...</w:t>
       </w:r>
     </w:p>
   </w:footnote>
   <w:footnote w:id="116">
     <w:p>
-      <w:pPr>
-        <w:pStyle w:val="FootnoteText"/>
-        <w:widowControl/>
-        <w:bidi w:val="0"/>
-        <w:spacing w:lineRule="auto" w:line="312" w:before="0" w:after="80"/>
-        <w:jc w:val="start"/>
-        <w:rPr/>
-      </w:pPr>
-      <w:r>
-        <w:rPr>
-          <w:rStyle w:val="FootnoteCharacters"/>
-        </w:rPr>
-        <w:footnoteRef/>
-      </w:r>
-      <w:r>
-        <w:rPr/>
-        <w:t xml:space="preserve"> </w:t>
-      </w:r>
-      <w:r>
-        <w:rPr/>
-        <w:t xml:space="preserve">Australia Institute live tracker, https://gas.australiainstitute.org.au/ — confirmed A$17 bn/year flow estimate; A$63.8 bn cumulative since 1 July 2022. Underlying paper: Saunders &amp; Campbell, </w:t>
-      </w:r>
-      <w:r>
-        <w:rPr>
-          <w:i/>
-          <w:iCs/>
-        </w:rPr>
-        <w:t>Government revenue from LNG exports: Australia vs Qatar</w:t>
-      </w:r>
-      <w:r>
-        <w:rPr/>
-        <w:t xml:space="preserve"> (May 2025).</w:t>
+      <w:r>
+        <w:t xml:space="preserve">Repeated source: Australia Institute live tracker, https://gas.australiainstitute.org.au/ — confirmed A$...</w:t>
       </w:r>
     </w:p>
   </w:footnote>
   <w:footnote w:id="117">
     <w:p>
-      <w:pPr>
-        <w:pStyle w:val="FootnoteText"/>
-        <w:widowControl/>
-        <w:bidi w:val="0"/>
-        <w:spacing w:lineRule="auto" w:line="312" w:before="0" w:after="80"/>
-        <w:jc w:val="start"/>
-        <w:rPr/>
-      </w:pPr>
-      <w:r>
-        <w:rPr>
-          <w:rStyle w:val="FootnoteCharacters"/>
-        </w:rPr>
-        <w:footnoteRef/>
-      </w:r>
-      <w:r>
-        <w:rPr/>
-        <w:t xml:space="preserve"> </w:t>
-      </w:r>
-      <w:r>
-        <w:rPr/>
-        <w:t xml:space="preserve">Australia Institute live tracker, https://gas.australiainstitute.org.au/ — confirmed A$17 bn/year flow estimate; A$63.8 bn cumulative since 1 July 2022. Underlying paper: Saunders &amp; Campbell, </w:t>
-      </w:r>
-      <w:r>
-        <w:rPr>
-          <w:i/>
-          <w:iCs/>
-        </w:rPr>
-        <w:t>Government revenue from LNG exports: Australia vs Qatar</w:t>
-      </w:r>
-      <w:r>
-        <w:rPr/>
-        <w:t xml:space="preserve"> (May 2025).</w:t>
+      <w:r>
+        <w:t xml:space="preserve">Repeated source: Australia Institute live tracker, https://gas.australiainstitute.org.au/ — confirmed A$...</w:t>
       </w:r>
     </w:p>
   </w:footnote>

</xml_diff>

<commit_message>
Polish industry-case source wording
</commit_message>
<xml_diff>
--- a/final/report.docx
+++ b/final/report.docx
@@ -17359,7 +17359,7 @@
         <w:rPr>
           <w:rStyle w:val="VerbatimChar"/>
         </w:rPr>
-        <w:t>research/05_industry_steelman.md</w:t>
+        <w:t>research/05_industry_case.md</w:t>
       </w:r>
       <w:r>
         <w:rPr/>
@@ -17417,7 +17417,7 @@
         <w:rPr>
           <w:rStyle w:val="VerbatimChar"/>
         </w:rPr>
-        <w:t>research/05_industry_steelman.md</w:t>
+        <w:t>research/05_industry_case.md</w:t>
       </w:r>
       <w:r>
         <w:rPr/>
@@ -17486,7 +17486,7 @@
         <w:rPr>
           <w:rStyle w:val="VerbatimChar"/>
         </w:rPr>
-        <w:t>research/05_industry_steelman.md</w:t>
+        <w:t>research/05_industry_case.md</w:t>
       </w:r>
       <w:r>
         <w:rPr/>
@@ -17533,7 +17533,7 @@
         <w:rPr>
           <w:rStyle w:val="VerbatimChar"/>
         </w:rPr>
-        <w:t>research/05_industry_steelman.md</w:t>
+        <w:t>research/05_industry_case.md</w:t>
       </w:r>
       <w:r>
         <w:rPr/>
@@ -17602,7 +17602,7 @@
         <w:rPr>
           <w:rStyle w:val="VerbatimChar"/>
         </w:rPr>
-        <w:t>research/05_industry_steelman.md</w:t>
+        <w:t>research/05_industry_case.md</w:t>
       </w:r>
       <w:r>
         <w:rPr/>
@@ -18495,7 +18495,7 @@
         <w:rPr>
           <w:rStyle w:val="VerbatimChar"/>
         </w:rPr>
-        <w:t>research/05_industry_steelman.md</w:t>
+        <w:t>research/05_industry_case.md</w:t>
       </w:r>
       <w:r>
         <w:rPr/>

</xml_diff>